<commit_message>
Add Success 4 Sure logo watermark, PDF frame, and identity separation.
Embed the company logo as background branding, export a framed Arabic RTL PDF, and add a full International vs National visual-identity separation plan for Omareyah.

Co-authored-by: waseemabdelbaqi-lgtm <waseemabdelbaqi-lgtm@users.noreply.github.com>
</commit_message>
<xml_diff>
--- a/omareyah-blueprint/output/Omareyah_International_Executive_Transformation_Blueprint.docx
+++ b/omareyah-blueprint/output/Omareyah_International_Executive_Transformation_Blueprint.docx
@@ -4,7 +4,7 @@
   <w:body>
     <w:p>
       <w:pPr>
-        <w:spacing w:before="80" w:after="360" w:line="288" w:lineRule="auto"/>
+        <w:spacing w:before="80" w:after="200" w:line="288" w:lineRule="auto"/>
         <w:jc w:val="center"/>
       </w:pPr>
       <w:r>
@@ -28,7 +28,62 @@
     </w:p>
     <w:p>
       <w:pPr>
-        <w:spacing w:before="560" w:after="120" w:line="288" w:lineRule="auto"/>
+        <w:spacing w:before="160" w:after="80" w:line="240" w:lineRule="auto"/>
+        <w:jc w:val="center"/>
+      </w:pPr>
+      <w:r>
+        <w:drawing>
+          <wp:inline xmlns:a="http://schemas.openxmlformats.org/drawingml/2006/main" xmlns:pic="http://schemas.openxmlformats.org/drawingml/2006/picture">
+            <wp:extent cx="1554480" cy="1554480"/>
+            <wp:docPr id="1" name="Picture 1"/>
+            <wp:cNvGraphicFramePr>
+              <a:graphicFrameLocks noChangeAspect="1"/>
+            </wp:cNvGraphicFramePr>
+            <a:graphic>
+              <a:graphicData uri="http://schemas.openxmlformats.org/drawingml/2006/picture">
+                <pic:pic>
+                  <pic:nvPicPr>
+                    <pic:cNvPr id="0" name="success4sure_logo.png"/>
+                    <pic:cNvPicPr/>
+                  </pic:nvPicPr>
+                  <pic:blipFill>
+                    <a:blip r:embed="rId11"/>
+                    <a:stretch>
+                      <a:fillRect/>
+                    </a:stretch>
+                  </pic:blipFill>
+                  <pic:spPr>
+                    <a:xfrm>
+                      <a:off x="0" y="0"/>
+                      <a:ext cx="1554480" cy="1554480"/>
+                    </a:xfrm>
+                    <a:prstGeom prst="rect"/>
+                  </pic:spPr>
+                </pic:pic>
+              </a:graphicData>
+            </a:graphic>
+          </wp:inline>
+        </w:drawing>
+      </w:r>
+    </w:p>
+    <w:p>
+      <w:pPr>
+        <w:spacing w:before="0" w:after="200" w:line="288" w:lineRule="auto"/>
+        <w:jc w:val="center"/>
+      </w:pPr>
+      <w:r>
+        <w:rPr>
+          <w:rFonts w:ascii="Liberation Serif" w:hAnsi="Liberation Serif" w:cs="Liberation Serif" w:eastAsia="Liberation Serif"/>
+          <w:b w:val="0"/>
+          <w:color w:val="B68A3A"/>
+          <w:sz w:val="18"/>
+        </w:rPr>
+        <w:t>Strategic Implementation Partner</w:t>
+      </w:r>
+    </w:p>
+    <w:p>
+      <w:pPr>
+        <w:spacing w:before="240" w:after="120" w:line="288" w:lineRule="auto"/>
         <w:jc w:val="center"/>
       </w:pPr>
       <w:r>
@@ -36,14 +91,14 @@
           <w:rFonts w:ascii="Liberation Serif" w:hAnsi="Liberation Serif" w:cs="Liberation Serif" w:eastAsia="Liberation Serif"/>
           <w:b/>
           <w:color w:val="8B1E2D"/>
-          <w:sz w:val="44"/>
+          <w:sz w:val="40"/>
         </w:rPr>
         <w:t>OMAREYAH INTERNATIONAL DIVISION</w:t>
       </w:r>
     </w:p>
     <w:p>
       <w:pPr>
-        <w:spacing w:before="160" w:after="80" w:line="324" w:lineRule="auto"/>
+        <w:spacing w:before="120" w:after="80" w:line="324" w:lineRule="auto"/>
         <w:jc w:val="center"/>
         <w:bidi w:val="1"/>
         <w:textDirection w:val="rl"/>
@@ -53,7 +108,7 @@
           <w:rFonts w:ascii="Amiri" w:hAnsi="Amiri" w:cs="Amiri" w:eastAsia="Amiri"/>
           <w:b/>
           <w:color w:val="8B1E2D"/>
-          <w:sz w:val="44"/>
+          <w:sz w:val="40"/>
           <w:rtl w:val="1"/>
         </w:rPr>
         <w:t>‏مخطط التحول التعليمي التنفيذي</w:t>
@@ -61,7 +116,7 @@
     </w:p>
     <w:p>
       <w:pPr>
-        <w:spacing w:before="40" w:after="200" w:line="324" w:lineRule="auto"/>
+        <w:spacing w:before="40" w:after="160" w:line="324" w:lineRule="auto"/>
         <w:jc w:val="center"/>
         <w:bidi w:val="1"/>
         <w:textDirection w:val="rl"/>
@@ -71,7 +126,7 @@
           <w:rFonts w:ascii="Amiri" w:hAnsi="Amiri" w:cs="Amiri" w:eastAsia="Amiri"/>
           <w:b w:val="0"/>
           <w:color w:val="B68A3A"/>
-          <w:sz w:val="26"/>
+          <w:sz w:val="24"/>
           <w:rtl w:val="1"/>
         </w:rPr>
         <w:t>‏Master Strategic Consulting Project</w:t>
@@ -88,7 +143,7 @@
     </w:p>
     <w:p>
       <w:pPr>
-        <w:spacing w:before="320" w:after="80" w:line="324" w:lineRule="auto"/>
+        <w:spacing w:before="240" w:after="80" w:line="324" w:lineRule="auto"/>
         <w:jc w:val="center"/>
         <w:bidi w:val="1"/>
         <w:textDirection w:val="rl"/>
@@ -106,7 +161,7 @@
     </w:p>
     <w:p>
       <w:pPr>
-        <w:spacing w:before="80" w:after="280" w:line="324" w:lineRule="auto"/>
+        <w:spacing w:before="80" w:after="200" w:line="324" w:lineRule="auto"/>
         <w:jc w:val="center"/>
         <w:bidi w:val="1"/>
         <w:textDirection w:val="rl"/>
@@ -159,6 +214,104 @@
                 <w:sz w:val="23"/>
                 <w:rtl w:val="1"/>
               </w:rPr>
+              <w:t>‏محور مركزي في هذه النسخة</w:t>
+            </w:r>
+          </w:p>
+          <w:p>
+            <w:pPr>
+              <w:spacing w:before="20" w:after="40" w:line="300" w:lineRule="auto"/>
+              <w:jc w:val="right"/>
+              <w:bidi w:val="1"/>
+              <w:textDirection w:val="rl"/>
+            </w:pPr>
+            <w:r>
+              <w:rPr>
+                <w:rFonts w:ascii="Amiri" w:hAnsi="Amiri" w:cs="Amiri" w:eastAsia="Amiri"/>
+                <w:b w:val="0"/>
+                <w:color w:val="232323"/>
+                <w:sz w:val="21"/>
+                <w:rtl w:val="1"/>
+              </w:rPr>
+              <w:t>‏• تغيير/فصل الهوية البصرية والتشغيلية لقسم الإنترناشونال عن هوية المنهاج الوطني الأردني داخل المدرسة.</w:t>
+            </w:r>
+          </w:p>
+          <w:p>
+            <w:pPr>
+              <w:spacing w:before="20" w:after="40" w:line="300" w:lineRule="auto"/>
+              <w:jc w:val="right"/>
+              <w:bidi w:val="1"/>
+              <w:textDirection w:val="rl"/>
+            </w:pPr>
+            <w:r>
+              <w:rPr>
+                <w:rFonts w:ascii="Amiri" w:hAnsi="Amiri" w:cs="Amiri" w:eastAsia="Amiri"/>
+                <w:b w:val="0"/>
+                <w:color w:val="232323"/>
+                <w:sz w:val="21"/>
+                <w:rtl w:val="1"/>
+              </w:rPr>
+              <w:t>‏• الفصل تقريبي ومرحلي — ليس قطيعة فورية — مع إبقاء العمريّة مؤسسة جامعة بهويتين مساريتين واضحتين.</w:t>
+            </w:r>
+          </w:p>
+          <w:p>
+            <w:pPr>
+              <w:spacing w:before="20" w:after="40" w:line="300" w:lineRule="auto"/>
+              <w:jc w:val="right"/>
+              <w:bidi w:val="1"/>
+              <w:textDirection w:val="rl"/>
+            </w:pPr>
+            <w:r>
+              <w:rPr>
+                <w:rFonts w:ascii="Amiri" w:hAnsi="Amiri" w:cs="Amiri" w:eastAsia="Amiri"/>
+                <w:b w:val="0"/>
+                <w:color w:val="232323"/>
+                <w:sz w:val="21"/>
+                <w:rtl w:val="1"/>
+              </w:rPr>
+              <w:t>‏• Success 4 Sure شريك تنفيذ فقط؛ العلامة الأمامية للأسرة تبقى Omareyah International Division.</w:t>
+            </w:r>
+          </w:p>
+        </w:tc>
+      </w:tr>
+    </w:tbl>
+    <w:p/>
+    <w:tbl>
+      <w:tblPr>
+        <w:tblW w:type="auto" w:w="0"/>
+        <w:tblLook w:firstColumn="1" w:firstRow="1" w:lastColumn="0" w:lastRow="0" w:noHBand="0" w:noVBand="1" w:val="04A0"/>
+        <w:bidiVisual w:val="1"/>
+      </w:tblPr>
+      <w:tblGrid>
+        <w:gridCol w:w="9866"/>
+      </w:tblGrid>
+      <w:tr>
+        <w:tc>
+          <w:tcPr>
+            <w:tcW w:type="dxa" w:w="9866"/>
+            <w:shd w:fill="F4F0EC" w:val="clear"/>
+            <w:tcBorders>
+              <w:top w:val="single" w:sz="12" w:color="B68A3A" w:space="0"/>
+              <w:left w:val="single" w:sz="12" w:color="B68A3A" w:space="0"/>
+              <w:bottom w:val="single" w:sz="12" w:color="B68A3A" w:space="0"/>
+              <w:right w:val="single" w:sz="12" w:color="B68A3A" w:space="0"/>
+            </w:tcBorders>
+          </w:tcPr>
+          <w:p>
+            <w:pPr>
+              <w:spacing w:before="80" w:after="80" w:line="300" w:lineRule="auto"/>
+              <w:jc w:val="right"/>
+              <w:bidi w:val="1"/>
+              <w:textDirection w:val="rl"/>
+            </w:pPr>
+            <w:r/>
+            <w:r>
+              <w:rPr>
+                <w:rFonts w:ascii="Amiri" w:hAnsi="Amiri" w:cs="Amiri" w:eastAsia="Amiri"/>
+                <w:b/>
+                <w:color w:val="8B1E2D"/>
+                <w:sz w:val="23"/>
+                <w:rtl w:val="1"/>
+              </w:rPr>
               <w:t>‏مبادئ هذه الوثيقة</w:t>
             </w:r>
           </w:p>
@@ -178,24 +331,6 @@
                 <w:rtl w:val="1"/>
               </w:rPr>
               <w:t>‏• العلامة الأساسية هي قسم العمريّة الدولي — وليست Success 4 Sure.</w:t>
-            </w:r>
-          </w:p>
-          <w:p>
-            <w:pPr>
-              <w:spacing w:before="20" w:after="40" w:line="300" w:lineRule="auto"/>
-              <w:jc w:val="right"/>
-              <w:bidi w:val="1"/>
-              <w:textDirection w:val="rl"/>
-            </w:pPr>
-            <w:r>
-              <w:rPr>
-                <w:rFonts w:ascii="Amiri" w:hAnsi="Amiri" w:cs="Amiri" w:eastAsia="Amiri"/>
-                <w:b w:val="0"/>
-                <w:color w:val="232323"/>
-                <w:sz w:val="21"/>
-                <w:rtl w:val="1"/>
-              </w:rPr>
-              <w:t>‏• Success 4 Sure تُقدَّم حصراً كشريك تنفيذ استراتيجي ومنظومة خدمات داعمة.</w:t>
             </w:r>
           </w:p>
           <w:p>
@@ -276,7 +411,7 @@
     </w:p>
     <w:p>
       <w:pPr>
-        <w:spacing w:before="360" w:after="80" w:line="288" w:lineRule="auto"/>
+        <w:spacing w:before="280" w:after="80" w:line="288" w:lineRule="auto"/>
         <w:jc w:val="center"/>
       </w:pPr>
       <w:r>
@@ -336,7 +471,7 @@
           <w:sz w:val="23"/>
           <w:rtl w:val="1"/>
         </w:rPr>
-        <w:t>‏صُممت هذه الوثيقة كـ«مخطط تحول تعليمي تنفيذي» بمستوى وثائق مجالس الإدارات في مؤسسات الاستشارات الدولية. الغرض ليس عرضاً تسويقياً، بل تمكين المجلس من اتخاذ قرار تعيين قيادي مبني على منطق التشخيص، المنهجية، الحوكمة، وخارطة التنفيذ.</w:t>
+        <w:t>‏صُممت هذه الوثيقة كـ«مخطط تحول تعليمي تنفيذي» بمستوى وثائق مجالس الإدارات في مؤسسات الاستشارات الدولية. الغرض ليس عرضاً تسويقياً، بل تمكين المجلس من اتخاذ قرار تعيين قيادي مبني على منطق التشخيص، المنهجية، الحوكمة، وخارطة التنفيذ — مع تركيز خاص على فصل هوية القسم الدولي عن هوية المنهاج الوطني.</w:t>
       </w:r>
     </w:p>
     <w:tbl>
@@ -698,7 +833,7 @@
                 <w:sz w:val="20"/>
                 <w:rtl w:val="1"/>
               </w:rPr>
-              <w:t>‏6–8. كيف سيُحدث التحول؟</w:t>
+              <w:t>‏6. كيف سيُحدث التحول؟</w:t>
             </w:r>
           </w:p>
         </w:tc>
@@ -729,7 +864,135 @@
                 <w:sz w:val="20"/>
                 <w:rtl w:val="1"/>
               </w:rPr>
-              <w:t>‏نموذج العمل + المنظومة</w:t>
+              <w:t>‏مسارات التنفيذ</w:t>
+            </w:r>
+          </w:p>
+        </w:tc>
+      </w:tr>
+      <w:tr>
+        <w:tc>
+          <w:tcPr>
+            <w:tcW w:type="dxa" w:w="4933"/>
+            <w:shd w:fill="FFFFFF" w:val="clear"/>
+            <w:tcBorders>
+              <w:top w:val="single" w:sz="8" w:color="B68A3A" w:space="0"/>
+              <w:left w:val="single" w:sz="8" w:color="B68A3A" w:space="0"/>
+              <w:bottom w:val="single" w:sz="8" w:color="B68A3A" w:space="0"/>
+              <w:right w:val="single" w:sz="8" w:color="B68A3A" w:space="0"/>
+            </w:tcBorders>
+          </w:tcPr>
+          <w:p>
+            <w:pPr>
+              <w:spacing w:before="40" w:after="40" w:line="288" w:lineRule="auto"/>
+              <w:jc w:val="right"/>
+              <w:bidi w:val="1"/>
+              <w:textDirection w:val="rl"/>
+            </w:pPr>
+            <w:r/>
+            <w:r>
+              <w:rPr>
+                <w:rFonts w:ascii="Amiri" w:hAnsi="Amiri" w:cs="Amiri" w:eastAsia="Amiri"/>
+                <w:b w:val="0"/>
+                <w:color w:val="232323"/>
+                <w:sz w:val="20"/>
+                <w:rtl w:val="1"/>
+              </w:rPr>
+              <w:t>‏6أ. فصل الهوية البصرية</w:t>
+            </w:r>
+          </w:p>
+        </w:tc>
+        <w:tc>
+          <w:tcPr>
+            <w:tcW w:type="dxa" w:w="4933"/>
+            <w:shd w:fill="FFFFFF" w:val="clear"/>
+            <w:tcBorders>
+              <w:top w:val="single" w:sz="8" w:color="B68A3A" w:space="0"/>
+              <w:left w:val="single" w:sz="8" w:color="B68A3A" w:space="0"/>
+              <w:bottom w:val="single" w:sz="8" w:color="B68A3A" w:space="0"/>
+              <w:right w:val="single" w:sz="8" w:color="B68A3A" w:space="0"/>
+            </w:tcBorders>
+          </w:tcPr>
+          <w:p>
+            <w:pPr>
+              <w:spacing w:before="40" w:after="40" w:line="288" w:lineRule="auto"/>
+              <w:jc w:val="right"/>
+              <w:bidi w:val="1"/>
+              <w:textDirection w:val="rl"/>
+            </w:pPr>
+            <w:r/>
+            <w:r>
+              <w:rPr>
+                <w:rFonts w:ascii="Amiri" w:hAnsi="Amiri" w:cs="Amiri" w:eastAsia="Amiri"/>
+                <w:b w:val="0"/>
+                <w:color w:val="232323"/>
+                <w:sz w:val="20"/>
+                <w:rtl w:val="1"/>
+              </w:rPr>
+              <w:t>‏إنترناشونال × المنهاج الوطني</w:t>
+            </w:r>
+          </w:p>
+        </w:tc>
+      </w:tr>
+      <w:tr>
+        <w:tc>
+          <w:tcPr>
+            <w:tcW w:type="dxa" w:w="4933"/>
+            <w:shd w:fill="F8F5F2" w:val="clear"/>
+            <w:tcBorders>
+              <w:top w:val="single" w:sz="8" w:color="B68A3A" w:space="0"/>
+              <w:left w:val="single" w:sz="8" w:color="B68A3A" w:space="0"/>
+              <w:bottom w:val="single" w:sz="8" w:color="B68A3A" w:space="0"/>
+              <w:right w:val="single" w:sz="8" w:color="B68A3A" w:space="0"/>
+            </w:tcBorders>
+          </w:tcPr>
+          <w:p>
+            <w:pPr>
+              <w:spacing w:before="40" w:after="40" w:line="288" w:lineRule="auto"/>
+              <w:jc w:val="right"/>
+              <w:bidi w:val="1"/>
+              <w:textDirection w:val="rl"/>
+            </w:pPr>
+            <w:r/>
+            <w:r>
+              <w:rPr>
+                <w:rFonts w:ascii="Amiri" w:hAnsi="Amiri" w:cs="Amiri" w:eastAsia="Amiri"/>
+                <w:b w:val="0"/>
+                <w:color w:val="232323"/>
+                <w:sz w:val="20"/>
+                <w:rtl w:val="1"/>
+              </w:rPr>
+              <w:t>‏7–8. الشريك والمنظومة</w:t>
+            </w:r>
+          </w:p>
+        </w:tc>
+        <w:tc>
+          <w:tcPr>
+            <w:tcW w:type="dxa" w:w="4933"/>
+            <w:shd w:fill="F8F5F2" w:val="clear"/>
+            <w:tcBorders>
+              <w:top w:val="single" w:sz="8" w:color="B68A3A" w:space="0"/>
+              <w:left w:val="single" w:sz="8" w:color="B68A3A" w:space="0"/>
+              <w:bottom w:val="single" w:sz="8" w:color="B68A3A" w:space="0"/>
+              <w:right w:val="single" w:sz="8" w:color="B68A3A" w:space="0"/>
+            </w:tcBorders>
+          </w:tcPr>
+          <w:p>
+            <w:pPr>
+              <w:spacing w:before="40" w:after="40" w:line="288" w:lineRule="auto"/>
+              <w:jc w:val="right"/>
+              <w:bidi w:val="1"/>
+              <w:textDirection w:val="rl"/>
+            </w:pPr>
+            <w:r/>
+            <w:r>
+              <w:rPr>
+                <w:rFonts w:ascii="Amiri" w:hAnsi="Amiri" w:cs="Amiri" w:eastAsia="Amiri"/>
+                <w:b w:val="0"/>
+                <w:color w:val="232323"/>
+                <w:sz w:val="20"/>
+                <w:rtl w:val="1"/>
+              </w:rPr>
+              <w:t>‏قدرات التنفيذ دون خلط العلامة</w:t>
             </w:r>
           </w:p>
         </w:tc>
@@ -988,7 +1251,7 @@
           <w:sz w:val="23"/>
           <w:rtl w:val="1"/>
         </w:rPr>
-        <w:t>‏تقترح هذه الوثيقة تعيين الأستاذ وسيم اللبدي في موقع قيادي يجمع إدارة البرامج الدولية مع قيادة التحول التعليمي، مع الاستفادة المنظمة من قدرات Success 4 Sure كشريك تنفيذ — دون نقل هوية المدرسة إلى الشريك.</w:t>
+        <w:t>‏تقترح هذه الوثيقة تعيين الأستاذ وسيم اللبدي في موقع قيادي يجمع إدارة البرامج الدولية مع قيادة التحول التعليمي، مع الاستفادة المنظمة من قدرات Success 4 Sure كشريك تنفيذ — دون نقل هوية المدرسة إلى الشريك. ويشمل التحول أولوية واضحة: فصل الهوية البصرية والتشغيلية لقسم الإنترناشونال عن هوية المنهاج الوطني الأردني داخل المدرسة بفصل تقريبي مرحلي.</w:t>
       </w:r>
     </w:p>
     <w:p>
@@ -2949,7 +3212,7 @@
         <w:drawing>
           <wp:inline xmlns:a="http://schemas.openxmlformats.org/drawingml/2006/main" xmlns:pic="http://schemas.openxmlformats.org/drawingml/2006/picture">
             <wp:extent cx="5760720" cy="1654068"/>
-            <wp:docPr id="1" name="Picture 1"/>
+            <wp:docPr id="2" name="Picture 2"/>
             <wp:cNvGraphicFramePr>
               <a:graphicFrameLocks noChangeAspect="1"/>
             </wp:cNvGraphicFramePr>
@@ -2961,7 +3224,7 @@
                     <pic:cNvPicPr/>
                   </pic:nvPicPr>
                   <pic:blipFill>
-                    <a:blip r:embed="rId10"/>
+                    <a:blip r:embed="rId12"/>
                     <a:stretch>
                       <a:fillRect/>
                     </a:stretch>
@@ -4955,6 +5218,101 @@
           </w:p>
         </w:tc>
       </w:tr>
+      <w:tr>
+        <w:tc>
+          <w:tcPr>
+            <w:tcW w:type="dxa" w:w="3289"/>
+            <w:shd w:fill="F8F5F2" w:val="clear"/>
+            <w:tcBorders>
+              <w:top w:val="single" w:sz="8" w:color="B68A3A" w:space="0"/>
+              <w:left w:val="single" w:sz="8" w:color="B68A3A" w:space="0"/>
+              <w:bottom w:val="single" w:sz="8" w:color="B68A3A" w:space="0"/>
+              <w:right w:val="single" w:sz="8" w:color="B68A3A" w:space="0"/>
+            </w:tcBorders>
+          </w:tcPr>
+          <w:p>
+            <w:pPr>
+              <w:spacing w:before="40" w:after="40" w:line="288" w:lineRule="auto"/>
+              <w:jc w:val="right"/>
+              <w:bidi w:val="1"/>
+              <w:textDirection w:val="rl"/>
+            </w:pPr>
+            <w:r/>
+            <w:r>
+              <w:rPr>
+                <w:rFonts w:ascii="Amiri" w:hAnsi="Amiri" w:cs="Amiri" w:eastAsia="Amiri"/>
+                <w:b w:val="0"/>
+                <w:color w:val="232323"/>
+                <w:sz w:val="20"/>
+                <w:rtl w:val="1"/>
+              </w:rPr>
+              <w:t>‏الهوية البصرية</w:t>
+            </w:r>
+          </w:p>
+        </w:tc>
+        <w:tc>
+          <w:tcPr>
+            <w:tcW w:type="dxa" w:w="3289"/>
+            <w:shd w:fill="F8F5F2" w:val="clear"/>
+            <w:tcBorders>
+              <w:top w:val="single" w:sz="8" w:color="B68A3A" w:space="0"/>
+              <w:left w:val="single" w:sz="8" w:color="B68A3A" w:space="0"/>
+              <w:bottom w:val="single" w:sz="8" w:color="B68A3A" w:space="0"/>
+              <w:right w:val="single" w:sz="8" w:color="B68A3A" w:space="0"/>
+            </w:tcBorders>
+          </w:tcPr>
+          <w:p>
+            <w:pPr>
+              <w:spacing w:before="40" w:after="40" w:line="288" w:lineRule="auto"/>
+              <w:jc w:val="right"/>
+              <w:bidi w:val="1"/>
+              <w:textDirection w:val="rl"/>
+            </w:pPr>
+            <w:r/>
+            <w:r>
+              <w:rPr>
+                <w:rFonts w:ascii="Amiri" w:hAnsi="Amiri" w:cs="Amiri" w:eastAsia="Amiri"/>
+                <w:b w:val="0"/>
+                <w:color w:val="232323"/>
+                <w:sz w:val="20"/>
+                <w:rtl w:val="1"/>
+              </w:rPr>
+              <w:t>‏فصل تقريبي لهوية الإنترناشونال عن المنهاج الوطني</w:t>
+            </w:r>
+          </w:p>
+        </w:tc>
+        <w:tc>
+          <w:tcPr>
+            <w:tcW w:type="dxa" w:w="3289"/>
+            <w:shd w:fill="F8F5F2" w:val="clear"/>
+            <w:tcBorders>
+              <w:top w:val="single" w:sz="8" w:color="B68A3A" w:space="0"/>
+              <w:left w:val="single" w:sz="8" w:color="B68A3A" w:space="0"/>
+              <w:bottom w:val="single" w:sz="8" w:color="B68A3A" w:space="0"/>
+              <w:right w:val="single" w:sz="8" w:color="B68A3A" w:space="0"/>
+            </w:tcBorders>
+          </w:tcPr>
+          <w:p>
+            <w:pPr>
+              <w:spacing w:before="40" w:after="40" w:line="288" w:lineRule="auto"/>
+              <w:jc w:val="right"/>
+              <w:bidi w:val="1"/>
+              <w:textDirection w:val="rl"/>
+            </w:pPr>
+            <w:r/>
+            <w:r>
+              <w:rPr>
+                <w:rFonts w:ascii="Amiri" w:hAnsi="Amiri" w:cs="Amiri" w:eastAsia="Amiri"/>
+                <w:b w:val="0"/>
+                <w:color w:val="232323"/>
+                <w:sz w:val="20"/>
+                <w:rtl w:val="1"/>
+              </w:rPr>
+              <w:t>‏% نقاط التماس المفصولة</w:t>
+            </w:r>
+          </w:p>
+        </w:tc>
+      </w:tr>
     </w:tbl>
     <w:p/>
     <w:p>
@@ -5080,6 +5438,2109 @@
           <w:sz w:val="30"/>
           <w:rtl w:val="1"/>
         </w:rPr>
+        <w:t>‏6أ. فصل الهوية البصرية: الإنترناشونال عن المنهاج الوطني</w:t>
+      </w:r>
+    </w:p>
+    <w:p>
+      <w:pPr>
+        <w:spacing w:before="40" w:after="160" w:line="240" w:lineRule="auto"/>
+        <w:jc w:val="center"/>
+        <w:pBdr>
+          <w:bottom w:val="single" w:sz="12" w:space="1" w:color="B68A3A"/>
+        </w:pBdr>
+      </w:pPr>
+    </w:p>
+    <w:p>
+      <w:pPr>
+        <w:spacing w:before="0" w:after="120" w:line="324" w:lineRule="auto"/>
+        <w:jc w:val="right"/>
+        <w:bidi w:val="1"/>
+        <w:textDirection w:val="rl"/>
+      </w:pPr>
+      <w:r>
+        <w:rPr>
+          <w:rFonts w:ascii="Amiri" w:hAnsi="Amiri" w:cs="Amiri" w:eastAsia="Amiri"/>
+          <w:b w:val="0"/>
+          <w:color w:val="232323"/>
+          <w:sz w:val="23"/>
+          <w:rtl w:val="1"/>
+        </w:rPr>
+        <w:t>‏في مدرسة تضم مساراً دولياً ومنهاجاً وطنياً أردنياً، يُعد اختلاط الهوية البصرية والتشغيلية من أسرع مصادر التشويش على ولي الأمر وعلى تموضع القسم الدولي. الهدف هنا ليس تقسيم المدرسة إلى كيانين متعاديين، بل بناء «فصل تقريبي مرحلي» يجعل تجربة Omareyah International Division واضحة ومستقلة بصرياً وتشغيلياً عن مسار المنهاج الوطني، مع بقاء العمريّة مؤسسة جامعة.</w:t>
+      </w:r>
+    </w:p>
+    <w:p>
+      <w:pPr>
+        <w:spacing w:before="120" w:after="160" w:line="240" w:lineRule="auto"/>
+        <w:jc w:val="center"/>
+      </w:pPr>
+      <w:r>
+        <w:drawing>
+          <wp:inline xmlns:a="http://schemas.openxmlformats.org/drawingml/2006/main" xmlns:pic="http://schemas.openxmlformats.org/drawingml/2006/picture">
+            <wp:extent cx="5806440" cy="2702007"/>
+            <wp:docPr id="3" name="Picture 3"/>
+            <wp:cNvGraphicFramePr>
+              <a:graphicFrameLocks noChangeAspect="1"/>
+            </wp:cNvGraphicFramePr>
+            <a:graphic>
+              <a:graphicData uri="http://schemas.openxmlformats.org/drawingml/2006/picture">
+                <pic:pic>
+                  <pic:nvPicPr>
+                    <pic:cNvPr id="0" name="chart_identity_separation.png"/>
+                    <pic:cNvPicPr/>
+                  </pic:nvPicPr>
+                  <pic:blipFill>
+                    <a:blip r:embed="rId13"/>
+                    <a:stretch>
+                      <a:fillRect/>
+                    </a:stretch>
+                  </pic:blipFill>
+                  <pic:spPr>
+                    <a:xfrm>
+                      <a:off x="0" y="0"/>
+                      <a:ext cx="5806440" cy="2702007"/>
+                    </a:xfrm>
+                    <a:prstGeom prst="rect"/>
+                  </pic:spPr>
+                </pic:pic>
+              </a:graphicData>
+            </a:graphic>
+          </wp:inline>
+        </w:drawing>
+      </w:r>
+    </w:p>
+    <w:p>
+      <w:pPr>
+        <w:spacing w:before="200" w:after="80" w:line="324" w:lineRule="auto"/>
+        <w:jc w:val="right"/>
+        <w:bidi w:val="1"/>
+        <w:textDirection w:val="rl"/>
+      </w:pPr>
+      <w:r>
+        <w:rPr>
+          <w:rFonts w:ascii="Amiri" w:hAnsi="Amiri" w:cs="Amiri" w:eastAsia="Amiri"/>
+          <w:b/>
+          <w:color w:val="B68A3A"/>
+          <w:sz w:val="25"/>
+          <w:rtl w:val="1"/>
+        </w:rPr>
+        <w:t>‏لماذا الفصل ضروري؟</w:t>
+      </w:r>
+    </w:p>
+    <w:p>
+      <w:pPr>
+        <w:spacing w:before="0" w:after="60" w:line="312" w:lineRule="auto"/>
+        <w:jc w:val="right"/>
+        <w:bidi w:val="1"/>
+        <w:textDirection w:val="rl"/>
+      </w:pPr>
+      <w:r>
+        <w:rPr>
+          <w:rFonts w:ascii="Amiri" w:hAnsi="Amiri" w:cs="Amiri" w:eastAsia="Amiri"/>
+          <w:b w:val="0"/>
+          <w:color w:val="232323"/>
+          <w:sz w:val="23"/>
+          <w:rtl w:val="1"/>
+        </w:rPr>
+        <w:t>‏• ولي الأمر يحتاج أن يميّز عرض القيمة الدولي عن المسار الوطني دون ارتباك في الألوان واللافتات والنماذج.</w:t>
+      </w:r>
+    </w:p>
+    <w:p>
+      <w:pPr>
+        <w:spacing w:before="0" w:after="60" w:line="312" w:lineRule="auto"/>
+        <w:jc w:val="right"/>
+        <w:bidi w:val="1"/>
+        <w:textDirection w:val="rl"/>
+      </w:pPr>
+      <w:r>
+        <w:rPr>
+          <w:rFonts w:ascii="Amiri" w:hAnsi="Amiri" w:cs="Amiri" w:eastAsia="Amiri"/>
+          <w:b w:val="0"/>
+          <w:color w:val="232323"/>
+          <w:sz w:val="23"/>
+          <w:rtl w:val="1"/>
+        </w:rPr>
+        <w:t>‏• التسويق التربوي يضعف إذا بقيت صور ومواد القسم الدولي تبدو كامتداد غير متمايز للمسار الوطني.</w:t>
+      </w:r>
+    </w:p>
+    <w:p>
+      <w:pPr>
+        <w:spacing w:before="0" w:after="60" w:line="312" w:lineRule="auto"/>
+        <w:jc w:val="right"/>
+        <w:bidi w:val="1"/>
+        <w:textDirection w:val="rl"/>
+      </w:pPr>
+      <w:r>
+        <w:rPr>
+          <w:rFonts w:ascii="Amiri" w:hAnsi="Amiri" w:cs="Amiri" w:eastAsia="Amiri"/>
+          <w:b w:val="0"/>
+          <w:color w:val="232323"/>
+          <w:sz w:val="23"/>
+          <w:rtl w:val="1"/>
+        </w:rPr>
+        <w:t>‏• الجودة والقبول والإرشاد تعمل بكفاءة أعلى عندما تكون نقاط التماس (نماذج، رسائل، بوابات) مفصولة تقريباً.</w:t>
+      </w:r>
+    </w:p>
+    <w:p>
+      <w:pPr>
+        <w:spacing w:before="0" w:after="60" w:line="312" w:lineRule="auto"/>
+        <w:jc w:val="right"/>
+        <w:bidi w:val="1"/>
+        <w:textDirection w:val="rl"/>
+      </w:pPr>
+      <w:r>
+        <w:rPr>
+          <w:rFonts w:ascii="Amiri" w:hAnsi="Amiri" w:cs="Amiri" w:eastAsia="Amiri"/>
+          <w:b w:val="0"/>
+          <w:color w:val="232323"/>
+          <w:sz w:val="23"/>
+          <w:rtl w:val="1"/>
+        </w:rPr>
+        <w:t>‏• الكوادر تقلّ لديها حالات «خلط الإجراءات» بين المسارين.</w:t>
+      </w:r>
+    </w:p>
+    <w:p>
+      <w:pPr>
+        <w:spacing w:before="200" w:after="80" w:line="324" w:lineRule="auto"/>
+        <w:jc w:val="right"/>
+        <w:bidi w:val="1"/>
+        <w:textDirection w:val="rl"/>
+      </w:pPr>
+      <w:r>
+        <w:rPr>
+          <w:rFonts w:ascii="Amiri" w:hAnsi="Amiri" w:cs="Amiri" w:eastAsia="Amiri"/>
+          <w:b/>
+          <w:color w:val="B68A3A"/>
+          <w:sz w:val="25"/>
+          <w:rtl w:val="1"/>
+        </w:rPr>
+        <w:t>‏أبعاد الفصل التقريبي (لكل شيء تقريباً)</w:t>
+      </w:r>
+    </w:p>
+    <w:tbl>
+      <w:tblPr>
+        <w:tblW w:type="auto" w:w="0"/>
+        <w:jc w:val="center"/>
+        <w:tblLook w:firstColumn="1" w:firstRow="1" w:lastColumn="0" w:lastRow="0" w:noHBand="0" w:noVBand="1" w:val="04A0"/>
+        <w:bidiVisual w:val="1"/>
+      </w:tblPr>
+      <w:tblGrid>
+        <w:gridCol w:w="2466"/>
+        <w:gridCol w:w="2466"/>
+        <w:gridCol w:w="2466"/>
+        <w:gridCol w:w="2466"/>
+      </w:tblGrid>
+      <w:tr>
+        <w:tc>
+          <w:tcPr>
+            <w:tcW w:type="dxa" w:w="2466"/>
+            <w:shd w:fill="8B1E2D" w:val="clear"/>
+            <w:tcBorders>
+              <w:top w:val="single" w:sz="8" w:color="8B1E2D" w:space="0"/>
+              <w:left w:val="single" w:sz="8" w:color="8B1E2D" w:space="0"/>
+              <w:bottom w:val="single" w:sz="8" w:color="8B1E2D" w:space="0"/>
+              <w:right w:val="single" w:sz="8" w:color="8B1E2D" w:space="0"/>
+            </w:tcBorders>
+          </w:tcPr>
+          <w:p>
+            <w:pPr>
+              <w:spacing w:before="40" w:after="40" w:line="288" w:lineRule="auto"/>
+              <w:jc w:val="right"/>
+              <w:bidi w:val="1"/>
+              <w:textDirection w:val="rl"/>
+            </w:pPr>
+            <w:r/>
+            <w:r>
+              <w:rPr>
+                <w:rFonts w:ascii="Amiri" w:hAnsi="Amiri" w:cs="Amiri" w:eastAsia="Amiri"/>
+                <w:b/>
+                <w:color w:val="FFFFFF"/>
+                <w:sz w:val="21"/>
+                <w:rtl w:val="1"/>
+              </w:rPr>
+              <w:t>‏البُعد</w:t>
+            </w:r>
+          </w:p>
+        </w:tc>
+        <w:tc>
+          <w:tcPr>
+            <w:tcW w:type="dxa" w:w="2466"/>
+            <w:shd w:fill="8B1E2D" w:val="clear"/>
+            <w:tcBorders>
+              <w:top w:val="single" w:sz="8" w:color="8B1E2D" w:space="0"/>
+              <w:left w:val="single" w:sz="8" w:color="8B1E2D" w:space="0"/>
+              <w:bottom w:val="single" w:sz="8" w:color="8B1E2D" w:space="0"/>
+              <w:right w:val="single" w:sz="8" w:color="8B1E2D" w:space="0"/>
+            </w:tcBorders>
+          </w:tcPr>
+          <w:p>
+            <w:pPr>
+              <w:spacing w:before="40" w:after="40" w:line="288" w:lineRule="auto"/>
+              <w:jc w:val="right"/>
+              <w:bidi w:val="1"/>
+              <w:textDirection w:val="rl"/>
+            </w:pPr>
+            <w:r/>
+            <w:r>
+              <w:rPr>
+                <w:rFonts w:ascii="Amiri" w:hAnsi="Amiri" w:cs="Amiri" w:eastAsia="Amiri"/>
+                <w:b/>
+                <w:color w:val="FFFFFF"/>
+                <w:sz w:val="21"/>
+                <w:rtl w:val="1"/>
+              </w:rPr>
+              <w:t>‏مسار الإنترناشونال</w:t>
+            </w:r>
+          </w:p>
+        </w:tc>
+        <w:tc>
+          <w:tcPr>
+            <w:tcW w:type="dxa" w:w="2466"/>
+            <w:shd w:fill="8B1E2D" w:val="clear"/>
+            <w:tcBorders>
+              <w:top w:val="single" w:sz="8" w:color="8B1E2D" w:space="0"/>
+              <w:left w:val="single" w:sz="8" w:color="8B1E2D" w:space="0"/>
+              <w:bottom w:val="single" w:sz="8" w:color="8B1E2D" w:space="0"/>
+              <w:right w:val="single" w:sz="8" w:color="8B1E2D" w:space="0"/>
+            </w:tcBorders>
+          </w:tcPr>
+          <w:p>
+            <w:pPr>
+              <w:spacing w:before="40" w:after="40" w:line="288" w:lineRule="auto"/>
+              <w:jc w:val="right"/>
+              <w:bidi w:val="1"/>
+              <w:textDirection w:val="rl"/>
+            </w:pPr>
+            <w:r/>
+            <w:r>
+              <w:rPr>
+                <w:rFonts w:ascii="Amiri" w:hAnsi="Amiri" w:cs="Amiri" w:eastAsia="Amiri"/>
+                <w:b/>
+                <w:color w:val="FFFFFF"/>
+                <w:sz w:val="21"/>
+                <w:rtl w:val="1"/>
+              </w:rPr>
+              <w:t>‏مسار المنهاج الوطني</w:t>
+            </w:r>
+          </w:p>
+        </w:tc>
+        <w:tc>
+          <w:tcPr>
+            <w:tcW w:type="dxa" w:w="2466"/>
+            <w:shd w:fill="8B1E2D" w:val="clear"/>
+            <w:tcBorders>
+              <w:top w:val="single" w:sz="8" w:color="8B1E2D" w:space="0"/>
+              <w:left w:val="single" w:sz="8" w:color="8B1E2D" w:space="0"/>
+              <w:bottom w:val="single" w:sz="8" w:color="8B1E2D" w:space="0"/>
+              <w:right w:val="single" w:sz="8" w:color="8B1E2D" w:space="0"/>
+            </w:tcBorders>
+          </w:tcPr>
+          <w:p>
+            <w:pPr>
+              <w:spacing w:before="40" w:after="40" w:line="288" w:lineRule="auto"/>
+              <w:jc w:val="right"/>
+              <w:bidi w:val="1"/>
+              <w:textDirection w:val="rl"/>
+            </w:pPr>
+            <w:r/>
+            <w:r>
+              <w:rPr>
+                <w:rFonts w:ascii="Amiri" w:hAnsi="Amiri" w:cs="Amiri" w:eastAsia="Amiri"/>
+                <w:b/>
+                <w:color w:val="FFFFFF"/>
+                <w:sz w:val="21"/>
+                <w:rtl w:val="1"/>
+              </w:rPr>
+              <w:t>‏حد أدنى للسنة 1</w:t>
+            </w:r>
+          </w:p>
+        </w:tc>
+      </w:tr>
+      <w:tr>
+        <w:tc>
+          <w:tcPr>
+            <w:tcW w:type="dxa" w:w="2466"/>
+            <w:shd w:fill="F8F5F2" w:val="clear"/>
+            <w:tcBorders>
+              <w:top w:val="single" w:sz="8" w:color="B68A3A" w:space="0"/>
+              <w:left w:val="single" w:sz="8" w:color="B68A3A" w:space="0"/>
+              <w:bottom w:val="single" w:sz="8" w:color="B68A3A" w:space="0"/>
+              <w:right w:val="single" w:sz="8" w:color="B68A3A" w:space="0"/>
+            </w:tcBorders>
+          </w:tcPr>
+          <w:p>
+            <w:pPr>
+              <w:spacing w:before="40" w:after="40" w:line="288" w:lineRule="auto"/>
+              <w:jc w:val="right"/>
+              <w:bidi w:val="1"/>
+              <w:textDirection w:val="rl"/>
+            </w:pPr>
+            <w:r/>
+            <w:r>
+              <w:rPr>
+                <w:rFonts w:ascii="Amiri" w:hAnsi="Amiri" w:cs="Amiri" w:eastAsia="Amiri"/>
+                <w:b w:val="0"/>
+                <w:color w:val="232323"/>
+                <w:sz w:val="20"/>
+                <w:rtl w:val="1"/>
+              </w:rPr>
+              <w:t>‏الشعار/الألوان</w:t>
+            </w:r>
+          </w:p>
+        </w:tc>
+        <w:tc>
+          <w:tcPr>
+            <w:tcW w:type="dxa" w:w="2466"/>
+            <w:shd w:fill="F8F5F2" w:val="clear"/>
+            <w:tcBorders>
+              <w:top w:val="single" w:sz="8" w:color="B68A3A" w:space="0"/>
+              <w:left w:val="single" w:sz="8" w:color="B68A3A" w:space="0"/>
+              <w:bottom w:val="single" w:sz="8" w:color="B68A3A" w:space="0"/>
+              <w:right w:val="single" w:sz="8" w:color="B68A3A" w:space="0"/>
+            </w:tcBorders>
+          </w:tcPr>
+          <w:p>
+            <w:pPr>
+              <w:spacing w:before="40" w:after="40" w:line="288" w:lineRule="auto"/>
+              <w:jc w:val="right"/>
+              <w:bidi w:val="1"/>
+              <w:textDirection w:val="rl"/>
+            </w:pPr>
+            <w:r/>
+            <w:r>
+              <w:rPr>
+                <w:rFonts w:ascii="Amiri" w:hAnsi="Amiri" w:cs="Amiri" w:eastAsia="Amiri"/>
+                <w:b w:val="0"/>
+                <w:color w:val="232323"/>
+                <w:sz w:val="20"/>
+                <w:rtl w:val="1"/>
+              </w:rPr>
+              <w:t>‏نظام بصري فرعي للقسم الدولي</w:t>
+            </w:r>
+          </w:p>
+        </w:tc>
+        <w:tc>
+          <w:tcPr>
+            <w:tcW w:type="dxa" w:w="2466"/>
+            <w:shd w:fill="F8F5F2" w:val="clear"/>
+            <w:tcBorders>
+              <w:top w:val="single" w:sz="8" w:color="B68A3A" w:space="0"/>
+              <w:left w:val="single" w:sz="8" w:color="B68A3A" w:space="0"/>
+              <w:bottom w:val="single" w:sz="8" w:color="B68A3A" w:space="0"/>
+              <w:right w:val="single" w:sz="8" w:color="B68A3A" w:space="0"/>
+            </w:tcBorders>
+          </w:tcPr>
+          <w:p>
+            <w:pPr>
+              <w:spacing w:before="40" w:after="40" w:line="288" w:lineRule="auto"/>
+              <w:jc w:val="right"/>
+              <w:bidi w:val="1"/>
+              <w:textDirection w:val="rl"/>
+            </w:pPr>
+            <w:r/>
+            <w:r>
+              <w:rPr>
+                <w:rFonts w:ascii="Amiri" w:hAnsi="Amiri" w:cs="Amiri" w:eastAsia="Amiri"/>
+                <w:b w:val="0"/>
+                <w:color w:val="232323"/>
+                <w:sz w:val="20"/>
+                <w:rtl w:val="1"/>
+              </w:rPr>
+              <w:t>‏هوية المسار الوطني كما هي</w:t>
+            </w:r>
+          </w:p>
+        </w:tc>
+        <w:tc>
+          <w:tcPr>
+            <w:tcW w:type="dxa" w:w="2466"/>
+            <w:shd w:fill="F8F5F2" w:val="clear"/>
+            <w:tcBorders>
+              <w:top w:val="single" w:sz="8" w:color="B68A3A" w:space="0"/>
+              <w:left w:val="single" w:sz="8" w:color="B68A3A" w:space="0"/>
+              <w:bottom w:val="single" w:sz="8" w:color="B68A3A" w:space="0"/>
+              <w:right w:val="single" w:sz="8" w:color="B68A3A" w:space="0"/>
+            </w:tcBorders>
+          </w:tcPr>
+          <w:p>
+            <w:pPr>
+              <w:spacing w:before="40" w:after="40" w:line="288" w:lineRule="auto"/>
+              <w:jc w:val="right"/>
+              <w:bidi w:val="1"/>
+              <w:textDirection w:val="rl"/>
+            </w:pPr>
+            <w:r/>
+            <w:r>
+              <w:rPr>
+                <w:rFonts w:ascii="Amiri" w:hAnsi="Amiri" w:cs="Amiri" w:eastAsia="Amiri"/>
+                <w:b w:val="0"/>
+                <w:color w:val="232323"/>
+                <w:sz w:val="20"/>
+                <w:rtl w:val="1"/>
+              </w:rPr>
+              <w:t>‏دليل ألوان وقوالب معتمدة</w:t>
+            </w:r>
+          </w:p>
+        </w:tc>
+      </w:tr>
+      <w:tr>
+        <w:tc>
+          <w:tcPr>
+            <w:tcW w:type="dxa" w:w="2466"/>
+            <w:shd w:fill="FFFFFF" w:val="clear"/>
+            <w:tcBorders>
+              <w:top w:val="single" w:sz="8" w:color="B68A3A" w:space="0"/>
+              <w:left w:val="single" w:sz="8" w:color="B68A3A" w:space="0"/>
+              <w:bottom w:val="single" w:sz="8" w:color="B68A3A" w:space="0"/>
+              <w:right w:val="single" w:sz="8" w:color="B68A3A" w:space="0"/>
+            </w:tcBorders>
+          </w:tcPr>
+          <w:p>
+            <w:pPr>
+              <w:spacing w:before="40" w:after="40" w:line="288" w:lineRule="auto"/>
+              <w:jc w:val="right"/>
+              <w:bidi w:val="1"/>
+              <w:textDirection w:val="rl"/>
+            </w:pPr>
+            <w:r/>
+            <w:r>
+              <w:rPr>
+                <w:rFonts w:ascii="Amiri" w:hAnsi="Amiri" w:cs="Amiri" w:eastAsia="Amiri"/>
+                <w:b w:val="0"/>
+                <w:color w:val="232323"/>
+                <w:sz w:val="20"/>
+                <w:rtl w:val="1"/>
+              </w:rPr>
+              <w:t>‏الترويسة والشهادات</w:t>
+            </w:r>
+          </w:p>
+        </w:tc>
+        <w:tc>
+          <w:tcPr>
+            <w:tcW w:type="dxa" w:w="2466"/>
+            <w:shd w:fill="FFFFFF" w:val="clear"/>
+            <w:tcBorders>
+              <w:top w:val="single" w:sz="8" w:color="B68A3A" w:space="0"/>
+              <w:left w:val="single" w:sz="8" w:color="B68A3A" w:space="0"/>
+              <w:bottom w:val="single" w:sz="8" w:color="B68A3A" w:space="0"/>
+              <w:right w:val="single" w:sz="8" w:color="B68A3A" w:space="0"/>
+            </w:tcBorders>
+          </w:tcPr>
+          <w:p>
+            <w:pPr>
+              <w:spacing w:before="40" w:after="40" w:line="288" w:lineRule="auto"/>
+              <w:jc w:val="right"/>
+              <w:bidi w:val="1"/>
+              <w:textDirection w:val="rl"/>
+            </w:pPr>
+            <w:r/>
+            <w:r>
+              <w:rPr>
+                <w:rFonts w:ascii="Amiri" w:hAnsi="Amiri" w:cs="Amiri" w:eastAsia="Amiri"/>
+                <w:b w:val="0"/>
+                <w:color w:val="232323"/>
+                <w:sz w:val="20"/>
+                <w:rtl w:val="1"/>
+              </w:rPr>
+              <w:t>‏قوالب International Division</w:t>
+            </w:r>
+          </w:p>
+        </w:tc>
+        <w:tc>
+          <w:tcPr>
+            <w:tcW w:type="dxa" w:w="2466"/>
+            <w:shd w:fill="FFFFFF" w:val="clear"/>
+            <w:tcBorders>
+              <w:top w:val="single" w:sz="8" w:color="B68A3A" w:space="0"/>
+              <w:left w:val="single" w:sz="8" w:color="B68A3A" w:space="0"/>
+              <w:bottom w:val="single" w:sz="8" w:color="B68A3A" w:space="0"/>
+              <w:right w:val="single" w:sz="8" w:color="B68A3A" w:space="0"/>
+            </w:tcBorders>
+          </w:tcPr>
+          <w:p>
+            <w:pPr>
+              <w:spacing w:before="40" w:after="40" w:line="288" w:lineRule="auto"/>
+              <w:jc w:val="right"/>
+              <w:bidi w:val="1"/>
+              <w:textDirection w:val="rl"/>
+            </w:pPr>
+            <w:r/>
+            <w:r>
+              <w:rPr>
+                <w:rFonts w:ascii="Amiri" w:hAnsi="Amiri" w:cs="Amiri" w:eastAsia="Amiri"/>
+                <w:b w:val="0"/>
+                <w:color w:val="232323"/>
+                <w:sz w:val="20"/>
+                <w:rtl w:val="1"/>
+              </w:rPr>
+              <w:t>‏قوالب المسار الوطني</w:t>
+            </w:r>
+          </w:p>
+        </w:tc>
+        <w:tc>
+          <w:tcPr>
+            <w:tcW w:type="dxa" w:w="2466"/>
+            <w:shd w:fill="FFFFFF" w:val="clear"/>
+            <w:tcBorders>
+              <w:top w:val="single" w:sz="8" w:color="B68A3A" w:space="0"/>
+              <w:left w:val="single" w:sz="8" w:color="B68A3A" w:space="0"/>
+              <w:bottom w:val="single" w:sz="8" w:color="B68A3A" w:space="0"/>
+              <w:right w:val="single" w:sz="8" w:color="B68A3A" w:space="0"/>
+            </w:tcBorders>
+          </w:tcPr>
+          <w:p>
+            <w:pPr>
+              <w:spacing w:before="40" w:after="40" w:line="288" w:lineRule="auto"/>
+              <w:jc w:val="right"/>
+              <w:bidi w:val="1"/>
+              <w:textDirection w:val="rl"/>
+            </w:pPr>
+            <w:r/>
+            <w:r>
+              <w:rPr>
+                <w:rFonts w:ascii="Amiri" w:hAnsi="Amiri" w:cs="Amiri" w:eastAsia="Amiri"/>
+                <w:b w:val="0"/>
+                <w:color w:val="232323"/>
+                <w:sz w:val="20"/>
+                <w:rtl w:val="1"/>
+              </w:rPr>
+              <w:t>‏فصل 100% للمخرجات الرسمية</w:t>
+            </w:r>
+          </w:p>
+        </w:tc>
+      </w:tr>
+      <w:tr>
+        <w:tc>
+          <w:tcPr>
+            <w:tcW w:type="dxa" w:w="2466"/>
+            <w:shd w:fill="F8F5F2" w:val="clear"/>
+            <w:tcBorders>
+              <w:top w:val="single" w:sz="8" w:color="B68A3A" w:space="0"/>
+              <w:left w:val="single" w:sz="8" w:color="B68A3A" w:space="0"/>
+              <w:bottom w:val="single" w:sz="8" w:color="B68A3A" w:space="0"/>
+              <w:right w:val="single" w:sz="8" w:color="B68A3A" w:space="0"/>
+            </w:tcBorders>
+          </w:tcPr>
+          <w:p>
+            <w:pPr>
+              <w:spacing w:before="40" w:after="40" w:line="288" w:lineRule="auto"/>
+              <w:jc w:val="right"/>
+              <w:bidi w:val="1"/>
+              <w:textDirection w:val="rl"/>
+            </w:pPr>
+            <w:r/>
+            <w:r>
+              <w:rPr>
+                <w:rFonts w:ascii="Amiri" w:hAnsi="Amiri" w:cs="Amiri" w:eastAsia="Amiri"/>
+                <w:b w:val="0"/>
+                <w:color w:val="232323"/>
+                <w:sz w:val="20"/>
+                <w:rtl w:val="1"/>
+              </w:rPr>
+              <w:t>‏القبول والتواصل</w:t>
+            </w:r>
+          </w:p>
+        </w:tc>
+        <w:tc>
+          <w:tcPr>
+            <w:tcW w:type="dxa" w:w="2466"/>
+            <w:shd w:fill="F8F5F2" w:val="clear"/>
+            <w:tcBorders>
+              <w:top w:val="single" w:sz="8" w:color="B68A3A" w:space="0"/>
+              <w:left w:val="single" w:sz="8" w:color="B68A3A" w:space="0"/>
+              <w:bottom w:val="single" w:sz="8" w:color="B68A3A" w:space="0"/>
+              <w:right w:val="single" w:sz="8" w:color="B68A3A" w:space="0"/>
+            </w:tcBorders>
+          </w:tcPr>
+          <w:p>
+            <w:pPr>
+              <w:spacing w:before="40" w:after="40" w:line="288" w:lineRule="auto"/>
+              <w:jc w:val="right"/>
+              <w:bidi w:val="1"/>
+              <w:textDirection w:val="rl"/>
+            </w:pPr>
+            <w:r/>
+            <w:r>
+              <w:rPr>
+                <w:rFonts w:ascii="Amiri" w:hAnsi="Amiri" w:cs="Amiri" w:eastAsia="Amiri"/>
+                <w:b w:val="0"/>
+                <w:color w:val="232323"/>
+                <w:sz w:val="20"/>
+                <w:rtl w:val="1"/>
+              </w:rPr>
+              <w:t>‏رحلة ولي أمر مستقلة</w:t>
+            </w:r>
+          </w:p>
+        </w:tc>
+        <w:tc>
+          <w:tcPr>
+            <w:tcW w:type="dxa" w:w="2466"/>
+            <w:shd w:fill="F8F5F2" w:val="clear"/>
+            <w:tcBorders>
+              <w:top w:val="single" w:sz="8" w:color="B68A3A" w:space="0"/>
+              <w:left w:val="single" w:sz="8" w:color="B68A3A" w:space="0"/>
+              <w:bottom w:val="single" w:sz="8" w:color="B68A3A" w:space="0"/>
+              <w:right w:val="single" w:sz="8" w:color="B68A3A" w:space="0"/>
+            </w:tcBorders>
+          </w:tcPr>
+          <w:p>
+            <w:pPr>
+              <w:spacing w:before="40" w:after="40" w:line="288" w:lineRule="auto"/>
+              <w:jc w:val="right"/>
+              <w:bidi w:val="1"/>
+              <w:textDirection w:val="rl"/>
+            </w:pPr>
+            <w:r/>
+            <w:r>
+              <w:rPr>
+                <w:rFonts w:ascii="Amiri" w:hAnsi="Amiri" w:cs="Amiri" w:eastAsia="Amiri"/>
+                <w:b w:val="0"/>
+                <w:color w:val="232323"/>
+                <w:sz w:val="20"/>
+                <w:rtl w:val="1"/>
+              </w:rPr>
+              <w:t>‏قناة المسار الوطني</w:t>
+            </w:r>
+          </w:p>
+        </w:tc>
+        <w:tc>
+          <w:tcPr>
+            <w:tcW w:type="dxa" w:w="2466"/>
+            <w:shd w:fill="F8F5F2" w:val="clear"/>
+            <w:tcBorders>
+              <w:top w:val="single" w:sz="8" w:color="B68A3A" w:space="0"/>
+              <w:left w:val="single" w:sz="8" w:color="B68A3A" w:space="0"/>
+              <w:bottom w:val="single" w:sz="8" w:color="B68A3A" w:space="0"/>
+              <w:right w:val="single" w:sz="8" w:color="B68A3A" w:space="0"/>
+            </w:tcBorders>
+          </w:tcPr>
+          <w:p>
+            <w:pPr>
+              <w:spacing w:before="40" w:after="40" w:line="288" w:lineRule="auto"/>
+              <w:jc w:val="right"/>
+              <w:bidi w:val="1"/>
+              <w:textDirection w:val="rl"/>
+            </w:pPr>
+            <w:r/>
+            <w:r>
+              <w:rPr>
+                <w:rFonts w:ascii="Amiri" w:hAnsi="Amiri" w:cs="Amiri" w:eastAsia="Amiri"/>
+                <w:b w:val="0"/>
+                <w:color w:val="232323"/>
+                <w:sz w:val="20"/>
+                <w:rtl w:val="1"/>
+              </w:rPr>
+              <w:t>‏نماذج وردود منفصلة</w:t>
+            </w:r>
+          </w:p>
+        </w:tc>
+      </w:tr>
+      <w:tr>
+        <w:tc>
+          <w:tcPr>
+            <w:tcW w:type="dxa" w:w="2466"/>
+            <w:shd w:fill="FFFFFF" w:val="clear"/>
+            <w:tcBorders>
+              <w:top w:val="single" w:sz="8" w:color="B68A3A" w:space="0"/>
+              <w:left w:val="single" w:sz="8" w:color="B68A3A" w:space="0"/>
+              <w:bottom w:val="single" w:sz="8" w:color="B68A3A" w:space="0"/>
+              <w:right w:val="single" w:sz="8" w:color="B68A3A" w:space="0"/>
+            </w:tcBorders>
+          </w:tcPr>
+          <w:p>
+            <w:pPr>
+              <w:spacing w:before="40" w:after="40" w:line="288" w:lineRule="auto"/>
+              <w:jc w:val="right"/>
+              <w:bidi w:val="1"/>
+              <w:textDirection w:val="rl"/>
+            </w:pPr>
+            <w:r/>
+            <w:r>
+              <w:rPr>
+                <w:rFonts w:ascii="Amiri" w:hAnsi="Amiri" w:cs="Amiri" w:eastAsia="Amiri"/>
+                <w:b w:val="0"/>
+                <w:color w:val="232323"/>
+                <w:sz w:val="20"/>
+                <w:rtl w:val="1"/>
+              </w:rPr>
+              <w:t>‏اللافتات والممرات</w:t>
+            </w:r>
+          </w:p>
+        </w:tc>
+        <w:tc>
+          <w:tcPr>
+            <w:tcW w:type="dxa" w:w="2466"/>
+            <w:shd w:fill="FFFFFF" w:val="clear"/>
+            <w:tcBorders>
+              <w:top w:val="single" w:sz="8" w:color="B68A3A" w:space="0"/>
+              <w:left w:val="single" w:sz="8" w:color="B68A3A" w:space="0"/>
+              <w:bottom w:val="single" w:sz="8" w:color="B68A3A" w:space="0"/>
+              <w:right w:val="single" w:sz="8" w:color="B68A3A" w:space="0"/>
+            </w:tcBorders>
+          </w:tcPr>
+          <w:p>
+            <w:pPr>
+              <w:spacing w:before="40" w:after="40" w:line="288" w:lineRule="auto"/>
+              <w:jc w:val="right"/>
+              <w:bidi w:val="1"/>
+              <w:textDirection w:val="rl"/>
+            </w:pPr>
+            <w:r/>
+            <w:r>
+              <w:rPr>
+                <w:rFonts w:ascii="Amiri" w:hAnsi="Amiri" w:cs="Amiri" w:eastAsia="Amiri"/>
+                <w:b w:val="0"/>
+                <w:color w:val="232323"/>
+                <w:sz w:val="20"/>
+                <w:rtl w:val="1"/>
+              </w:rPr>
+              <w:t>‏مناطق تعريف بصرية للقسم</w:t>
+            </w:r>
+          </w:p>
+        </w:tc>
+        <w:tc>
+          <w:tcPr>
+            <w:tcW w:type="dxa" w:w="2466"/>
+            <w:shd w:fill="FFFFFF" w:val="clear"/>
+            <w:tcBorders>
+              <w:top w:val="single" w:sz="8" w:color="B68A3A" w:space="0"/>
+              <w:left w:val="single" w:sz="8" w:color="B68A3A" w:space="0"/>
+              <w:bottom w:val="single" w:sz="8" w:color="B68A3A" w:space="0"/>
+              <w:right w:val="single" w:sz="8" w:color="B68A3A" w:space="0"/>
+            </w:tcBorders>
+          </w:tcPr>
+          <w:p>
+            <w:pPr>
+              <w:spacing w:before="40" w:after="40" w:line="288" w:lineRule="auto"/>
+              <w:jc w:val="right"/>
+              <w:bidi w:val="1"/>
+              <w:textDirection w:val="rl"/>
+            </w:pPr>
+            <w:r/>
+            <w:r>
+              <w:rPr>
+                <w:rFonts w:ascii="Amiri" w:hAnsi="Amiri" w:cs="Amiri" w:eastAsia="Amiri"/>
+                <w:b w:val="0"/>
+                <w:color w:val="232323"/>
+                <w:sz w:val="20"/>
+                <w:rtl w:val="1"/>
+              </w:rPr>
+              <w:t>‏لافتات المسار الوطني</w:t>
+            </w:r>
+          </w:p>
+        </w:tc>
+        <w:tc>
+          <w:tcPr>
+            <w:tcW w:type="dxa" w:w="2466"/>
+            <w:shd w:fill="FFFFFF" w:val="clear"/>
+            <w:tcBorders>
+              <w:top w:val="single" w:sz="8" w:color="B68A3A" w:space="0"/>
+              <w:left w:val="single" w:sz="8" w:color="B68A3A" w:space="0"/>
+              <w:bottom w:val="single" w:sz="8" w:color="B68A3A" w:space="0"/>
+              <w:right w:val="single" w:sz="8" w:color="B68A3A" w:space="0"/>
+            </w:tcBorders>
+          </w:tcPr>
+          <w:p>
+            <w:pPr>
+              <w:spacing w:before="40" w:after="40" w:line="288" w:lineRule="auto"/>
+              <w:jc w:val="right"/>
+              <w:bidi w:val="1"/>
+              <w:textDirection w:val="rl"/>
+            </w:pPr>
+            <w:r/>
+            <w:r>
+              <w:rPr>
+                <w:rFonts w:ascii="Amiri" w:hAnsi="Amiri" w:cs="Amiri" w:eastAsia="Amiri"/>
+                <w:b w:val="0"/>
+                <w:color w:val="232323"/>
+                <w:sz w:val="20"/>
+                <w:rtl w:val="1"/>
+              </w:rPr>
+              <w:t>‏لافتات أساسية في مداخل القسم</w:t>
+            </w:r>
+          </w:p>
+        </w:tc>
+      </w:tr>
+      <w:tr>
+        <w:tc>
+          <w:tcPr>
+            <w:tcW w:type="dxa" w:w="2466"/>
+            <w:shd w:fill="F8F5F2" w:val="clear"/>
+            <w:tcBorders>
+              <w:top w:val="single" w:sz="8" w:color="B68A3A" w:space="0"/>
+              <w:left w:val="single" w:sz="8" w:color="B68A3A" w:space="0"/>
+              <w:bottom w:val="single" w:sz="8" w:color="B68A3A" w:space="0"/>
+              <w:right w:val="single" w:sz="8" w:color="B68A3A" w:space="0"/>
+            </w:tcBorders>
+          </w:tcPr>
+          <w:p>
+            <w:pPr>
+              <w:spacing w:before="40" w:after="40" w:line="288" w:lineRule="auto"/>
+              <w:jc w:val="right"/>
+              <w:bidi w:val="1"/>
+              <w:textDirection w:val="rl"/>
+            </w:pPr>
+            <w:r/>
+            <w:r>
+              <w:rPr>
+                <w:rFonts w:ascii="Amiri" w:hAnsi="Amiri" w:cs="Amiri" w:eastAsia="Amiri"/>
+                <w:b w:val="0"/>
+                <w:color w:val="232323"/>
+                <w:sz w:val="20"/>
+                <w:rtl w:val="1"/>
+              </w:rPr>
+              <w:t>‏الفصول والعرض</w:t>
+            </w:r>
+          </w:p>
+        </w:tc>
+        <w:tc>
+          <w:tcPr>
+            <w:tcW w:type="dxa" w:w="2466"/>
+            <w:shd w:fill="F8F5F2" w:val="clear"/>
+            <w:tcBorders>
+              <w:top w:val="single" w:sz="8" w:color="B68A3A" w:space="0"/>
+              <w:left w:val="single" w:sz="8" w:color="B68A3A" w:space="0"/>
+              <w:bottom w:val="single" w:sz="8" w:color="B68A3A" w:space="0"/>
+              <w:right w:val="single" w:sz="8" w:color="B68A3A" w:space="0"/>
+            </w:tcBorders>
+          </w:tcPr>
+          <w:p>
+            <w:pPr>
+              <w:spacing w:before="40" w:after="40" w:line="288" w:lineRule="auto"/>
+              <w:jc w:val="right"/>
+              <w:bidi w:val="1"/>
+              <w:textDirection w:val="rl"/>
+            </w:pPr>
+            <w:r/>
+            <w:r>
+              <w:rPr>
+                <w:rFonts w:ascii="Amiri" w:hAnsi="Amiri" w:cs="Amiri" w:eastAsia="Amiri"/>
+                <w:b w:val="0"/>
+                <w:color w:val="232323"/>
+                <w:sz w:val="20"/>
+                <w:rtl w:val="1"/>
+              </w:rPr>
+              <w:t>‏معايير عرض دولية</w:t>
+            </w:r>
+          </w:p>
+        </w:tc>
+        <w:tc>
+          <w:tcPr>
+            <w:tcW w:type="dxa" w:w="2466"/>
+            <w:shd w:fill="F8F5F2" w:val="clear"/>
+            <w:tcBorders>
+              <w:top w:val="single" w:sz="8" w:color="B68A3A" w:space="0"/>
+              <w:left w:val="single" w:sz="8" w:color="B68A3A" w:space="0"/>
+              <w:bottom w:val="single" w:sz="8" w:color="B68A3A" w:space="0"/>
+              <w:right w:val="single" w:sz="8" w:color="B68A3A" w:space="0"/>
+            </w:tcBorders>
+          </w:tcPr>
+          <w:p>
+            <w:pPr>
+              <w:spacing w:before="40" w:after="40" w:line="288" w:lineRule="auto"/>
+              <w:jc w:val="right"/>
+              <w:bidi w:val="1"/>
+              <w:textDirection w:val="rl"/>
+            </w:pPr>
+            <w:r/>
+            <w:r>
+              <w:rPr>
+                <w:rFonts w:ascii="Amiri" w:hAnsi="Amiri" w:cs="Amiri" w:eastAsia="Amiri"/>
+                <w:b w:val="0"/>
+                <w:color w:val="232323"/>
+                <w:sz w:val="20"/>
+                <w:rtl w:val="1"/>
+              </w:rPr>
+              <w:t>‏معايير عرض وطنية</w:t>
+            </w:r>
+          </w:p>
+        </w:tc>
+        <w:tc>
+          <w:tcPr>
+            <w:tcW w:type="dxa" w:w="2466"/>
+            <w:shd w:fill="F8F5F2" w:val="clear"/>
+            <w:tcBorders>
+              <w:top w:val="single" w:sz="8" w:color="B68A3A" w:space="0"/>
+              <w:left w:val="single" w:sz="8" w:color="B68A3A" w:space="0"/>
+              <w:bottom w:val="single" w:sz="8" w:color="B68A3A" w:space="0"/>
+              <w:right w:val="single" w:sz="8" w:color="B68A3A" w:space="0"/>
+            </w:tcBorders>
+          </w:tcPr>
+          <w:p>
+            <w:pPr>
+              <w:spacing w:before="40" w:after="40" w:line="288" w:lineRule="auto"/>
+              <w:jc w:val="right"/>
+              <w:bidi w:val="1"/>
+              <w:textDirection w:val="rl"/>
+            </w:pPr>
+            <w:r/>
+            <w:r>
+              <w:rPr>
+                <w:rFonts w:ascii="Amiri" w:hAnsi="Amiri" w:cs="Amiri" w:eastAsia="Amiri"/>
+                <w:b w:val="0"/>
+                <w:color w:val="232323"/>
+                <w:sz w:val="20"/>
+                <w:rtl w:val="1"/>
+              </w:rPr>
+              <w:t>‏checklist صفّي مختلف</w:t>
+            </w:r>
+          </w:p>
+        </w:tc>
+      </w:tr>
+      <w:tr>
+        <w:tc>
+          <w:tcPr>
+            <w:tcW w:type="dxa" w:w="2466"/>
+            <w:shd w:fill="FFFFFF" w:val="clear"/>
+            <w:tcBorders>
+              <w:top w:val="single" w:sz="8" w:color="B68A3A" w:space="0"/>
+              <w:left w:val="single" w:sz="8" w:color="B68A3A" w:space="0"/>
+              <w:bottom w:val="single" w:sz="8" w:color="B68A3A" w:space="0"/>
+              <w:right w:val="single" w:sz="8" w:color="B68A3A" w:space="0"/>
+            </w:tcBorders>
+          </w:tcPr>
+          <w:p>
+            <w:pPr>
+              <w:spacing w:before="40" w:after="40" w:line="288" w:lineRule="auto"/>
+              <w:jc w:val="right"/>
+              <w:bidi w:val="1"/>
+              <w:textDirection w:val="rl"/>
+            </w:pPr>
+            <w:r/>
+            <w:r>
+              <w:rPr>
+                <w:rFonts w:ascii="Amiri" w:hAnsi="Amiri" w:cs="Amiri" w:eastAsia="Amiri"/>
+                <w:b w:val="0"/>
+                <w:color w:val="232323"/>
+                <w:sz w:val="20"/>
+                <w:rtl w:val="1"/>
+              </w:rPr>
+              <w:t>‏الرقمي</w:t>
+            </w:r>
+          </w:p>
+        </w:tc>
+        <w:tc>
+          <w:tcPr>
+            <w:tcW w:type="dxa" w:w="2466"/>
+            <w:shd w:fill="FFFFFF" w:val="clear"/>
+            <w:tcBorders>
+              <w:top w:val="single" w:sz="8" w:color="B68A3A" w:space="0"/>
+              <w:left w:val="single" w:sz="8" w:color="B68A3A" w:space="0"/>
+              <w:bottom w:val="single" w:sz="8" w:color="B68A3A" w:space="0"/>
+              <w:right w:val="single" w:sz="8" w:color="B68A3A" w:space="0"/>
+            </w:tcBorders>
+          </w:tcPr>
+          <w:p>
+            <w:pPr>
+              <w:spacing w:before="40" w:after="40" w:line="288" w:lineRule="auto"/>
+              <w:jc w:val="right"/>
+              <w:bidi w:val="1"/>
+              <w:textDirection w:val="rl"/>
+            </w:pPr>
+            <w:r/>
+            <w:r>
+              <w:rPr>
+                <w:rFonts w:ascii="Amiri" w:hAnsi="Amiri" w:cs="Amiri" w:eastAsia="Amiri"/>
+                <w:b w:val="0"/>
+                <w:color w:val="232323"/>
+                <w:sz w:val="20"/>
+                <w:rtl w:val="1"/>
+              </w:rPr>
+              <w:t>‏مساحة/قوالب للقسم الدولي</w:t>
+            </w:r>
+          </w:p>
+        </w:tc>
+        <w:tc>
+          <w:tcPr>
+            <w:tcW w:type="dxa" w:w="2466"/>
+            <w:shd w:fill="FFFFFF" w:val="clear"/>
+            <w:tcBorders>
+              <w:top w:val="single" w:sz="8" w:color="B68A3A" w:space="0"/>
+              <w:left w:val="single" w:sz="8" w:color="B68A3A" w:space="0"/>
+              <w:bottom w:val="single" w:sz="8" w:color="B68A3A" w:space="0"/>
+              <w:right w:val="single" w:sz="8" w:color="B68A3A" w:space="0"/>
+            </w:tcBorders>
+          </w:tcPr>
+          <w:p>
+            <w:pPr>
+              <w:spacing w:before="40" w:after="40" w:line="288" w:lineRule="auto"/>
+              <w:jc w:val="right"/>
+              <w:bidi w:val="1"/>
+              <w:textDirection w:val="rl"/>
+            </w:pPr>
+            <w:r/>
+            <w:r>
+              <w:rPr>
+                <w:rFonts w:ascii="Amiri" w:hAnsi="Amiri" w:cs="Amiri" w:eastAsia="Amiri"/>
+                <w:b w:val="0"/>
+                <w:color w:val="232323"/>
+                <w:sz w:val="20"/>
+                <w:rtl w:val="1"/>
+              </w:rPr>
+              <w:t>‏قنوات المسار الوطني</w:t>
+            </w:r>
+          </w:p>
+        </w:tc>
+        <w:tc>
+          <w:tcPr>
+            <w:tcW w:type="dxa" w:w="2466"/>
+            <w:shd w:fill="FFFFFF" w:val="clear"/>
+            <w:tcBorders>
+              <w:top w:val="single" w:sz="8" w:color="B68A3A" w:space="0"/>
+              <w:left w:val="single" w:sz="8" w:color="B68A3A" w:space="0"/>
+              <w:bottom w:val="single" w:sz="8" w:color="B68A3A" w:space="0"/>
+              <w:right w:val="single" w:sz="8" w:color="B68A3A" w:space="0"/>
+            </w:tcBorders>
+          </w:tcPr>
+          <w:p>
+            <w:pPr>
+              <w:spacing w:before="40" w:after="40" w:line="288" w:lineRule="auto"/>
+              <w:jc w:val="right"/>
+              <w:bidi w:val="1"/>
+              <w:textDirection w:val="rl"/>
+            </w:pPr>
+            <w:r/>
+            <w:r>
+              <w:rPr>
+                <w:rFonts w:ascii="Amiri" w:hAnsi="Amiri" w:cs="Amiri" w:eastAsia="Amiri"/>
+                <w:b w:val="0"/>
+                <w:color w:val="232323"/>
+                <w:sz w:val="20"/>
+                <w:rtl w:val="1"/>
+              </w:rPr>
+              <w:t>‏فصل القوالب والبريد</w:t>
+            </w:r>
+          </w:p>
+        </w:tc>
+      </w:tr>
+      <w:tr>
+        <w:tc>
+          <w:tcPr>
+            <w:tcW w:type="dxa" w:w="2466"/>
+            <w:shd w:fill="F8F5F2" w:val="clear"/>
+            <w:tcBorders>
+              <w:top w:val="single" w:sz="8" w:color="B68A3A" w:space="0"/>
+              <w:left w:val="single" w:sz="8" w:color="B68A3A" w:space="0"/>
+              <w:bottom w:val="single" w:sz="8" w:color="B68A3A" w:space="0"/>
+              <w:right w:val="single" w:sz="8" w:color="B68A3A" w:space="0"/>
+            </w:tcBorders>
+          </w:tcPr>
+          <w:p>
+            <w:pPr>
+              <w:spacing w:before="40" w:after="40" w:line="288" w:lineRule="auto"/>
+              <w:jc w:val="right"/>
+              <w:bidi w:val="1"/>
+              <w:textDirection w:val="rl"/>
+            </w:pPr>
+            <w:r/>
+            <w:r>
+              <w:rPr>
+                <w:rFonts w:ascii="Amiri" w:hAnsi="Amiri" w:cs="Amiri" w:eastAsia="Amiri"/>
+                <w:b w:val="0"/>
+                <w:color w:val="232323"/>
+                <w:sz w:val="20"/>
+                <w:rtl w:val="1"/>
+              </w:rPr>
+              <w:t>‏الفعاليات والتسويق</w:t>
+            </w:r>
+          </w:p>
+        </w:tc>
+        <w:tc>
+          <w:tcPr>
+            <w:tcW w:type="dxa" w:w="2466"/>
+            <w:shd w:fill="F8F5F2" w:val="clear"/>
+            <w:tcBorders>
+              <w:top w:val="single" w:sz="8" w:color="B68A3A" w:space="0"/>
+              <w:left w:val="single" w:sz="8" w:color="B68A3A" w:space="0"/>
+              <w:bottom w:val="single" w:sz="8" w:color="B68A3A" w:space="0"/>
+              <w:right w:val="single" w:sz="8" w:color="B68A3A" w:space="0"/>
+            </w:tcBorders>
+          </w:tcPr>
+          <w:p>
+            <w:pPr>
+              <w:spacing w:before="40" w:after="40" w:line="288" w:lineRule="auto"/>
+              <w:jc w:val="right"/>
+              <w:bidi w:val="1"/>
+              <w:textDirection w:val="rl"/>
+            </w:pPr>
+            <w:r/>
+            <w:r>
+              <w:rPr>
+                <w:rFonts w:ascii="Amiri" w:hAnsi="Amiri" w:cs="Amiri" w:eastAsia="Amiri"/>
+                <w:b w:val="0"/>
+                <w:color w:val="232323"/>
+                <w:sz w:val="20"/>
+                <w:rtl w:val="1"/>
+              </w:rPr>
+              <w:t>‏باسم Omareyah International</w:t>
+            </w:r>
+          </w:p>
+        </w:tc>
+        <w:tc>
+          <w:tcPr>
+            <w:tcW w:type="dxa" w:w="2466"/>
+            <w:shd w:fill="F8F5F2" w:val="clear"/>
+            <w:tcBorders>
+              <w:top w:val="single" w:sz="8" w:color="B68A3A" w:space="0"/>
+              <w:left w:val="single" w:sz="8" w:color="B68A3A" w:space="0"/>
+              <w:bottom w:val="single" w:sz="8" w:color="B68A3A" w:space="0"/>
+              <w:right w:val="single" w:sz="8" w:color="B68A3A" w:space="0"/>
+            </w:tcBorders>
+          </w:tcPr>
+          <w:p>
+            <w:pPr>
+              <w:spacing w:before="40" w:after="40" w:line="288" w:lineRule="auto"/>
+              <w:jc w:val="right"/>
+              <w:bidi w:val="1"/>
+              <w:textDirection w:val="rl"/>
+            </w:pPr>
+            <w:r/>
+            <w:r>
+              <w:rPr>
+                <w:rFonts w:ascii="Amiri" w:hAnsi="Amiri" w:cs="Amiri" w:eastAsia="Amiri"/>
+                <w:b w:val="0"/>
+                <w:color w:val="232323"/>
+                <w:sz w:val="20"/>
+                <w:rtl w:val="1"/>
+              </w:rPr>
+              <w:t>‏فعاليات المسار الوطني</w:t>
+            </w:r>
+          </w:p>
+        </w:tc>
+        <w:tc>
+          <w:tcPr>
+            <w:tcW w:type="dxa" w:w="2466"/>
+            <w:shd w:fill="F8F5F2" w:val="clear"/>
+            <w:tcBorders>
+              <w:top w:val="single" w:sz="8" w:color="B68A3A" w:space="0"/>
+              <w:left w:val="single" w:sz="8" w:color="B68A3A" w:space="0"/>
+              <w:bottom w:val="single" w:sz="8" w:color="B68A3A" w:space="0"/>
+              <w:right w:val="single" w:sz="8" w:color="B68A3A" w:space="0"/>
+            </w:tcBorders>
+          </w:tcPr>
+          <w:p>
+            <w:pPr>
+              <w:spacing w:before="40" w:after="40" w:line="288" w:lineRule="auto"/>
+              <w:jc w:val="right"/>
+              <w:bidi w:val="1"/>
+              <w:textDirection w:val="rl"/>
+            </w:pPr>
+            <w:r/>
+            <w:r>
+              <w:rPr>
+                <w:rFonts w:ascii="Amiri" w:hAnsi="Amiri" w:cs="Amiri" w:eastAsia="Amiri"/>
+                <w:b w:val="0"/>
+                <w:color w:val="232323"/>
+                <w:sz w:val="20"/>
+                <w:rtl w:val="1"/>
+              </w:rPr>
+              <w:t>‏تقويم حملات غير مختلط</w:t>
+            </w:r>
+          </w:p>
+        </w:tc>
+      </w:tr>
+      <w:tr>
+        <w:tc>
+          <w:tcPr>
+            <w:tcW w:type="dxa" w:w="2466"/>
+            <w:shd w:fill="FFFFFF" w:val="clear"/>
+            <w:tcBorders>
+              <w:top w:val="single" w:sz="8" w:color="B68A3A" w:space="0"/>
+              <w:left w:val="single" w:sz="8" w:color="B68A3A" w:space="0"/>
+              <w:bottom w:val="single" w:sz="8" w:color="B68A3A" w:space="0"/>
+              <w:right w:val="single" w:sz="8" w:color="B68A3A" w:space="0"/>
+            </w:tcBorders>
+          </w:tcPr>
+          <w:p>
+            <w:pPr>
+              <w:spacing w:before="40" w:after="40" w:line="288" w:lineRule="auto"/>
+              <w:jc w:val="right"/>
+              <w:bidi w:val="1"/>
+              <w:textDirection w:val="rl"/>
+            </w:pPr>
+            <w:r/>
+            <w:r>
+              <w:rPr>
+                <w:rFonts w:ascii="Amiri" w:hAnsi="Amiri" w:cs="Amiri" w:eastAsia="Amiri"/>
+                <w:b w:val="0"/>
+                <w:color w:val="232323"/>
+                <w:sz w:val="20"/>
+                <w:rtl w:val="1"/>
+              </w:rPr>
+              <w:t>‏الزي/الشارات (إن وُجد)</w:t>
+            </w:r>
+          </w:p>
+        </w:tc>
+        <w:tc>
+          <w:tcPr>
+            <w:tcW w:type="dxa" w:w="2466"/>
+            <w:shd w:fill="FFFFFF" w:val="clear"/>
+            <w:tcBorders>
+              <w:top w:val="single" w:sz="8" w:color="B68A3A" w:space="0"/>
+              <w:left w:val="single" w:sz="8" w:color="B68A3A" w:space="0"/>
+              <w:bottom w:val="single" w:sz="8" w:color="B68A3A" w:space="0"/>
+              <w:right w:val="single" w:sz="8" w:color="B68A3A" w:space="0"/>
+            </w:tcBorders>
+          </w:tcPr>
+          <w:p>
+            <w:pPr>
+              <w:spacing w:before="40" w:after="40" w:line="288" w:lineRule="auto"/>
+              <w:jc w:val="right"/>
+              <w:bidi w:val="1"/>
+              <w:textDirection w:val="rl"/>
+            </w:pPr>
+            <w:r/>
+            <w:r>
+              <w:rPr>
+                <w:rFonts w:ascii="Amiri" w:hAnsi="Amiri" w:cs="Amiri" w:eastAsia="Amiri"/>
+                <w:b w:val="0"/>
+                <w:color w:val="232323"/>
+                <w:sz w:val="20"/>
+                <w:rtl w:val="1"/>
+              </w:rPr>
+              <w:t>‏تمييز بسيط وآمن</w:t>
+            </w:r>
+          </w:p>
+        </w:tc>
+        <w:tc>
+          <w:tcPr>
+            <w:tcW w:type="dxa" w:w="2466"/>
+            <w:shd w:fill="FFFFFF" w:val="clear"/>
+            <w:tcBorders>
+              <w:top w:val="single" w:sz="8" w:color="B68A3A" w:space="0"/>
+              <w:left w:val="single" w:sz="8" w:color="B68A3A" w:space="0"/>
+              <w:bottom w:val="single" w:sz="8" w:color="B68A3A" w:space="0"/>
+              <w:right w:val="single" w:sz="8" w:color="B68A3A" w:space="0"/>
+            </w:tcBorders>
+          </w:tcPr>
+          <w:p>
+            <w:pPr>
+              <w:spacing w:before="40" w:after="40" w:line="288" w:lineRule="auto"/>
+              <w:jc w:val="right"/>
+              <w:bidi w:val="1"/>
+              <w:textDirection w:val="rl"/>
+            </w:pPr>
+            <w:r/>
+            <w:r>
+              <w:rPr>
+                <w:rFonts w:ascii="Amiri" w:hAnsi="Amiri" w:cs="Amiri" w:eastAsia="Amiri"/>
+                <w:b w:val="0"/>
+                <w:color w:val="232323"/>
+                <w:sz w:val="20"/>
+                <w:rtl w:val="1"/>
+              </w:rPr>
+              <w:t>‏سياسة المسار الوطني</w:t>
+            </w:r>
+          </w:p>
+        </w:tc>
+        <w:tc>
+          <w:tcPr>
+            <w:tcW w:type="dxa" w:w="2466"/>
+            <w:shd w:fill="FFFFFF" w:val="clear"/>
+            <w:tcBorders>
+              <w:top w:val="single" w:sz="8" w:color="B68A3A" w:space="0"/>
+              <w:left w:val="single" w:sz="8" w:color="B68A3A" w:space="0"/>
+              <w:bottom w:val="single" w:sz="8" w:color="B68A3A" w:space="0"/>
+              <w:right w:val="single" w:sz="8" w:color="B68A3A" w:space="0"/>
+            </w:tcBorders>
+          </w:tcPr>
+          <w:p>
+            <w:pPr>
+              <w:spacing w:before="40" w:after="40" w:line="288" w:lineRule="auto"/>
+              <w:jc w:val="right"/>
+              <w:bidi w:val="1"/>
+              <w:textDirection w:val="rl"/>
+            </w:pPr>
+            <w:r/>
+            <w:r>
+              <w:rPr>
+                <w:rFonts w:ascii="Amiri" w:hAnsi="Amiri" w:cs="Amiri" w:eastAsia="Amiri"/>
+                <w:b w:val="0"/>
+                <w:color w:val="232323"/>
+                <w:sz w:val="20"/>
+                <w:rtl w:val="1"/>
+              </w:rPr>
+              <w:t>‏قرار مجلس قبل التطبيق</w:t>
+            </w:r>
+          </w:p>
+        </w:tc>
+      </w:tr>
+    </w:tbl>
+    <w:p/>
+    <w:p>
+      <w:pPr>
+        <w:spacing w:before="200" w:after="80" w:line="324" w:lineRule="auto"/>
+        <w:jc w:val="right"/>
+        <w:bidi w:val="1"/>
+        <w:textDirection w:val="rl"/>
+      </w:pPr>
+      <w:r>
+        <w:rPr>
+          <w:rFonts w:ascii="Amiri" w:hAnsi="Amiri" w:cs="Amiri" w:eastAsia="Amiri"/>
+          <w:b/>
+          <w:color w:val="B68A3A"/>
+          <w:sz w:val="25"/>
+          <w:rtl w:val="1"/>
+        </w:rPr>
+        <w:t>‏خطة التنفيذ المرحلية للفصل</w:t>
+      </w:r>
+    </w:p>
+    <w:tbl>
+      <w:tblPr>
+        <w:tblW w:type="auto" w:w="0"/>
+        <w:jc w:val="center"/>
+        <w:tblLook w:firstColumn="1" w:firstRow="1" w:lastColumn="0" w:lastRow="0" w:noHBand="0" w:noVBand="1" w:val="04A0"/>
+        <w:bidiVisual w:val="1"/>
+      </w:tblPr>
+      <w:tblGrid>
+        <w:gridCol w:w="2466"/>
+        <w:gridCol w:w="2466"/>
+        <w:gridCol w:w="2466"/>
+        <w:gridCol w:w="2466"/>
+      </w:tblGrid>
+      <w:tr>
+        <w:tc>
+          <w:tcPr>
+            <w:tcW w:type="dxa" w:w="2466"/>
+            <w:shd w:fill="8B1E2D" w:val="clear"/>
+            <w:tcBorders>
+              <w:top w:val="single" w:sz="8" w:color="8B1E2D" w:space="0"/>
+              <w:left w:val="single" w:sz="8" w:color="8B1E2D" w:space="0"/>
+              <w:bottom w:val="single" w:sz="8" w:color="8B1E2D" w:space="0"/>
+              <w:right w:val="single" w:sz="8" w:color="8B1E2D" w:space="0"/>
+            </w:tcBorders>
+          </w:tcPr>
+          <w:p>
+            <w:pPr>
+              <w:spacing w:before="40" w:after="40" w:line="288" w:lineRule="auto"/>
+              <w:jc w:val="right"/>
+              <w:bidi w:val="1"/>
+              <w:textDirection w:val="rl"/>
+            </w:pPr>
+            <w:r/>
+            <w:r>
+              <w:rPr>
+                <w:rFonts w:ascii="Amiri" w:hAnsi="Amiri" w:cs="Amiri" w:eastAsia="Amiri"/>
+                <w:b/>
+                <w:color w:val="FFFFFF"/>
+                <w:sz w:val="21"/>
+                <w:rtl w:val="1"/>
+              </w:rPr>
+              <w:t>‏المرحلة</w:t>
+            </w:r>
+          </w:p>
+        </w:tc>
+        <w:tc>
+          <w:tcPr>
+            <w:tcW w:type="dxa" w:w="2466"/>
+            <w:shd w:fill="8B1E2D" w:val="clear"/>
+            <w:tcBorders>
+              <w:top w:val="single" w:sz="8" w:color="8B1E2D" w:space="0"/>
+              <w:left w:val="single" w:sz="8" w:color="8B1E2D" w:space="0"/>
+              <w:bottom w:val="single" w:sz="8" w:color="8B1E2D" w:space="0"/>
+              <w:right w:val="single" w:sz="8" w:color="8B1E2D" w:space="0"/>
+            </w:tcBorders>
+          </w:tcPr>
+          <w:p>
+            <w:pPr>
+              <w:spacing w:before="40" w:after="40" w:line="288" w:lineRule="auto"/>
+              <w:jc w:val="right"/>
+              <w:bidi w:val="1"/>
+              <w:textDirection w:val="rl"/>
+            </w:pPr>
+            <w:r/>
+            <w:r>
+              <w:rPr>
+                <w:rFonts w:ascii="Amiri" w:hAnsi="Amiri" w:cs="Amiri" w:eastAsia="Amiri"/>
+                <w:b/>
+                <w:color w:val="FFFFFF"/>
+                <w:sz w:val="21"/>
+                <w:rtl w:val="1"/>
+              </w:rPr>
+              <w:t>‏الأعمال</w:t>
+            </w:r>
+          </w:p>
+        </w:tc>
+        <w:tc>
+          <w:tcPr>
+            <w:tcW w:type="dxa" w:w="2466"/>
+            <w:shd w:fill="8B1E2D" w:val="clear"/>
+            <w:tcBorders>
+              <w:top w:val="single" w:sz="8" w:color="8B1E2D" w:space="0"/>
+              <w:left w:val="single" w:sz="8" w:color="8B1E2D" w:space="0"/>
+              <w:bottom w:val="single" w:sz="8" w:color="8B1E2D" w:space="0"/>
+              <w:right w:val="single" w:sz="8" w:color="8B1E2D" w:space="0"/>
+            </w:tcBorders>
+          </w:tcPr>
+          <w:p>
+            <w:pPr>
+              <w:spacing w:before="40" w:after="40" w:line="288" w:lineRule="auto"/>
+              <w:jc w:val="right"/>
+              <w:bidi w:val="1"/>
+              <w:textDirection w:val="rl"/>
+            </w:pPr>
+            <w:r/>
+            <w:r>
+              <w:rPr>
+                <w:rFonts w:ascii="Amiri" w:hAnsi="Amiri" w:cs="Amiri" w:eastAsia="Amiri"/>
+                <w:b/>
+                <w:color w:val="FFFFFF"/>
+                <w:sz w:val="21"/>
+                <w:rtl w:val="1"/>
+              </w:rPr>
+              <w:t>‏المخرج</w:t>
+            </w:r>
+          </w:p>
+        </w:tc>
+        <w:tc>
+          <w:tcPr>
+            <w:tcW w:type="dxa" w:w="2466"/>
+            <w:shd w:fill="8B1E2D" w:val="clear"/>
+            <w:tcBorders>
+              <w:top w:val="single" w:sz="8" w:color="8B1E2D" w:space="0"/>
+              <w:left w:val="single" w:sz="8" w:color="8B1E2D" w:space="0"/>
+              <w:bottom w:val="single" w:sz="8" w:color="8B1E2D" w:space="0"/>
+              <w:right w:val="single" w:sz="8" w:color="8B1E2D" w:space="0"/>
+            </w:tcBorders>
+          </w:tcPr>
+          <w:p>
+            <w:pPr>
+              <w:spacing w:before="40" w:after="40" w:line="288" w:lineRule="auto"/>
+              <w:jc w:val="right"/>
+              <w:bidi w:val="1"/>
+              <w:textDirection w:val="rl"/>
+            </w:pPr>
+            <w:r/>
+            <w:r>
+              <w:rPr>
+                <w:rFonts w:ascii="Amiri" w:hAnsi="Amiri" w:cs="Amiri" w:eastAsia="Amiri"/>
+                <w:b/>
+                <w:color w:val="FFFFFF"/>
+                <w:sz w:val="21"/>
+                <w:rtl w:val="1"/>
+              </w:rPr>
+              <w:t>‏مؤشر</w:t>
+            </w:r>
+          </w:p>
+        </w:tc>
+      </w:tr>
+      <w:tr>
+        <w:tc>
+          <w:tcPr>
+            <w:tcW w:type="dxa" w:w="2466"/>
+            <w:shd w:fill="F8F5F2" w:val="clear"/>
+            <w:tcBorders>
+              <w:top w:val="single" w:sz="8" w:color="B68A3A" w:space="0"/>
+              <w:left w:val="single" w:sz="8" w:color="B68A3A" w:space="0"/>
+              <w:bottom w:val="single" w:sz="8" w:color="B68A3A" w:space="0"/>
+              <w:right w:val="single" w:sz="8" w:color="B68A3A" w:space="0"/>
+            </w:tcBorders>
+          </w:tcPr>
+          <w:p>
+            <w:pPr>
+              <w:spacing w:before="40" w:after="40" w:line="288" w:lineRule="auto"/>
+              <w:jc w:val="right"/>
+              <w:bidi w:val="1"/>
+              <w:textDirection w:val="rl"/>
+            </w:pPr>
+            <w:r/>
+            <w:r>
+              <w:rPr>
+                <w:rFonts w:ascii="Amiri" w:hAnsi="Amiri" w:cs="Amiri" w:eastAsia="Amiri"/>
+                <w:b w:val="0"/>
+                <w:color w:val="232323"/>
+                <w:sz w:val="20"/>
+                <w:rtl w:val="1"/>
+              </w:rPr>
+              <w:t>‏الأيام 1–30</w:t>
+            </w:r>
+          </w:p>
+        </w:tc>
+        <w:tc>
+          <w:tcPr>
+            <w:tcW w:type="dxa" w:w="2466"/>
+            <w:shd w:fill="F8F5F2" w:val="clear"/>
+            <w:tcBorders>
+              <w:top w:val="single" w:sz="8" w:color="B68A3A" w:space="0"/>
+              <w:left w:val="single" w:sz="8" w:color="B68A3A" w:space="0"/>
+              <w:bottom w:val="single" w:sz="8" w:color="B68A3A" w:space="0"/>
+              <w:right w:val="single" w:sz="8" w:color="B68A3A" w:space="0"/>
+            </w:tcBorders>
+          </w:tcPr>
+          <w:p>
+            <w:pPr>
+              <w:spacing w:before="40" w:after="40" w:line="288" w:lineRule="auto"/>
+              <w:jc w:val="right"/>
+              <w:bidi w:val="1"/>
+              <w:textDirection w:val="rl"/>
+            </w:pPr>
+            <w:r/>
+            <w:r>
+              <w:rPr>
+                <w:rFonts w:ascii="Amiri" w:hAnsi="Amiri" w:cs="Amiri" w:eastAsia="Amiri"/>
+                <w:b w:val="0"/>
+                <w:color w:val="232323"/>
+                <w:sz w:val="20"/>
+                <w:rtl w:val="1"/>
+              </w:rPr>
+              <w:t>‏تدقيق اختلاط الهوية الحالي (مطبوعات، لافتات، رقمي، قبول)</w:t>
+            </w:r>
+          </w:p>
+        </w:tc>
+        <w:tc>
+          <w:tcPr>
+            <w:tcW w:type="dxa" w:w="2466"/>
+            <w:shd w:fill="F8F5F2" w:val="clear"/>
+            <w:tcBorders>
+              <w:top w:val="single" w:sz="8" w:color="B68A3A" w:space="0"/>
+              <w:left w:val="single" w:sz="8" w:color="B68A3A" w:space="0"/>
+              <w:bottom w:val="single" w:sz="8" w:color="B68A3A" w:space="0"/>
+              <w:right w:val="single" w:sz="8" w:color="B68A3A" w:space="0"/>
+            </w:tcBorders>
+          </w:tcPr>
+          <w:p>
+            <w:pPr>
+              <w:spacing w:before="40" w:after="40" w:line="288" w:lineRule="auto"/>
+              <w:jc w:val="right"/>
+              <w:bidi w:val="1"/>
+              <w:textDirection w:val="rl"/>
+            </w:pPr>
+            <w:r/>
+            <w:r>
+              <w:rPr>
+                <w:rFonts w:ascii="Amiri" w:hAnsi="Amiri" w:cs="Amiri" w:eastAsia="Amiri"/>
+                <w:b w:val="0"/>
+                <w:color w:val="232323"/>
+                <w:sz w:val="20"/>
+                <w:rtl w:val="1"/>
+              </w:rPr>
+              <w:t>‏خريطة فجوات</w:t>
+            </w:r>
+          </w:p>
+        </w:tc>
+        <w:tc>
+          <w:tcPr>
+            <w:tcW w:type="dxa" w:w="2466"/>
+            <w:shd w:fill="F8F5F2" w:val="clear"/>
+            <w:tcBorders>
+              <w:top w:val="single" w:sz="8" w:color="B68A3A" w:space="0"/>
+              <w:left w:val="single" w:sz="8" w:color="B68A3A" w:space="0"/>
+              <w:bottom w:val="single" w:sz="8" w:color="B68A3A" w:space="0"/>
+              <w:right w:val="single" w:sz="8" w:color="B68A3A" w:space="0"/>
+            </w:tcBorders>
+          </w:tcPr>
+          <w:p>
+            <w:pPr>
+              <w:spacing w:before="40" w:after="40" w:line="288" w:lineRule="auto"/>
+              <w:jc w:val="right"/>
+              <w:bidi w:val="1"/>
+              <w:textDirection w:val="rl"/>
+            </w:pPr>
+            <w:r/>
+            <w:r>
+              <w:rPr>
+                <w:rFonts w:ascii="Amiri" w:hAnsi="Amiri" w:cs="Amiri" w:eastAsia="Amiri"/>
+                <w:b w:val="0"/>
+                <w:color w:val="232323"/>
+                <w:sz w:val="20"/>
+                <w:rtl w:val="1"/>
+              </w:rPr>
+              <w:t>‏اكتمال التدقيق</w:t>
+            </w:r>
+          </w:p>
+        </w:tc>
+      </w:tr>
+      <w:tr>
+        <w:tc>
+          <w:tcPr>
+            <w:tcW w:type="dxa" w:w="2466"/>
+            <w:shd w:fill="FFFFFF" w:val="clear"/>
+            <w:tcBorders>
+              <w:top w:val="single" w:sz="8" w:color="B68A3A" w:space="0"/>
+              <w:left w:val="single" w:sz="8" w:color="B68A3A" w:space="0"/>
+              <w:bottom w:val="single" w:sz="8" w:color="B68A3A" w:space="0"/>
+              <w:right w:val="single" w:sz="8" w:color="B68A3A" w:space="0"/>
+            </w:tcBorders>
+          </w:tcPr>
+          <w:p>
+            <w:pPr>
+              <w:spacing w:before="40" w:after="40" w:line="288" w:lineRule="auto"/>
+              <w:jc w:val="right"/>
+              <w:bidi w:val="1"/>
+              <w:textDirection w:val="rl"/>
+            </w:pPr>
+            <w:r/>
+            <w:r>
+              <w:rPr>
+                <w:rFonts w:ascii="Amiri" w:hAnsi="Amiri" w:cs="Amiri" w:eastAsia="Amiri"/>
+                <w:b w:val="0"/>
+                <w:color w:val="232323"/>
+                <w:sz w:val="20"/>
+                <w:rtl w:val="1"/>
+              </w:rPr>
+              <w:t>‏الأيام 31–100</w:t>
+            </w:r>
+          </w:p>
+        </w:tc>
+        <w:tc>
+          <w:tcPr>
+            <w:tcW w:type="dxa" w:w="2466"/>
+            <w:shd w:fill="FFFFFF" w:val="clear"/>
+            <w:tcBorders>
+              <w:top w:val="single" w:sz="8" w:color="B68A3A" w:space="0"/>
+              <w:left w:val="single" w:sz="8" w:color="B68A3A" w:space="0"/>
+              <w:bottom w:val="single" w:sz="8" w:color="B68A3A" w:space="0"/>
+              <w:right w:val="single" w:sz="8" w:color="B68A3A" w:space="0"/>
+            </w:tcBorders>
+          </w:tcPr>
+          <w:p>
+            <w:pPr>
+              <w:spacing w:before="40" w:after="40" w:line="288" w:lineRule="auto"/>
+              <w:jc w:val="right"/>
+              <w:bidi w:val="1"/>
+              <w:textDirection w:val="rl"/>
+            </w:pPr>
+            <w:r/>
+            <w:r>
+              <w:rPr>
+                <w:rFonts w:ascii="Amiri" w:hAnsi="Amiri" w:cs="Amiri" w:eastAsia="Amiri"/>
+                <w:b w:val="0"/>
+                <w:color w:val="232323"/>
+                <w:sz w:val="20"/>
+                <w:rtl w:val="1"/>
+              </w:rPr>
+              <w:t>‏إطلاق الحد الأدنى: دليل هوية مختصر + قوالب ترويسة/قبول/رسائل</w:t>
+            </w:r>
+          </w:p>
+        </w:tc>
+        <w:tc>
+          <w:tcPr>
+            <w:tcW w:type="dxa" w:w="2466"/>
+            <w:shd w:fill="FFFFFF" w:val="clear"/>
+            <w:tcBorders>
+              <w:top w:val="single" w:sz="8" w:color="B68A3A" w:space="0"/>
+              <w:left w:val="single" w:sz="8" w:color="B68A3A" w:space="0"/>
+              <w:bottom w:val="single" w:sz="8" w:color="B68A3A" w:space="0"/>
+              <w:right w:val="single" w:sz="8" w:color="B68A3A" w:space="0"/>
+            </w:tcBorders>
+          </w:tcPr>
+          <w:p>
+            <w:pPr>
+              <w:spacing w:before="40" w:after="40" w:line="288" w:lineRule="auto"/>
+              <w:jc w:val="right"/>
+              <w:bidi w:val="1"/>
+              <w:textDirection w:val="rl"/>
+            </w:pPr>
+            <w:r/>
+            <w:r>
+              <w:rPr>
+                <w:rFonts w:ascii="Amiri" w:hAnsi="Amiri" w:cs="Amiri" w:eastAsia="Amiri"/>
+                <w:b w:val="0"/>
+                <w:color w:val="232323"/>
+                <w:sz w:val="20"/>
+                <w:rtl w:val="1"/>
+              </w:rPr>
+              <w:t>‏دليل + حزمة قوالب</w:t>
+            </w:r>
+          </w:p>
+        </w:tc>
+        <w:tc>
+          <w:tcPr>
+            <w:tcW w:type="dxa" w:w="2466"/>
+            <w:shd w:fill="FFFFFF" w:val="clear"/>
+            <w:tcBorders>
+              <w:top w:val="single" w:sz="8" w:color="B68A3A" w:space="0"/>
+              <w:left w:val="single" w:sz="8" w:color="B68A3A" w:space="0"/>
+              <w:bottom w:val="single" w:sz="8" w:color="B68A3A" w:space="0"/>
+              <w:right w:val="single" w:sz="8" w:color="B68A3A" w:space="0"/>
+            </w:tcBorders>
+          </w:tcPr>
+          <w:p>
+            <w:pPr>
+              <w:spacing w:before="40" w:after="40" w:line="288" w:lineRule="auto"/>
+              <w:jc w:val="right"/>
+              <w:bidi w:val="1"/>
+              <w:textDirection w:val="rl"/>
+            </w:pPr>
+            <w:r/>
+            <w:r>
+              <w:rPr>
+                <w:rFonts w:ascii="Amiri" w:hAnsi="Amiri" w:cs="Amiri" w:eastAsia="Amiri"/>
+                <w:b w:val="0"/>
+                <w:color w:val="232323"/>
+                <w:sz w:val="20"/>
+                <w:rtl w:val="1"/>
+              </w:rPr>
+              <w:t>‏% القوالب المفعّلة</w:t>
+            </w:r>
+          </w:p>
+        </w:tc>
+      </w:tr>
+      <w:tr>
+        <w:tc>
+          <w:tcPr>
+            <w:tcW w:type="dxa" w:w="2466"/>
+            <w:shd w:fill="F8F5F2" w:val="clear"/>
+            <w:tcBorders>
+              <w:top w:val="single" w:sz="8" w:color="B68A3A" w:space="0"/>
+              <w:left w:val="single" w:sz="8" w:color="B68A3A" w:space="0"/>
+              <w:bottom w:val="single" w:sz="8" w:color="B68A3A" w:space="0"/>
+              <w:right w:val="single" w:sz="8" w:color="B68A3A" w:space="0"/>
+            </w:tcBorders>
+          </w:tcPr>
+          <w:p>
+            <w:pPr>
+              <w:spacing w:before="40" w:after="40" w:line="288" w:lineRule="auto"/>
+              <w:jc w:val="right"/>
+              <w:bidi w:val="1"/>
+              <w:textDirection w:val="rl"/>
+            </w:pPr>
+            <w:r/>
+            <w:r>
+              <w:rPr>
+                <w:rFonts w:ascii="Amiri" w:hAnsi="Amiri" w:cs="Amiri" w:eastAsia="Amiri"/>
+                <w:b w:val="0"/>
+                <w:color w:val="232323"/>
+                <w:sz w:val="20"/>
+                <w:rtl w:val="1"/>
+              </w:rPr>
+              <w:t>‏الشهور 4–8</w:t>
+            </w:r>
+          </w:p>
+        </w:tc>
+        <w:tc>
+          <w:tcPr>
+            <w:tcW w:type="dxa" w:w="2466"/>
+            <w:shd w:fill="F8F5F2" w:val="clear"/>
+            <w:tcBorders>
+              <w:top w:val="single" w:sz="8" w:color="B68A3A" w:space="0"/>
+              <w:left w:val="single" w:sz="8" w:color="B68A3A" w:space="0"/>
+              <w:bottom w:val="single" w:sz="8" w:color="B68A3A" w:space="0"/>
+              <w:right w:val="single" w:sz="8" w:color="B68A3A" w:space="0"/>
+            </w:tcBorders>
+          </w:tcPr>
+          <w:p>
+            <w:pPr>
+              <w:spacing w:before="40" w:after="40" w:line="288" w:lineRule="auto"/>
+              <w:jc w:val="right"/>
+              <w:bidi w:val="1"/>
+              <w:textDirection w:val="rl"/>
+            </w:pPr>
+            <w:r/>
+            <w:r>
+              <w:rPr>
+                <w:rFonts w:ascii="Amiri" w:hAnsi="Amiri" w:cs="Amiri" w:eastAsia="Amiri"/>
+                <w:b w:val="0"/>
+                <w:color w:val="232323"/>
+                <w:sz w:val="20"/>
+                <w:rtl w:val="1"/>
+              </w:rPr>
+              <w:t>‏تطبيق على اللافتات ونقاط التماس الأسرية والمنصات</w:t>
+            </w:r>
+          </w:p>
+        </w:tc>
+        <w:tc>
+          <w:tcPr>
+            <w:tcW w:type="dxa" w:w="2466"/>
+            <w:shd w:fill="F8F5F2" w:val="clear"/>
+            <w:tcBorders>
+              <w:top w:val="single" w:sz="8" w:color="B68A3A" w:space="0"/>
+              <w:left w:val="single" w:sz="8" w:color="B68A3A" w:space="0"/>
+              <w:bottom w:val="single" w:sz="8" w:color="B68A3A" w:space="0"/>
+              <w:right w:val="single" w:sz="8" w:color="B68A3A" w:space="0"/>
+            </w:tcBorders>
+          </w:tcPr>
+          <w:p>
+            <w:pPr>
+              <w:spacing w:before="40" w:after="40" w:line="288" w:lineRule="auto"/>
+              <w:jc w:val="right"/>
+              <w:bidi w:val="1"/>
+              <w:textDirection w:val="rl"/>
+            </w:pPr>
+            <w:r/>
+            <w:r>
+              <w:rPr>
+                <w:rFonts w:ascii="Amiri" w:hAnsi="Amiri" w:cs="Amiri" w:eastAsia="Amiri"/>
+                <w:b w:val="0"/>
+                <w:color w:val="232323"/>
+                <w:sz w:val="20"/>
+                <w:rtl w:val="1"/>
+              </w:rPr>
+              <w:t>‏بيئة بصرية أوضح</w:t>
+            </w:r>
+          </w:p>
+        </w:tc>
+        <w:tc>
+          <w:tcPr>
+            <w:tcW w:type="dxa" w:w="2466"/>
+            <w:shd w:fill="F8F5F2" w:val="clear"/>
+            <w:tcBorders>
+              <w:top w:val="single" w:sz="8" w:color="B68A3A" w:space="0"/>
+              <w:left w:val="single" w:sz="8" w:color="B68A3A" w:space="0"/>
+              <w:bottom w:val="single" w:sz="8" w:color="B68A3A" w:space="0"/>
+              <w:right w:val="single" w:sz="8" w:color="B68A3A" w:space="0"/>
+            </w:tcBorders>
+          </w:tcPr>
+          <w:p>
+            <w:pPr>
+              <w:spacing w:before="40" w:after="40" w:line="288" w:lineRule="auto"/>
+              <w:jc w:val="right"/>
+              <w:bidi w:val="1"/>
+              <w:textDirection w:val="rl"/>
+            </w:pPr>
+            <w:r/>
+            <w:r>
+              <w:rPr>
+                <w:rFonts w:ascii="Amiri" w:hAnsi="Amiri" w:cs="Amiri" w:eastAsia="Amiri"/>
+                <w:b w:val="0"/>
+                <w:color w:val="232323"/>
+                <w:sz w:val="20"/>
+                <w:rtl w:val="1"/>
+              </w:rPr>
+              <w:t>‏≥80% نقاط تماس مفصولة</w:t>
+            </w:r>
+          </w:p>
+        </w:tc>
+      </w:tr>
+      <w:tr>
+        <w:tc>
+          <w:tcPr>
+            <w:tcW w:type="dxa" w:w="2466"/>
+            <w:shd w:fill="FFFFFF" w:val="clear"/>
+            <w:tcBorders>
+              <w:top w:val="single" w:sz="8" w:color="B68A3A" w:space="0"/>
+              <w:left w:val="single" w:sz="8" w:color="B68A3A" w:space="0"/>
+              <w:bottom w:val="single" w:sz="8" w:color="B68A3A" w:space="0"/>
+              <w:right w:val="single" w:sz="8" w:color="B68A3A" w:space="0"/>
+            </w:tcBorders>
+          </w:tcPr>
+          <w:p>
+            <w:pPr>
+              <w:spacing w:before="40" w:after="40" w:line="288" w:lineRule="auto"/>
+              <w:jc w:val="right"/>
+              <w:bidi w:val="1"/>
+              <w:textDirection w:val="rl"/>
+            </w:pPr>
+            <w:r/>
+            <w:r>
+              <w:rPr>
+                <w:rFonts w:ascii="Amiri" w:hAnsi="Amiri" w:cs="Amiri" w:eastAsia="Amiri"/>
+                <w:b w:val="0"/>
+                <w:color w:val="232323"/>
+                <w:sz w:val="20"/>
+                <w:rtl w:val="1"/>
+              </w:rPr>
+              <w:t>‏نهاية السنة 1</w:t>
+            </w:r>
+          </w:p>
+        </w:tc>
+        <w:tc>
+          <w:tcPr>
+            <w:tcW w:type="dxa" w:w="2466"/>
+            <w:shd w:fill="FFFFFF" w:val="clear"/>
+            <w:tcBorders>
+              <w:top w:val="single" w:sz="8" w:color="B68A3A" w:space="0"/>
+              <w:left w:val="single" w:sz="8" w:color="B68A3A" w:space="0"/>
+              <w:bottom w:val="single" w:sz="8" w:color="B68A3A" w:space="0"/>
+              <w:right w:val="single" w:sz="8" w:color="B68A3A" w:space="0"/>
+            </w:tcBorders>
+          </w:tcPr>
+          <w:p>
+            <w:pPr>
+              <w:spacing w:before="40" w:after="40" w:line="288" w:lineRule="auto"/>
+              <w:jc w:val="right"/>
+              <w:bidi w:val="1"/>
+              <w:textDirection w:val="rl"/>
+            </w:pPr>
+            <w:r/>
+            <w:r>
+              <w:rPr>
+                <w:rFonts w:ascii="Amiri" w:hAnsi="Amiri" w:cs="Amiri" w:eastAsia="Amiri"/>
+                <w:b w:val="0"/>
+                <w:color w:val="232323"/>
+                <w:sz w:val="20"/>
+                <w:rtl w:val="1"/>
+              </w:rPr>
+              <w:t>‏مراجعة أثر الفصل على وضوح التموضع ورضا الفهم الأسري</w:t>
+            </w:r>
+          </w:p>
+        </w:tc>
+        <w:tc>
+          <w:tcPr>
+            <w:tcW w:type="dxa" w:w="2466"/>
+            <w:shd w:fill="FFFFFF" w:val="clear"/>
+            <w:tcBorders>
+              <w:top w:val="single" w:sz="8" w:color="B68A3A" w:space="0"/>
+              <w:left w:val="single" w:sz="8" w:color="B68A3A" w:space="0"/>
+              <w:bottom w:val="single" w:sz="8" w:color="B68A3A" w:space="0"/>
+              <w:right w:val="single" w:sz="8" w:color="B68A3A" w:space="0"/>
+            </w:tcBorders>
+          </w:tcPr>
+          <w:p>
+            <w:pPr>
+              <w:spacing w:before="40" w:after="40" w:line="288" w:lineRule="auto"/>
+              <w:jc w:val="right"/>
+              <w:bidi w:val="1"/>
+              <w:textDirection w:val="rl"/>
+            </w:pPr>
+            <w:r/>
+            <w:r>
+              <w:rPr>
+                <w:rFonts w:ascii="Amiri" w:hAnsi="Amiri" w:cs="Amiri" w:eastAsia="Amiri"/>
+                <w:b w:val="0"/>
+                <w:color w:val="232323"/>
+                <w:sz w:val="20"/>
+                <w:rtl w:val="1"/>
+              </w:rPr>
+              <w:t>‏تقرير هوية للمجلس</w:t>
+            </w:r>
+          </w:p>
+        </w:tc>
+        <w:tc>
+          <w:tcPr>
+            <w:tcW w:type="dxa" w:w="2466"/>
+            <w:shd w:fill="FFFFFF" w:val="clear"/>
+            <w:tcBorders>
+              <w:top w:val="single" w:sz="8" w:color="B68A3A" w:space="0"/>
+              <w:left w:val="single" w:sz="8" w:color="B68A3A" w:space="0"/>
+              <w:bottom w:val="single" w:sz="8" w:color="B68A3A" w:space="0"/>
+              <w:right w:val="single" w:sz="8" w:color="B68A3A" w:space="0"/>
+            </w:tcBorders>
+          </w:tcPr>
+          <w:p>
+            <w:pPr>
+              <w:spacing w:before="40" w:after="40" w:line="288" w:lineRule="auto"/>
+              <w:jc w:val="right"/>
+              <w:bidi w:val="1"/>
+              <w:textDirection w:val="rl"/>
+            </w:pPr>
+            <w:r/>
+            <w:r>
+              <w:rPr>
+                <w:rFonts w:ascii="Amiri" w:hAnsi="Amiri" w:cs="Amiri" w:eastAsia="Amiri"/>
+                <w:b w:val="0"/>
+                <w:color w:val="232323"/>
+                <w:sz w:val="20"/>
+                <w:rtl w:val="1"/>
+              </w:rPr>
+              <w:t>‏تحسن بند «وضوح البرنامج»</w:t>
+            </w:r>
+          </w:p>
+        </w:tc>
+      </w:tr>
+    </w:tbl>
+    <w:p/>
+    <w:tbl>
+      <w:tblPr>
+        <w:tblW w:type="auto" w:w="0"/>
+        <w:tblLook w:firstColumn="1" w:firstRow="1" w:lastColumn="0" w:lastRow="0" w:noHBand="0" w:noVBand="1" w:val="04A0"/>
+        <w:bidiVisual w:val="1"/>
+      </w:tblPr>
+      <w:tblGrid>
+        <w:gridCol w:w="9866"/>
+      </w:tblGrid>
+      <w:tr>
+        <w:tc>
+          <w:tcPr>
+            <w:tcW w:type="dxa" w:w="9866"/>
+            <w:shd w:fill="F4F0EC" w:val="clear"/>
+            <w:tcBorders>
+              <w:top w:val="single" w:sz="12" w:color="B68A3A" w:space="0"/>
+              <w:left w:val="single" w:sz="12" w:color="B68A3A" w:space="0"/>
+              <w:bottom w:val="single" w:sz="12" w:color="B68A3A" w:space="0"/>
+              <w:right w:val="single" w:sz="12" w:color="B68A3A" w:space="0"/>
+            </w:tcBorders>
+          </w:tcPr>
+          <w:p>
+            <w:pPr>
+              <w:spacing w:before="80" w:after="80" w:line="300" w:lineRule="auto"/>
+              <w:jc w:val="right"/>
+              <w:bidi w:val="1"/>
+              <w:textDirection w:val="rl"/>
+            </w:pPr>
+            <w:r/>
+            <w:r>
+              <w:rPr>
+                <w:rFonts w:ascii="Amiri" w:hAnsi="Amiri" w:cs="Amiri" w:eastAsia="Amiri"/>
+                <w:b/>
+                <w:color w:val="8B1E2D"/>
+                <w:sz w:val="23"/>
+                <w:rtl w:val="1"/>
+              </w:rPr>
+              <w:t>‏ضوابط مهمة</w:t>
+            </w:r>
+          </w:p>
+          <w:p>
+            <w:pPr>
+              <w:spacing w:before="20" w:after="40" w:line="300" w:lineRule="auto"/>
+              <w:jc w:val="right"/>
+              <w:bidi w:val="1"/>
+              <w:textDirection w:val="rl"/>
+            </w:pPr>
+            <w:r>
+              <w:rPr>
+                <w:rFonts w:ascii="Amiri" w:hAnsi="Amiri" w:cs="Amiri" w:eastAsia="Amiri"/>
+                <w:b w:val="0"/>
+                <w:color w:val="232323"/>
+                <w:sz w:val="21"/>
+                <w:rtl w:val="1"/>
+              </w:rPr>
+              <w:t>‏• الفصل تقريبي ومرحلي — لا يُطلب هدم كامل للهوية المشتركة للمؤسسة الأم دفعة واحدة.</w:t>
+            </w:r>
+          </w:p>
+          <w:p>
+            <w:pPr>
+              <w:spacing w:before="20" w:after="40" w:line="300" w:lineRule="auto"/>
+              <w:jc w:val="right"/>
+              <w:bidi w:val="1"/>
+              <w:textDirection w:val="rl"/>
+            </w:pPr>
+            <w:r>
+              <w:rPr>
+                <w:rFonts w:ascii="Amiri" w:hAnsi="Amiri" w:cs="Amiri" w:eastAsia="Amiri"/>
+                <w:b w:val="0"/>
+                <w:color w:val="232323"/>
+                <w:sz w:val="21"/>
+                <w:rtl w:val="1"/>
+              </w:rPr>
+              <w:t>‏• أي تمييز بالزي أو الرموز يخضع لقرار إداري/مجلس ويُنفَّذ بحساسية اجتماعية.</w:t>
+            </w:r>
+          </w:p>
+          <w:p>
+            <w:pPr>
+              <w:spacing w:before="20" w:after="40" w:line="300" w:lineRule="auto"/>
+              <w:jc w:val="right"/>
+              <w:bidi w:val="1"/>
+              <w:textDirection w:val="rl"/>
+            </w:pPr>
+            <w:r>
+              <w:rPr>
+                <w:rFonts w:ascii="Amiri" w:hAnsi="Amiri" w:cs="Amiri" w:eastAsia="Amiri"/>
+                <w:b w:val="0"/>
+                <w:color w:val="232323"/>
+                <w:sz w:val="21"/>
+                <w:rtl w:val="1"/>
+              </w:rPr>
+              <w:t>‏• Success 4 Sure قد تدعم التنفيذ التصميمي والتشغيلي، لكن الواجهة الأسرية تبقى باسم العمريّة الدولية.</w:t>
+            </w:r>
+          </w:p>
+        </w:tc>
+      </w:tr>
+    </w:tbl>
+    <w:p/>
+    <w:p>
+      <w:pPr>
+        <w:spacing w:before="280" w:after="80" w:line="324" w:lineRule="auto"/>
+        <w:jc w:val="right"/>
+        <w:bidi w:val="1"/>
+        <w:textDirection w:val="rl"/>
+      </w:pPr>
+      <w:r>
+        <w:rPr>
+          <w:rFonts w:ascii="Amiri" w:hAnsi="Amiri" w:cs="Amiri" w:eastAsia="Amiri"/>
+          <w:b/>
+          <w:color w:val="8B1E2D"/>
+          <w:sz w:val="30"/>
+          <w:rtl w:val="1"/>
+        </w:rPr>
         <w:t>‏7. الدعم الاستراتيجي من Success 4 Sure</w:t>
       </w:r>
     </w:p>
@@ -6698,7 +9159,7 @@
         <w:drawing>
           <wp:inline xmlns:a="http://schemas.openxmlformats.org/drawingml/2006/main" xmlns:pic="http://schemas.openxmlformats.org/drawingml/2006/picture">
             <wp:extent cx="5806440" cy="2931965"/>
-            <wp:docPr id="2" name="Picture 2"/>
+            <wp:docPr id="4" name="Picture 4"/>
             <wp:cNvGraphicFramePr>
               <a:graphicFrameLocks noChangeAspect="1"/>
             </wp:cNvGraphicFramePr>
@@ -6710,7 +9171,7 @@
                     <pic:cNvPicPr/>
                   </pic:nvPicPr>
                   <pic:blipFill>
-                    <a:blip r:embed="rId11"/>
+                    <a:blip r:embed="rId14"/>
                     <a:stretch>
                       <a:fillRect/>
                     </a:stretch>
@@ -6845,7 +9306,7 @@
         <w:drawing>
           <wp:inline xmlns:a="http://schemas.openxmlformats.org/drawingml/2006/main" xmlns:pic="http://schemas.openxmlformats.org/drawingml/2006/picture">
             <wp:extent cx="5760720" cy="1539994"/>
-            <wp:docPr id="3" name="Picture 3"/>
+            <wp:docPr id="5" name="Picture 5"/>
             <wp:cNvGraphicFramePr>
               <a:graphicFrameLocks noChangeAspect="1"/>
             </wp:cNvGraphicFramePr>
@@ -6857,7 +9318,7 @@
                     <pic:cNvPicPr/>
                   </pic:nvPicPr>
                   <pic:blipFill>
-                    <a:blip r:embed="rId12"/>
+                    <a:blip r:embed="rId15"/>
                     <a:stretch>
                       <a:fillRect/>
                     </a:stretch>
@@ -9929,7 +12390,7 @@
         <w:drawing>
           <wp:inline xmlns:a="http://schemas.openxmlformats.org/drawingml/2006/main" xmlns:pic="http://schemas.openxmlformats.org/drawingml/2006/picture">
             <wp:extent cx="5806440" cy="2012133"/>
-            <wp:docPr id="4" name="Picture 4"/>
+            <wp:docPr id="6" name="Picture 6"/>
             <wp:cNvGraphicFramePr>
               <a:graphicFrameLocks noChangeAspect="1"/>
             </wp:cNvGraphicFramePr>
@@ -9941,7 +12402,7 @@
                     <pic:cNvPicPr/>
                   </pic:nvPicPr>
                   <pic:blipFill>
-                    <a:blip r:embed="rId13"/>
+                    <a:blip r:embed="rId16"/>
                     <a:stretch>
                       <a:fillRect/>
                     </a:stretch>
@@ -10014,7 +12475,7 @@
         <w:drawing>
           <wp:inline xmlns:a="http://schemas.openxmlformats.org/drawingml/2006/main" xmlns:pic="http://schemas.openxmlformats.org/drawingml/2006/picture">
             <wp:extent cx="5806440" cy="1897154"/>
-            <wp:docPr id="5" name="Picture 5"/>
+            <wp:docPr id="7" name="Picture 7"/>
             <wp:cNvGraphicFramePr>
               <a:graphicFrameLocks noChangeAspect="1"/>
             </wp:cNvGraphicFramePr>
@@ -10026,7 +12487,7 @@
                     <pic:cNvPicPr/>
                   </pic:nvPicPr>
                   <pic:blipFill>
-                    <a:blip r:embed="rId14"/>
+                    <a:blip r:embed="rId17"/>
                     <a:stretch>
                       <a:fillRect/>
                     </a:stretch>
@@ -12539,6 +15000,132 @@
           </w:p>
         </w:tc>
       </w:tr>
+      <w:tr>
+        <w:tc>
+          <w:tcPr>
+            <w:tcW w:type="dxa" w:w="2466"/>
+            <w:shd w:fill="F8F5F2" w:val="clear"/>
+            <w:tcBorders>
+              <w:top w:val="single" w:sz="8" w:color="B68A3A" w:space="0"/>
+              <w:left w:val="single" w:sz="8" w:color="B68A3A" w:space="0"/>
+              <w:bottom w:val="single" w:sz="8" w:color="B68A3A" w:space="0"/>
+              <w:right w:val="single" w:sz="8" w:color="B68A3A" w:space="0"/>
+            </w:tcBorders>
+          </w:tcPr>
+          <w:p>
+            <w:pPr>
+              <w:spacing w:before="40" w:after="40" w:line="288" w:lineRule="auto"/>
+              <w:jc w:val="right"/>
+              <w:bidi w:val="1"/>
+              <w:textDirection w:val="rl"/>
+            </w:pPr>
+            <w:r/>
+            <w:r>
+              <w:rPr>
+                <w:rFonts w:ascii="Amiri" w:hAnsi="Amiri" w:cs="Amiri" w:eastAsia="Amiri"/>
+                <w:b w:val="0"/>
+                <w:color w:val="232323"/>
+                <w:sz w:val="20"/>
+                <w:rtl w:val="1"/>
+              </w:rPr>
+              <w:t>‏فشل فصل الهوية عن المسار الوطني</w:t>
+            </w:r>
+          </w:p>
+        </w:tc>
+        <w:tc>
+          <w:tcPr>
+            <w:tcW w:type="dxa" w:w="2466"/>
+            <w:shd w:fill="F8F5F2" w:val="clear"/>
+            <w:tcBorders>
+              <w:top w:val="single" w:sz="8" w:color="B68A3A" w:space="0"/>
+              <w:left w:val="single" w:sz="8" w:color="B68A3A" w:space="0"/>
+              <w:bottom w:val="single" w:sz="8" w:color="B68A3A" w:space="0"/>
+              <w:right w:val="single" w:sz="8" w:color="B68A3A" w:space="0"/>
+            </w:tcBorders>
+          </w:tcPr>
+          <w:p>
+            <w:pPr>
+              <w:spacing w:before="40" w:after="40" w:line="288" w:lineRule="auto"/>
+              <w:jc w:val="right"/>
+              <w:bidi w:val="1"/>
+              <w:textDirection w:val="rl"/>
+            </w:pPr>
+            <w:r/>
+            <w:r>
+              <w:rPr>
+                <w:rFonts w:ascii="Amiri" w:hAnsi="Amiri" w:cs="Amiri" w:eastAsia="Amiri"/>
+                <w:b w:val="0"/>
+                <w:color w:val="232323"/>
+                <w:sz w:val="20"/>
+                <w:rtl w:val="1"/>
+              </w:rPr>
+              <w:t>‏تشويش أسري وتموضع ضعيف</w:t>
+            </w:r>
+          </w:p>
+        </w:tc>
+        <w:tc>
+          <w:tcPr>
+            <w:tcW w:type="dxa" w:w="2466"/>
+            <w:shd w:fill="F8F5F2" w:val="clear"/>
+            <w:tcBorders>
+              <w:top w:val="single" w:sz="8" w:color="B68A3A" w:space="0"/>
+              <w:left w:val="single" w:sz="8" w:color="B68A3A" w:space="0"/>
+              <w:bottom w:val="single" w:sz="8" w:color="B68A3A" w:space="0"/>
+              <w:right w:val="single" w:sz="8" w:color="B68A3A" w:space="0"/>
+            </w:tcBorders>
+          </w:tcPr>
+          <w:p>
+            <w:pPr>
+              <w:spacing w:before="40" w:after="40" w:line="288" w:lineRule="auto"/>
+              <w:jc w:val="right"/>
+              <w:bidi w:val="1"/>
+              <w:textDirection w:val="rl"/>
+            </w:pPr>
+            <w:r/>
+            <w:r>
+              <w:rPr>
+                <w:rFonts w:ascii="Amiri" w:hAnsi="Amiri" w:cs="Amiri" w:eastAsia="Amiri"/>
+                <w:b w:val="0"/>
+                <w:color w:val="232323"/>
+                <w:sz w:val="20"/>
+                <w:rtl w:val="1"/>
+              </w:rPr>
+              <w:t>‏متوسط–مرتفع</w:t>
+            </w:r>
+          </w:p>
+        </w:tc>
+        <w:tc>
+          <w:tcPr>
+            <w:tcW w:type="dxa" w:w="2466"/>
+            <w:shd w:fill="F8F5F2" w:val="clear"/>
+            <w:tcBorders>
+              <w:top w:val="single" w:sz="8" w:color="B68A3A" w:space="0"/>
+              <w:left w:val="single" w:sz="8" w:color="B68A3A" w:space="0"/>
+              <w:bottom w:val="single" w:sz="8" w:color="B68A3A" w:space="0"/>
+              <w:right w:val="single" w:sz="8" w:color="B68A3A" w:space="0"/>
+            </w:tcBorders>
+          </w:tcPr>
+          <w:p>
+            <w:pPr>
+              <w:spacing w:before="40" w:after="40" w:line="288" w:lineRule="auto"/>
+              <w:jc w:val="right"/>
+              <w:bidi w:val="1"/>
+              <w:textDirection w:val="rl"/>
+            </w:pPr>
+            <w:r/>
+            <w:r>
+              <w:rPr>
+                <w:rFonts w:ascii="Amiri" w:hAnsi="Amiri" w:cs="Amiri" w:eastAsia="Amiri"/>
+                <w:b w:val="0"/>
+                <w:color w:val="232323"/>
+                <w:sz w:val="20"/>
+                <w:rtl w:val="1"/>
+              </w:rPr>
+              <w:t>‏خطة هوية مرحلية + قياس نقاط التماس</w:t>
+            </w:r>
+          </w:p>
+        </w:tc>
+      </w:tr>
     </w:tbl>
     <w:p/>
     <w:p>
@@ -12577,7 +15164,7 @@
         <w:drawing>
           <wp:inline xmlns:a="http://schemas.openxmlformats.org/drawingml/2006/main" xmlns:pic="http://schemas.openxmlformats.org/drawingml/2006/picture">
             <wp:extent cx="5806440" cy="2472049"/>
-            <wp:docPr id="6" name="Picture 6"/>
+            <wp:docPr id="8" name="Picture 8"/>
             <wp:cNvGraphicFramePr>
               <a:graphicFrameLocks noChangeAspect="1"/>
             </wp:cNvGraphicFramePr>
@@ -12589,7 +15176,7 @@
                     <pic:cNvPicPr/>
                   </pic:nvPicPr>
                   <pic:blipFill>
-                    <a:blip r:embed="rId15"/>
+                    <a:blip r:embed="rId18"/>
                     <a:stretch>
                       <a:fillRect/>
                     </a:stretch>
@@ -15713,6 +18300,24 @@
                 <w:sz w:val="21"/>
                 <w:rtl w:val="1"/>
               </w:rPr>
+              <w:t>‏• اعتماد مسار فصل الهوية البصرية للإنترناشونال عن المنهاج الوطني (مرحلي/تقريبي).</w:t>
+            </w:r>
+          </w:p>
+          <w:p>
+            <w:pPr>
+              <w:spacing w:before="20" w:after="40" w:line="300" w:lineRule="auto"/>
+              <w:jc w:val="right"/>
+              <w:bidi w:val="1"/>
+              <w:textDirection w:val="rl"/>
+            </w:pPr>
+            <w:r>
+              <w:rPr>
+                <w:rFonts w:ascii="Amiri" w:hAnsi="Amiri" w:cs="Amiri" w:eastAsia="Amiri"/>
+                <w:b w:val="0"/>
+                <w:color w:val="232323"/>
+                <w:sz w:val="21"/>
+                <w:rtl w:val="1"/>
+              </w:rPr>
               <w:t>‏• مراجعة ربع سنوية ملزمة أمام المجلس.</w:t>
             </w:r>
           </w:p>
@@ -16464,9 +19069,10 @@
       </w:r>
     </w:p>
     <w:sectPr>
-      <w:footerReference w:type="default" r:id="rId9"/>
+      <w:headerReference w:type="default" r:id="rId9"/>
+      <w:footerReference w:type="default" r:id="rId10"/>
       <w:pgSz w:w="11906" w:h="16838"/>
-      <w:pgMar w:top="1134" w:right="1020" w:bottom="1134" w:left="1020" w:header="720" w:footer="720" w:gutter="0"/>
+      <w:pgMar w:top="1474" w:right="1020" w:bottom="1134" w:left="1020" w:header="720" w:footer="720" w:gutter="0"/>
       <w:cols w:space="720"/>
       <w:docGrid w:linePitch="360"/>
       <w:bidi w:val="1"/>
@@ -16524,6 +19130,67 @@
     </w:r>
   </w:p>
 </w:ftr>
+</file>
+
+<file path=word/header1.xml><?xml version="1.0" encoding="utf-8"?>
+<w:hdr xmlns:m="http://schemas.openxmlformats.org/officeDocument/2006/math" xmlns:mc="http://schemas.openxmlformats.org/markup-compatibility/2006" xmlns:mo="http://schemas.microsoft.com/office/mac/office/2008/main" xmlns:mv="urn:schemas-microsoft-com:mac:vml" xmlns:o="urn:schemas-microsoft-com:office:office" xmlns:r="http://schemas.openxmlformats.org/officeDocument/2006/relationships" xmlns:v="urn:schemas-microsoft-com:vml" xmlns:w10="urn:schemas-microsoft-com:office:word" xmlns:w14="http://schemas.microsoft.com/office/word/2010/wordml" xmlns:w="http://schemas.openxmlformats.org/wordprocessingml/2006/main" xmlns:wne="http://schemas.microsoft.com/office/word/2006/wordml" xmlns:wp14="http://schemas.microsoft.com/office/word/2010/wordprocessingDrawing" xmlns:wp="http://schemas.openxmlformats.org/drawingml/2006/wordprocessingDrawing" xmlns:wpc="http://schemas.microsoft.com/office/word/2010/wordprocessingCanvas" xmlns:wpg="http://schemas.microsoft.com/office/word/2010/wordprocessingGroup" xmlns:wpi="http://schemas.microsoft.com/office/word/2010/wordprocessingInk" xmlns:wps="http://schemas.microsoft.com/office/word/2010/wordprocessingShape" mc:Ignorable="w14 wp14">
+  <w:p>
+    <w:pPr>
+      <w:pStyle w:val="Header"/>
+      <w:spacing w:before="0" w:after="0" w:line="240" w:lineRule="auto"/>
+      <w:jc w:val="center"/>
+    </w:pPr>
+    <w:r>
+      <w:drawing>
+        <wp:inline xmlns:a="http://schemas.openxmlformats.org/drawingml/2006/main" xmlns:pic="http://schemas.openxmlformats.org/drawingml/2006/picture">
+          <wp:extent cx="1234440" cy="1234440"/>
+          <wp:docPr id="1" name="Picture 1"/>
+          <wp:cNvGraphicFramePr>
+            <a:graphicFrameLocks noChangeAspect="1"/>
+          </wp:cNvGraphicFramePr>
+          <a:graphic>
+            <a:graphicData uri="http://schemas.openxmlformats.org/drawingml/2006/picture">
+              <pic:pic>
+                <pic:nvPicPr>
+                  <pic:cNvPr id="0" name="success4sure_logo_wm.png"/>
+                  <pic:cNvPicPr/>
+                </pic:nvPicPr>
+                <pic:blipFill>
+                  <a:blip r:embed="rId1"/>
+                  <a:stretch>
+                    <a:fillRect/>
+                  </a:stretch>
+                </pic:blipFill>
+                <pic:spPr>
+                  <a:xfrm>
+                    <a:off x="0" y="0"/>
+                    <a:ext cx="1234440" cy="1234440"/>
+                  </a:xfrm>
+                  <a:prstGeom prst="rect"/>
+                </pic:spPr>
+              </pic:pic>
+            </a:graphicData>
+          </a:graphic>
+        </wp:inline>
+      </w:drawing>
+    </w:r>
+  </w:p>
+  <w:p>
+    <w:pPr>
+      <w:spacing w:before="0" w:after="40" w:line="240" w:lineRule="auto"/>
+      <w:jc w:val="center"/>
+    </w:pPr>
+    <w:r>
+      <w:rPr>
+        <w:rFonts w:ascii="Liberation Serif" w:hAnsi="Liberation Serif" w:cs="Liberation Serif" w:eastAsia="Liberation Serif"/>
+        <w:b/>
+        <w:color w:val="8B1E2D"/>
+        <w:sz w:val="16"/>
+      </w:rPr>
+      <w:t>OMAREYAH INTERNATIONAL DIVISION | EXECUTIVE TRANSFORMATION BLUEPRINT</w:t>
+    </w:r>
+  </w:p>
+</w:hdr>
 </file>
 
 <file path=word/numbering.xml><?xml version="1.0" encoding="utf-8"?>

</xml_diff>

<commit_message>
Add future branch-expansion roadmap to Omareyah blueprint.
Include phased years 2–5 gates for opening new International Division branches after the mother campus model is proven and board-approved.

Co-authored-by: waseemabdelbaqi-lgtm <waseemabdelbaqi-lgtm@users.noreply.github.com>
</commit_message>
<xml_diff>
--- a/omareyah-blueprint/output/Omareyah_International_Executive_Transformation_Blueprint.docx
+++ b/omareyah-blueprint/output/Omareyah_International_Executive_Transformation_Blueprint.docx
@@ -1056,7 +1056,7 @@
                 <w:sz w:val="20"/>
                 <w:rtl w:val="1"/>
               </w:rPr>
-              <w:t>‏100 يوم · سنة · 2–5 سنوات</w:t>
+              <w:t>‏100 يوم · سنة · 2–5 سنوات · فتح فروع مستقبلاً</w:t>
             </w:r>
           </w:p>
         </w:tc>
@@ -1251,7 +1251,7 @@
           <w:sz w:val="23"/>
           <w:rtl w:val="1"/>
         </w:rPr>
-        <w:t>‏تقترح هذه الوثيقة تعيين الأستاذ وسيم اللبدي في موقع قيادي يجمع إدارة البرامج الدولية مع قيادة التحول التعليمي، مع الاستفادة المنظمة من قدرات Success 4 Sure كشريك تنفيذ — دون نقل هوية المدرسة إلى الشريك. ويشمل التحول أولوية واضحة: فصل الهوية البصرية والتشغيلية لقسم الإنترناشونال عن هوية المنهاج الوطني الأردني داخل المدرسة بفصل تقريبي مرحلي.</w:t>
+        <w:t>‏تقترح هذه الوثيقة تعيين الأستاذ وسيم اللبدي في موقع قيادي يجمع إدارة البرامج الدولية مع قيادة التحول التعليمي، مع الاستفادة المنظمة من قدرات Success 4 Sure كشريك تنفيذ — دون نقل هوية المدرسة إلى الشريك. ويشمل التحول أولوية واضحة: فصل الهوية البصرية والتشغيلية لقسم الإنترناشونال عن هوية المنهاج الوطني الأردني داخل المدرسة بفصل تقريبي مرحلي. كما تضع الخطة مساراً مستقبلياً لفتح فروع جديدة بعد إثبات قابلية النموذج للنسخ في الموقع الأم.</w:t>
       </w:r>
     </w:p>
     <w:p>
@@ -1850,6 +1850,101 @@
                 <w:rtl w:val="1"/>
               </w:rPr>
               <w:t>‏اعتماد عالٍ على خبرة المدير فقط</w:t>
+            </w:r>
+          </w:p>
+        </w:tc>
+      </w:tr>
+      <w:tr>
+        <w:tc>
+          <w:tcPr>
+            <w:tcW w:type="dxa" w:w="3289"/>
+            <w:shd w:fill="FFFFFF" w:val="clear"/>
+            <w:tcBorders>
+              <w:top w:val="single" w:sz="8" w:color="B68A3A" w:space="0"/>
+              <w:left w:val="single" w:sz="8" w:color="B68A3A" w:space="0"/>
+              <w:bottom w:val="single" w:sz="8" w:color="B68A3A" w:space="0"/>
+              <w:right w:val="single" w:sz="8" w:color="B68A3A" w:space="0"/>
+            </w:tcBorders>
+          </w:tcPr>
+          <w:p>
+            <w:pPr>
+              <w:spacing w:before="40" w:after="40" w:line="288" w:lineRule="auto"/>
+              <w:jc w:val="right"/>
+              <w:bidi w:val="1"/>
+              <w:textDirection w:val="rl"/>
+            </w:pPr>
+            <w:r/>
+            <w:r>
+              <w:rPr>
+                <w:rFonts w:ascii="Amiri" w:hAnsi="Amiri" w:cs="Amiri" w:eastAsia="Amiri"/>
+                <w:b w:val="0"/>
+                <w:color w:val="232323"/>
+                <w:sz w:val="20"/>
+                <w:rtl w:val="1"/>
+              </w:rPr>
+              <w:t>‏التوسع بالفروع</w:t>
+            </w:r>
+          </w:p>
+        </w:tc>
+        <w:tc>
+          <w:tcPr>
+            <w:tcW w:type="dxa" w:w="3289"/>
+            <w:shd w:fill="FFFFFF" w:val="clear"/>
+            <w:tcBorders>
+              <w:top w:val="single" w:sz="8" w:color="B68A3A" w:space="0"/>
+              <w:left w:val="single" w:sz="8" w:color="B68A3A" w:space="0"/>
+              <w:bottom w:val="single" w:sz="8" w:color="B68A3A" w:space="0"/>
+              <w:right w:val="single" w:sz="8" w:color="B68A3A" w:space="0"/>
+            </w:tcBorders>
+          </w:tcPr>
+          <w:p>
+            <w:pPr>
+              <w:spacing w:before="40" w:after="40" w:line="288" w:lineRule="auto"/>
+              <w:jc w:val="right"/>
+              <w:bidi w:val="1"/>
+              <w:textDirection w:val="rl"/>
+            </w:pPr>
+            <w:r/>
+            <w:r>
+              <w:rPr>
+                <w:rFonts w:ascii="Amiri" w:hAnsi="Amiri" w:cs="Amiri" w:eastAsia="Amiri"/>
+                <w:b w:val="0"/>
+                <w:color w:val="232323"/>
+                <w:sz w:val="20"/>
+                <w:rtl w:val="1"/>
+              </w:rPr>
+              <w:t>‏مسار مشروط بجاهزية الجودة والنسخ المؤسسي</w:t>
+            </w:r>
+          </w:p>
+        </w:tc>
+        <w:tc>
+          <w:tcPr>
+            <w:tcW w:type="dxa" w:w="3289"/>
+            <w:shd w:fill="FFFFFF" w:val="clear"/>
+            <w:tcBorders>
+              <w:top w:val="single" w:sz="8" w:color="B68A3A" w:space="0"/>
+              <w:left w:val="single" w:sz="8" w:color="B68A3A" w:space="0"/>
+              <w:bottom w:val="single" w:sz="8" w:color="B68A3A" w:space="0"/>
+              <w:right w:val="single" w:sz="8" w:color="B68A3A" w:space="0"/>
+            </w:tcBorders>
+          </w:tcPr>
+          <w:p>
+            <w:pPr>
+              <w:spacing w:before="40" w:after="40" w:line="288" w:lineRule="auto"/>
+              <w:jc w:val="right"/>
+              <w:bidi w:val="1"/>
+              <w:textDirection w:val="rl"/>
+            </w:pPr>
+            <w:r/>
+            <w:r>
+              <w:rPr>
+                <w:rFonts w:ascii="Amiri" w:hAnsi="Amiri" w:cs="Amiri" w:eastAsia="Amiri"/>
+                <w:b w:val="0"/>
+                <w:color w:val="232323"/>
+                <w:sz w:val="20"/>
+                <w:rtl w:val="1"/>
+              </w:rPr>
+              <w:t>‏توسع مبكر بلا نموذج جاهز</w:t>
             </w:r>
           </w:p>
         </w:tc>
@@ -12474,7 +12569,7 @@
       <w:r>
         <w:drawing>
           <wp:inline xmlns:a="http://schemas.openxmlformats.org/drawingml/2006/main" xmlns:pic="http://schemas.openxmlformats.org/drawingml/2006/picture">
-            <wp:extent cx="5806440" cy="1897154"/>
+            <wp:extent cx="5806440" cy="2127112"/>
             <wp:docPr id="7" name="Picture 7"/>
             <wp:cNvGraphicFramePr>
               <a:graphicFrameLocks noChangeAspect="1"/>
@@ -12495,7 +12590,7 @@
                   <pic:spPr>
                     <a:xfrm>
                       <a:off x="0" y="0"/>
-                      <a:ext cx="5806440" cy="1897154"/>
+                      <a:ext cx="5806440" cy="2127112"/>
                     </a:xfrm>
                     <a:prstGeom prst="rect"/>
                   </pic:spPr>
@@ -12799,7 +12894,7 @@
                 <w:sz w:val="20"/>
                 <w:rtl w:val="1"/>
               </w:rPr>
-              <w:t>‏التوسع الحصيف</w:t>
+              <w:t>‏تموضع العلامة</w:t>
             </w:r>
           </w:p>
         </w:tc>
@@ -12830,7 +12925,7 @@
                 <w:sz w:val="20"/>
                 <w:rtl w:val="1"/>
               </w:rPr>
-              <w:t>‏تحسين الإشغال</w:t>
+              <w:t>‏رواية قيمة مثبتة</w:t>
             </w:r>
           </w:p>
         </w:tc>
@@ -12861,7 +12956,7 @@
                 <w:sz w:val="20"/>
                 <w:rtl w:val="1"/>
               </w:rPr>
-              <w:t>‏برامج إثراء أوسع</w:t>
+              <w:t>‏سمعة أسرية أقوى</w:t>
             </w:r>
           </w:p>
         </w:tc>
@@ -12892,7 +12987,7 @@
                 <w:sz w:val="20"/>
                 <w:rtl w:val="1"/>
               </w:rPr>
-              <w:t>‏خيارات مسارات متقدمة عند الجاهزية</w:t>
+              <w:t>‏تموضع «موثوقية دولية»</w:t>
             </w:r>
           </w:p>
         </w:tc>
@@ -12925,7 +13020,7 @@
                 <w:sz w:val="20"/>
                 <w:rtl w:val="1"/>
               </w:rPr>
-              <w:t>‏تموضع العلامة</w:t>
+              <w:t>‏الاستدامة المالية</w:t>
             </w:r>
           </w:p>
         </w:tc>
@@ -12956,7 +13051,7 @@
                 <w:sz w:val="20"/>
                 <w:rtl w:val="1"/>
               </w:rPr>
-              <w:t>‏رواية قيمة مثبتة</w:t>
+              <w:t>‏ربط القيمة بالاستبقاء</w:t>
             </w:r>
           </w:p>
         </w:tc>
@@ -12987,7 +13082,7 @@
                 <w:sz w:val="20"/>
                 <w:rtl w:val="1"/>
               </w:rPr>
-              <w:t>‏سمعة أسرية أقوى</w:t>
+              <w:t>‏كفاءة تشغيل أعلى</w:t>
             </w:r>
           </w:p>
         </w:tc>
@@ -13018,7 +13113,7 @@
                 <w:sz w:val="20"/>
                 <w:rtl w:val="1"/>
               </w:rPr>
-              <w:t>‏تموضع «موثوقية دولية»</w:t>
+              <w:t>‏موازنة مبادرات ذات عائد واضح</w:t>
             </w:r>
           </w:p>
         </w:tc>
@@ -13051,7 +13146,7 @@
                 <w:sz w:val="20"/>
                 <w:rtl w:val="1"/>
               </w:rPr>
-              <w:t>‏الاستدامة المالية</w:t>
+              <w:t>‏النضج الرقمي</w:t>
             </w:r>
           </w:p>
         </w:tc>
@@ -13082,7 +13177,7 @@
                 <w:sz w:val="20"/>
                 <w:rtl w:val="1"/>
               </w:rPr>
-              <w:t>‏ربط القيمة بالاستبقاء</w:t>
+              <w:t>‏توحيد المنصة</w:t>
             </w:r>
           </w:p>
         </w:tc>
@@ -13113,7 +13208,7 @@
                 <w:sz w:val="20"/>
                 <w:rtl w:val="1"/>
               </w:rPr>
-              <w:t>‏كفاءة تشغيل أعلى</w:t>
+              <w:t>‏تحليلات قرار</w:t>
             </w:r>
           </w:p>
         </w:tc>
@@ -13144,7 +13239,7 @@
                 <w:sz w:val="20"/>
                 <w:rtl w:val="1"/>
               </w:rPr>
-              <w:t>‏موازنة مبادرات ذات عائد واضح</w:t>
+              <w:t>‏تحسين مستمر مبني على بيانات</w:t>
             </w:r>
           </w:p>
         </w:tc>
@@ -13177,7 +13272,7 @@
                 <w:sz w:val="20"/>
                 <w:rtl w:val="1"/>
               </w:rPr>
-              <w:t>‏النضج الرقمي</w:t>
+              <w:t>‏فتح فروع جديدة</w:t>
             </w:r>
           </w:p>
         </w:tc>
@@ -13208,7 +13303,7 @@
                 <w:sz w:val="20"/>
                 <w:rtl w:val="1"/>
               </w:rPr>
-              <w:t>‏توحيد المنصة</w:t>
+              <w:t>‏رفع إشغال النموذج الأم وجعله قابلاً للنسخ</w:t>
             </w:r>
           </w:p>
         </w:tc>
@@ -13239,7 +13334,7 @@
                 <w:sz w:val="20"/>
                 <w:rtl w:val="1"/>
               </w:rPr>
-              <w:t>‏تحليلات قرار</w:t>
+              <w:t>‏دراسات مواقع + دراسة جدوى أولية</w:t>
             </w:r>
           </w:p>
         </w:tc>
@@ -13270,13 +13365,976 @@
                 <w:sz w:val="20"/>
                 <w:rtl w:val="1"/>
               </w:rPr>
-              <w:t>‏تحسين مستمر مبني على بيانات</w:t>
+              <w:t>‏إطلاق فرع أول منضبط ثم تقييم فرع ثانٍ</w:t>
             </w:r>
           </w:p>
         </w:tc>
       </w:tr>
     </w:tbl>
     <w:p/>
+    <w:p>
+      <w:pPr>
+        <w:spacing w:before="200" w:after="80" w:line="324" w:lineRule="auto"/>
+        <w:jc w:val="right"/>
+        <w:bidi w:val="1"/>
+        <w:textDirection w:val="rl"/>
+      </w:pPr>
+      <w:r>
+        <w:rPr>
+          <w:rFonts w:ascii="Amiri" w:hAnsi="Amiri" w:cs="Amiri" w:eastAsia="Amiri"/>
+          <w:b/>
+          <w:color w:val="B68A3A"/>
+          <w:sz w:val="25"/>
+          <w:rtl w:val="1"/>
+        </w:rPr>
+        <w:t>‏11.1 فتح فروع جديدة مستقبلاً (محور استراتيجي)</w:t>
+      </w:r>
+    </w:p>
+    <w:p>
+      <w:pPr>
+        <w:spacing w:before="0" w:after="120" w:line="324" w:lineRule="auto"/>
+        <w:jc w:val="right"/>
+        <w:bidi w:val="1"/>
+        <w:textDirection w:val="rl"/>
+      </w:pPr>
+      <w:r>
+        <w:rPr>
+          <w:rFonts w:ascii="Amiri" w:hAnsi="Amiri" w:cs="Amiri" w:eastAsia="Amiri"/>
+          <w:b w:val="0"/>
+          <w:color w:val="232323"/>
+          <w:sz w:val="23"/>
+          <w:rtl w:val="1"/>
+        </w:rPr>
+        <w:t>‏تتضمن الخطة الاستراتيجية إمكانية فتح فروع جديدة لقسم/برنامج الإنترناشونال مستقبلاً، لكن ليس كهدف مستقل عن الجودة. المنطق الاستشاري: يُنسخ فقط ما ثبت نجاحه تشغيلياً ومالياً وهويتياً في الموقع الأم. التوسع المبكر دون جاهزية يُضعف السمعة ويُكرّر المشاكل.</w:t>
+      </w:r>
+    </w:p>
+    <w:p>
+      <w:pPr>
+        <w:spacing w:before="120" w:after="160" w:line="240" w:lineRule="auto"/>
+        <w:jc w:val="center"/>
+      </w:pPr>
+      <w:r>
+        <w:drawing>
+          <wp:inline xmlns:a="http://schemas.openxmlformats.org/drawingml/2006/main" xmlns:pic="http://schemas.openxmlformats.org/drawingml/2006/picture">
+            <wp:extent cx="5806440" cy="1609706"/>
+            <wp:docPr id="8" name="Picture 8"/>
+            <wp:cNvGraphicFramePr>
+              <a:graphicFrameLocks noChangeAspect="1"/>
+            </wp:cNvGraphicFramePr>
+            <a:graphic>
+              <a:graphicData uri="http://schemas.openxmlformats.org/drawingml/2006/picture">
+                <pic:pic>
+                  <pic:nvPicPr>
+                    <pic:cNvPr id="0" name="chart_branch_expansion.png"/>
+                    <pic:cNvPicPr/>
+                  </pic:nvPicPr>
+                  <pic:blipFill>
+                    <a:blip r:embed="rId18"/>
+                    <a:stretch>
+                      <a:fillRect/>
+                    </a:stretch>
+                  </pic:blipFill>
+                  <pic:spPr>
+                    <a:xfrm>
+                      <a:off x="0" y="0"/>
+                      <a:ext cx="5806440" cy="1609706"/>
+                    </a:xfrm>
+                    <a:prstGeom prst="rect"/>
+                  </pic:spPr>
+                </pic:pic>
+              </a:graphicData>
+            </a:graphic>
+          </wp:inline>
+        </w:drawing>
+      </w:r>
+    </w:p>
+    <w:tbl>
+      <w:tblPr>
+        <w:tblW w:type="auto" w:w="0"/>
+        <w:jc w:val="center"/>
+        <w:tblLook w:firstColumn="1" w:firstRow="1" w:lastColumn="0" w:lastRow="0" w:noHBand="0" w:noVBand="1" w:val="04A0"/>
+        <w:bidiVisual w:val="1"/>
+      </w:tblPr>
+      <w:tblGrid>
+        <w:gridCol w:w="2466"/>
+        <w:gridCol w:w="2466"/>
+        <w:gridCol w:w="2466"/>
+        <w:gridCol w:w="2466"/>
+      </w:tblGrid>
+      <w:tr>
+        <w:tc>
+          <w:tcPr>
+            <w:tcW w:type="dxa" w:w="2466"/>
+            <w:shd w:fill="8B1E2D" w:val="clear"/>
+            <w:tcBorders>
+              <w:top w:val="single" w:sz="8" w:color="8B1E2D" w:space="0"/>
+              <w:left w:val="single" w:sz="8" w:color="8B1E2D" w:space="0"/>
+              <w:bottom w:val="single" w:sz="8" w:color="8B1E2D" w:space="0"/>
+              <w:right w:val="single" w:sz="8" w:color="8B1E2D" w:space="0"/>
+            </w:tcBorders>
+          </w:tcPr>
+          <w:p>
+            <w:pPr>
+              <w:spacing w:before="40" w:after="40" w:line="288" w:lineRule="auto"/>
+              <w:jc w:val="right"/>
+              <w:bidi w:val="1"/>
+              <w:textDirection w:val="rl"/>
+            </w:pPr>
+            <w:r/>
+            <w:r>
+              <w:rPr>
+                <w:rFonts w:ascii="Amiri" w:hAnsi="Amiri" w:cs="Amiri" w:eastAsia="Amiri"/>
+                <w:b/>
+                <w:color w:val="FFFFFF"/>
+                <w:sz w:val="21"/>
+                <w:rtl w:val="1"/>
+              </w:rPr>
+              <w:t>‏المرحلة</w:t>
+            </w:r>
+          </w:p>
+        </w:tc>
+        <w:tc>
+          <w:tcPr>
+            <w:tcW w:type="dxa" w:w="2466"/>
+            <w:shd w:fill="8B1E2D" w:val="clear"/>
+            <w:tcBorders>
+              <w:top w:val="single" w:sz="8" w:color="8B1E2D" w:space="0"/>
+              <w:left w:val="single" w:sz="8" w:color="8B1E2D" w:space="0"/>
+              <w:bottom w:val="single" w:sz="8" w:color="8B1E2D" w:space="0"/>
+              <w:right w:val="single" w:sz="8" w:color="8B1E2D" w:space="0"/>
+            </w:tcBorders>
+          </w:tcPr>
+          <w:p>
+            <w:pPr>
+              <w:spacing w:before="40" w:after="40" w:line="288" w:lineRule="auto"/>
+              <w:jc w:val="right"/>
+              <w:bidi w:val="1"/>
+              <w:textDirection w:val="rl"/>
+            </w:pPr>
+            <w:r/>
+            <w:r>
+              <w:rPr>
+                <w:rFonts w:ascii="Amiri" w:hAnsi="Amiri" w:cs="Amiri" w:eastAsia="Amiri"/>
+                <w:b/>
+                <w:color w:val="FFFFFF"/>
+                <w:sz w:val="21"/>
+                <w:rtl w:val="1"/>
+              </w:rPr>
+              <w:t>‏التركيز</w:t>
+            </w:r>
+          </w:p>
+        </w:tc>
+        <w:tc>
+          <w:tcPr>
+            <w:tcW w:type="dxa" w:w="2466"/>
+            <w:shd w:fill="8B1E2D" w:val="clear"/>
+            <w:tcBorders>
+              <w:top w:val="single" w:sz="8" w:color="8B1E2D" w:space="0"/>
+              <w:left w:val="single" w:sz="8" w:color="8B1E2D" w:space="0"/>
+              <w:bottom w:val="single" w:sz="8" w:color="8B1E2D" w:space="0"/>
+              <w:right w:val="single" w:sz="8" w:color="8B1E2D" w:space="0"/>
+            </w:tcBorders>
+          </w:tcPr>
+          <w:p>
+            <w:pPr>
+              <w:spacing w:before="40" w:after="40" w:line="288" w:lineRule="auto"/>
+              <w:jc w:val="right"/>
+              <w:bidi w:val="1"/>
+              <w:textDirection w:val="rl"/>
+            </w:pPr>
+            <w:r/>
+            <w:r>
+              <w:rPr>
+                <w:rFonts w:ascii="Amiri" w:hAnsi="Amiri" w:cs="Amiri" w:eastAsia="Amiri"/>
+                <w:b/>
+                <w:color w:val="FFFFFF"/>
+                <w:sz w:val="21"/>
+                <w:rtl w:val="1"/>
+              </w:rPr>
+              <w:t>‏شروط المرور للمرحلة التالية</w:t>
+            </w:r>
+          </w:p>
+        </w:tc>
+        <w:tc>
+          <w:tcPr>
+            <w:tcW w:type="dxa" w:w="2466"/>
+            <w:shd w:fill="8B1E2D" w:val="clear"/>
+            <w:tcBorders>
+              <w:top w:val="single" w:sz="8" w:color="8B1E2D" w:space="0"/>
+              <w:left w:val="single" w:sz="8" w:color="8B1E2D" w:space="0"/>
+              <w:bottom w:val="single" w:sz="8" w:color="8B1E2D" w:space="0"/>
+              <w:right w:val="single" w:sz="8" w:color="8B1E2D" w:space="0"/>
+            </w:tcBorders>
+          </w:tcPr>
+          <w:p>
+            <w:pPr>
+              <w:spacing w:before="40" w:after="40" w:line="288" w:lineRule="auto"/>
+              <w:jc w:val="right"/>
+              <w:bidi w:val="1"/>
+              <w:textDirection w:val="rl"/>
+            </w:pPr>
+            <w:r/>
+            <w:r>
+              <w:rPr>
+                <w:rFonts w:ascii="Amiri" w:hAnsi="Amiri" w:cs="Amiri" w:eastAsia="Amiri"/>
+                <w:b/>
+                <w:color w:val="FFFFFF"/>
+                <w:sz w:val="21"/>
+                <w:rtl w:val="1"/>
+              </w:rPr>
+              <w:t>‏مخرج للمجلس</w:t>
+            </w:r>
+          </w:p>
+        </w:tc>
+      </w:tr>
+      <w:tr>
+        <w:tc>
+          <w:tcPr>
+            <w:tcW w:type="dxa" w:w="2466"/>
+            <w:shd w:fill="F8F5F2" w:val="clear"/>
+            <w:tcBorders>
+              <w:top w:val="single" w:sz="8" w:color="B68A3A" w:space="0"/>
+              <w:left w:val="single" w:sz="8" w:color="B68A3A" w:space="0"/>
+              <w:bottom w:val="single" w:sz="8" w:color="B68A3A" w:space="0"/>
+              <w:right w:val="single" w:sz="8" w:color="B68A3A" w:space="0"/>
+            </w:tcBorders>
+          </w:tcPr>
+          <w:p>
+            <w:pPr>
+              <w:spacing w:before="40" w:after="40" w:line="288" w:lineRule="auto"/>
+              <w:jc w:val="right"/>
+              <w:bidi w:val="1"/>
+              <w:textDirection w:val="rl"/>
+            </w:pPr>
+            <w:r/>
+            <w:r>
+              <w:rPr>
+                <w:rFonts w:ascii="Amiri" w:hAnsi="Amiri" w:cs="Amiri" w:eastAsia="Amiri"/>
+                <w:b w:val="0"/>
+                <w:color w:val="232323"/>
+                <w:sz w:val="20"/>
+                <w:rtl w:val="1"/>
+              </w:rPr>
+              <w:t>‏السنة 2</w:t>
+            </w:r>
+          </w:p>
+        </w:tc>
+        <w:tc>
+          <w:tcPr>
+            <w:tcW w:type="dxa" w:w="2466"/>
+            <w:shd w:fill="F8F5F2" w:val="clear"/>
+            <w:tcBorders>
+              <w:top w:val="single" w:sz="8" w:color="B68A3A" w:space="0"/>
+              <w:left w:val="single" w:sz="8" w:color="B68A3A" w:space="0"/>
+              <w:bottom w:val="single" w:sz="8" w:color="B68A3A" w:space="0"/>
+              <w:right w:val="single" w:sz="8" w:color="B68A3A" w:space="0"/>
+            </w:tcBorders>
+          </w:tcPr>
+          <w:p>
+            <w:pPr>
+              <w:spacing w:before="40" w:after="40" w:line="288" w:lineRule="auto"/>
+              <w:jc w:val="right"/>
+              <w:bidi w:val="1"/>
+              <w:textDirection w:val="rl"/>
+            </w:pPr>
+            <w:r/>
+            <w:r>
+              <w:rPr>
+                <w:rFonts w:ascii="Amiri" w:hAnsi="Amiri" w:cs="Amiri" w:eastAsia="Amiri"/>
+                <w:b w:val="0"/>
+                <w:color w:val="232323"/>
+                <w:sz w:val="20"/>
+                <w:rtl w:val="1"/>
+              </w:rPr>
+              <w:t>‏تعظيم إشغال الموقع الحالي + توثيق نموذج التشغيل (أدلة إجراءات، جودة، هوية، قبول)</w:t>
+            </w:r>
+          </w:p>
+        </w:tc>
+        <w:tc>
+          <w:tcPr>
+            <w:tcW w:type="dxa" w:w="2466"/>
+            <w:shd w:fill="F8F5F2" w:val="clear"/>
+            <w:tcBorders>
+              <w:top w:val="single" w:sz="8" w:color="B68A3A" w:space="0"/>
+              <w:left w:val="single" w:sz="8" w:color="B68A3A" w:space="0"/>
+              <w:bottom w:val="single" w:sz="8" w:color="B68A3A" w:space="0"/>
+              <w:right w:val="single" w:sz="8" w:color="B68A3A" w:space="0"/>
+            </w:tcBorders>
+          </w:tcPr>
+          <w:p>
+            <w:pPr>
+              <w:spacing w:before="40" w:after="40" w:line="288" w:lineRule="auto"/>
+              <w:jc w:val="right"/>
+              <w:bidi w:val="1"/>
+              <w:textDirection w:val="rl"/>
+            </w:pPr>
+            <w:r/>
+            <w:r>
+              <w:rPr>
+                <w:rFonts w:ascii="Amiri" w:hAnsi="Amiri" w:cs="Amiri" w:eastAsia="Amiri"/>
+                <w:b w:val="0"/>
+                <w:color w:val="232323"/>
+                <w:sz w:val="20"/>
+                <w:rtl w:val="1"/>
+              </w:rPr>
+              <w:t>‏استقرار مؤشرات الجودة/الاستبقاء + وضوح هوية الإنترناشونال</w:t>
+            </w:r>
+          </w:p>
+        </w:tc>
+        <w:tc>
+          <w:tcPr>
+            <w:tcW w:type="dxa" w:w="2466"/>
+            <w:shd w:fill="F8F5F2" w:val="clear"/>
+            <w:tcBorders>
+              <w:top w:val="single" w:sz="8" w:color="B68A3A" w:space="0"/>
+              <w:left w:val="single" w:sz="8" w:color="B68A3A" w:space="0"/>
+              <w:bottom w:val="single" w:sz="8" w:color="B68A3A" w:space="0"/>
+              <w:right w:val="single" w:sz="8" w:color="B68A3A" w:space="0"/>
+            </w:tcBorders>
+          </w:tcPr>
+          <w:p>
+            <w:pPr>
+              <w:spacing w:before="40" w:after="40" w:line="288" w:lineRule="auto"/>
+              <w:jc w:val="right"/>
+              <w:bidi w:val="1"/>
+              <w:textDirection w:val="rl"/>
+            </w:pPr>
+            <w:r/>
+            <w:r>
+              <w:rPr>
+                <w:rFonts w:ascii="Amiri" w:hAnsi="Amiri" w:cs="Amiri" w:eastAsia="Amiri"/>
+                <w:b w:val="0"/>
+                <w:color w:val="232323"/>
+                <w:sz w:val="20"/>
+                <w:rtl w:val="1"/>
+              </w:rPr>
+              <w:t>‏ملف «نموذج قابل للنسخ»</w:t>
+            </w:r>
+          </w:p>
+        </w:tc>
+      </w:tr>
+      <w:tr>
+        <w:tc>
+          <w:tcPr>
+            <w:tcW w:type="dxa" w:w="2466"/>
+            <w:shd w:fill="FFFFFF" w:val="clear"/>
+            <w:tcBorders>
+              <w:top w:val="single" w:sz="8" w:color="B68A3A" w:space="0"/>
+              <w:left w:val="single" w:sz="8" w:color="B68A3A" w:space="0"/>
+              <w:bottom w:val="single" w:sz="8" w:color="B68A3A" w:space="0"/>
+              <w:right w:val="single" w:sz="8" w:color="B68A3A" w:space="0"/>
+            </w:tcBorders>
+          </w:tcPr>
+          <w:p>
+            <w:pPr>
+              <w:spacing w:before="40" w:after="40" w:line="288" w:lineRule="auto"/>
+              <w:jc w:val="right"/>
+              <w:bidi w:val="1"/>
+              <w:textDirection w:val="rl"/>
+            </w:pPr>
+            <w:r/>
+            <w:r>
+              <w:rPr>
+                <w:rFonts w:ascii="Amiri" w:hAnsi="Amiri" w:cs="Amiri" w:eastAsia="Amiri"/>
+                <w:b w:val="0"/>
+                <w:color w:val="232323"/>
+                <w:sz w:val="20"/>
+                <w:rtl w:val="1"/>
+              </w:rPr>
+              <w:t>‏السنة 3</w:t>
+            </w:r>
+          </w:p>
+        </w:tc>
+        <w:tc>
+          <w:tcPr>
+            <w:tcW w:type="dxa" w:w="2466"/>
+            <w:shd w:fill="FFFFFF" w:val="clear"/>
+            <w:tcBorders>
+              <w:top w:val="single" w:sz="8" w:color="B68A3A" w:space="0"/>
+              <w:left w:val="single" w:sz="8" w:color="B68A3A" w:space="0"/>
+              <w:bottom w:val="single" w:sz="8" w:color="B68A3A" w:space="0"/>
+              <w:right w:val="single" w:sz="8" w:color="B68A3A" w:space="0"/>
+            </w:tcBorders>
+          </w:tcPr>
+          <w:p>
+            <w:pPr>
+              <w:spacing w:before="40" w:after="40" w:line="288" w:lineRule="auto"/>
+              <w:jc w:val="right"/>
+              <w:bidi w:val="1"/>
+              <w:textDirection w:val="rl"/>
+            </w:pPr>
+            <w:r/>
+            <w:r>
+              <w:rPr>
+                <w:rFonts w:ascii="Amiri" w:hAnsi="Amiri" w:cs="Amiri" w:eastAsia="Amiri"/>
+                <w:b w:val="0"/>
+                <w:color w:val="232323"/>
+                <w:sz w:val="20"/>
+                <w:rtl w:val="1"/>
+              </w:rPr>
+              <w:t>‏مسح مواقع محتملة، طلب سوق، منافسة، تكاليف تأسيسية وتشغيلية</w:t>
+            </w:r>
+          </w:p>
+        </w:tc>
+        <w:tc>
+          <w:tcPr>
+            <w:tcW w:type="dxa" w:w="2466"/>
+            <w:shd w:fill="FFFFFF" w:val="clear"/>
+            <w:tcBorders>
+              <w:top w:val="single" w:sz="8" w:color="B68A3A" w:space="0"/>
+              <w:left w:val="single" w:sz="8" w:color="B68A3A" w:space="0"/>
+              <w:bottom w:val="single" w:sz="8" w:color="B68A3A" w:space="0"/>
+              <w:right w:val="single" w:sz="8" w:color="B68A3A" w:space="0"/>
+            </w:tcBorders>
+          </w:tcPr>
+          <w:p>
+            <w:pPr>
+              <w:spacing w:before="40" w:after="40" w:line="288" w:lineRule="auto"/>
+              <w:jc w:val="right"/>
+              <w:bidi w:val="1"/>
+              <w:textDirection w:val="rl"/>
+            </w:pPr>
+            <w:r/>
+            <w:r>
+              <w:rPr>
+                <w:rFonts w:ascii="Amiri" w:hAnsi="Amiri" w:cs="Amiri" w:eastAsia="Amiri"/>
+                <w:b w:val="0"/>
+                <w:color w:val="232323"/>
+                <w:sz w:val="20"/>
+                <w:rtl w:val="1"/>
+              </w:rPr>
+              <w:t>‏دراسة جدوى أولية مع سيناريوهات تحفظية</w:t>
+            </w:r>
+          </w:p>
+        </w:tc>
+        <w:tc>
+          <w:tcPr>
+            <w:tcW w:type="dxa" w:w="2466"/>
+            <w:shd w:fill="FFFFFF" w:val="clear"/>
+            <w:tcBorders>
+              <w:top w:val="single" w:sz="8" w:color="B68A3A" w:space="0"/>
+              <w:left w:val="single" w:sz="8" w:color="B68A3A" w:space="0"/>
+              <w:bottom w:val="single" w:sz="8" w:color="B68A3A" w:space="0"/>
+              <w:right w:val="single" w:sz="8" w:color="B68A3A" w:space="0"/>
+            </w:tcBorders>
+          </w:tcPr>
+          <w:p>
+            <w:pPr>
+              <w:spacing w:before="40" w:after="40" w:line="288" w:lineRule="auto"/>
+              <w:jc w:val="right"/>
+              <w:bidi w:val="1"/>
+              <w:textDirection w:val="rl"/>
+            </w:pPr>
+            <w:r/>
+            <w:r>
+              <w:rPr>
+                <w:rFonts w:ascii="Amiri" w:hAnsi="Amiri" w:cs="Amiri" w:eastAsia="Amiri"/>
+                <w:b w:val="0"/>
+                <w:color w:val="232323"/>
+                <w:sz w:val="20"/>
+                <w:rtl w:val="1"/>
+              </w:rPr>
+              <w:t>‏مذكرة مواقع قصيرة + توصية مبدئية</w:t>
+            </w:r>
+          </w:p>
+        </w:tc>
+      </w:tr>
+      <w:tr>
+        <w:tc>
+          <w:tcPr>
+            <w:tcW w:type="dxa" w:w="2466"/>
+            <w:shd w:fill="F8F5F2" w:val="clear"/>
+            <w:tcBorders>
+              <w:top w:val="single" w:sz="8" w:color="B68A3A" w:space="0"/>
+              <w:left w:val="single" w:sz="8" w:color="B68A3A" w:space="0"/>
+              <w:bottom w:val="single" w:sz="8" w:color="B68A3A" w:space="0"/>
+              <w:right w:val="single" w:sz="8" w:color="B68A3A" w:space="0"/>
+            </w:tcBorders>
+          </w:tcPr>
+          <w:p>
+            <w:pPr>
+              <w:spacing w:before="40" w:after="40" w:line="288" w:lineRule="auto"/>
+              <w:jc w:val="right"/>
+              <w:bidi w:val="1"/>
+              <w:textDirection w:val="rl"/>
+            </w:pPr>
+            <w:r/>
+            <w:r>
+              <w:rPr>
+                <w:rFonts w:ascii="Amiri" w:hAnsi="Amiri" w:cs="Amiri" w:eastAsia="Amiri"/>
+                <w:b w:val="0"/>
+                <w:color w:val="232323"/>
+                <w:sz w:val="20"/>
+                <w:rtl w:val="1"/>
+              </w:rPr>
+              <w:t>‏السنة 4</w:t>
+            </w:r>
+          </w:p>
+        </w:tc>
+        <w:tc>
+          <w:tcPr>
+            <w:tcW w:type="dxa" w:w="2466"/>
+            <w:shd w:fill="F8F5F2" w:val="clear"/>
+            <w:tcBorders>
+              <w:top w:val="single" w:sz="8" w:color="B68A3A" w:space="0"/>
+              <w:left w:val="single" w:sz="8" w:color="B68A3A" w:space="0"/>
+              <w:bottom w:val="single" w:sz="8" w:color="B68A3A" w:space="0"/>
+              <w:right w:val="single" w:sz="8" w:color="B68A3A" w:space="0"/>
+            </w:tcBorders>
+          </w:tcPr>
+          <w:p>
+            <w:pPr>
+              <w:spacing w:before="40" w:after="40" w:line="288" w:lineRule="auto"/>
+              <w:jc w:val="right"/>
+              <w:bidi w:val="1"/>
+              <w:textDirection w:val="rl"/>
+            </w:pPr>
+            <w:r/>
+            <w:r>
+              <w:rPr>
+                <w:rFonts w:ascii="Amiri" w:hAnsi="Amiri" w:cs="Amiri" w:eastAsia="Amiri"/>
+                <w:b w:val="0"/>
+                <w:color w:val="232323"/>
+                <w:sz w:val="20"/>
+                <w:rtl w:val="1"/>
+              </w:rPr>
+              <w:t>‏إطلاق فرع أول بحجم منضبط ونفس معايير الهوية والجودة</w:t>
+            </w:r>
+          </w:p>
+        </w:tc>
+        <w:tc>
+          <w:tcPr>
+            <w:tcW w:type="dxa" w:w="2466"/>
+            <w:shd w:fill="F8F5F2" w:val="clear"/>
+            <w:tcBorders>
+              <w:top w:val="single" w:sz="8" w:color="B68A3A" w:space="0"/>
+              <w:left w:val="single" w:sz="8" w:color="B68A3A" w:space="0"/>
+              <w:bottom w:val="single" w:sz="8" w:color="B68A3A" w:space="0"/>
+              <w:right w:val="single" w:sz="8" w:color="B68A3A" w:space="0"/>
+            </w:tcBorders>
+          </w:tcPr>
+          <w:p>
+            <w:pPr>
+              <w:spacing w:before="40" w:after="40" w:line="288" w:lineRule="auto"/>
+              <w:jc w:val="right"/>
+              <w:bidi w:val="1"/>
+              <w:textDirection w:val="rl"/>
+            </w:pPr>
+            <w:r/>
+            <w:r>
+              <w:rPr>
+                <w:rFonts w:ascii="Amiri" w:hAnsi="Amiri" w:cs="Amiri" w:eastAsia="Amiri"/>
+                <w:b w:val="0"/>
+                <w:color w:val="232323"/>
+                <w:sz w:val="20"/>
+                <w:rtl w:val="1"/>
+              </w:rPr>
+              <w:t>‏تحقق حد أدنى من الإشغال والجودة خلال عام التشغيل الأول</w:t>
+            </w:r>
+          </w:p>
+        </w:tc>
+        <w:tc>
+          <w:tcPr>
+            <w:tcW w:type="dxa" w:w="2466"/>
+            <w:shd w:fill="F8F5F2" w:val="clear"/>
+            <w:tcBorders>
+              <w:top w:val="single" w:sz="8" w:color="B68A3A" w:space="0"/>
+              <w:left w:val="single" w:sz="8" w:color="B68A3A" w:space="0"/>
+              <w:bottom w:val="single" w:sz="8" w:color="B68A3A" w:space="0"/>
+              <w:right w:val="single" w:sz="8" w:color="B68A3A" w:space="0"/>
+            </w:tcBorders>
+          </w:tcPr>
+          <w:p>
+            <w:pPr>
+              <w:spacing w:before="40" w:after="40" w:line="288" w:lineRule="auto"/>
+              <w:jc w:val="right"/>
+              <w:bidi w:val="1"/>
+              <w:textDirection w:val="rl"/>
+            </w:pPr>
+            <w:r/>
+            <w:r>
+              <w:rPr>
+                <w:rFonts w:ascii="Amiri" w:hAnsi="Amiri" w:cs="Amiri" w:eastAsia="Amiri"/>
+                <w:b w:val="0"/>
+                <w:color w:val="232323"/>
+                <w:sz w:val="20"/>
+                <w:rtl w:val="1"/>
+              </w:rPr>
+              <w:t>‏تقرير إطلاق + دروس مستفادة</w:t>
+            </w:r>
+          </w:p>
+        </w:tc>
+      </w:tr>
+      <w:tr>
+        <w:tc>
+          <w:tcPr>
+            <w:tcW w:type="dxa" w:w="2466"/>
+            <w:shd w:fill="FFFFFF" w:val="clear"/>
+            <w:tcBorders>
+              <w:top w:val="single" w:sz="8" w:color="B68A3A" w:space="0"/>
+              <w:left w:val="single" w:sz="8" w:color="B68A3A" w:space="0"/>
+              <w:bottom w:val="single" w:sz="8" w:color="B68A3A" w:space="0"/>
+              <w:right w:val="single" w:sz="8" w:color="B68A3A" w:space="0"/>
+            </w:tcBorders>
+          </w:tcPr>
+          <w:p>
+            <w:pPr>
+              <w:spacing w:before="40" w:after="40" w:line="288" w:lineRule="auto"/>
+              <w:jc w:val="right"/>
+              <w:bidi w:val="1"/>
+              <w:textDirection w:val="rl"/>
+            </w:pPr>
+            <w:r/>
+            <w:r>
+              <w:rPr>
+                <w:rFonts w:ascii="Amiri" w:hAnsi="Amiri" w:cs="Amiri" w:eastAsia="Amiri"/>
+                <w:b w:val="0"/>
+                <w:color w:val="232323"/>
+                <w:sz w:val="20"/>
+                <w:rtl w:val="1"/>
+              </w:rPr>
+              <w:t>‏السنة 5</w:t>
+            </w:r>
+          </w:p>
+        </w:tc>
+        <w:tc>
+          <w:tcPr>
+            <w:tcW w:type="dxa" w:w="2466"/>
+            <w:shd w:fill="FFFFFF" w:val="clear"/>
+            <w:tcBorders>
+              <w:top w:val="single" w:sz="8" w:color="B68A3A" w:space="0"/>
+              <w:left w:val="single" w:sz="8" w:color="B68A3A" w:space="0"/>
+              <w:bottom w:val="single" w:sz="8" w:color="B68A3A" w:space="0"/>
+              <w:right w:val="single" w:sz="8" w:color="B68A3A" w:space="0"/>
+            </w:tcBorders>
+          </w:tcPr>
+          <w:p>
+            <w:pPr>
+              <w:spacing w:before="40" w:after="40" w:line="288" w:lineRule="auto"/>
+              <w:jc w:val="right"/>
+              <w:bidi w:val="1"/>
+              <w:textDirection w:val="rl"/>
+            </w:pPr>
+            <w:r/>
+            <w:r>
+              <w:rPr>
+                <w:rFonts w:ascii="Amiri" w:hAnsi="Amiri" w:cs="Amiri" w:eastAsia="Amiri"/>
+                <w:b w:val="0"/>
+                <w:color w:val="232323"/>
+                <w:sz w:val="20"/>
+                <w:rtl w:val="1"/>
+              </w:rPr>
+              <w:t>‏تثبيت الفرع الأول وتقييم جاهزية فرع ثانٍ فقط إذا نجحت المعايير</w:t>
+            </w:r>
+          </w:p>
+        </w:tc>
+        <w:tc>
+          <w:tcPr>
+            <w:tcW w:type="dxa" w:w="2466"/>
+            <w:shd w:fill="FFFFFF" w:val="clear"/>
+            <w:tcBorders>
+              <w:top w:val="single" w:sz="8" w:color="B68A3A" w:space="0"/>
+              <w:left w:val="single" w:sz="8" w:color="B68A3A" w:space="0"/>
+              <w:bottom w:val="single" w:sz="8" w:color="B68A3A" w:space="0"/>
+              <w:right w:val="single" w:sz="8" w:color="B68A3A" w:space="0"/>
+            </w:tcBorders>
+          </w:tcPr>
+          <w:p>
+            <w:pPr>
+              <w:spacing w:before="40" w:after="40" w:line="288" w:lineRule="auto"/>
+              <w:jc w:val="right"/>
+              <w:bidi w:val="1"/>
+              <w:textDirection w:val="rl"/>
+            </w:pPr>
+            <w:r/>
+            <w:r>
+              <w:rPr>
+                <w:rFonts w:ascii="Amiri" w:hAnsi="Amiri" w:cs="Amiri" w:eastAsia="Amiri"/>
+                <w:b w:val="0"/>
+                <w:color w:val="232323"/>
+                <w:sz w:val="20"/>
+                <w:rtl w:val="1"/>
+              </w:rPr>
+              <w:t>‏عدم تكرار أخطاء الفرع الأول؛ قدرة قيادية كافية</w:t>
+            </w:r>
+          </w:p>
+        </w:tc>
+        <w:tc>
+          <w:tcPr>
+            <w:tcW w:type="dxa" w:w="2466"/>
+            <w:shd w:fill="FFFFFF" w:val="clear"/>
+            <w:tcBorders>
+              <w:top w:val="single" w:sz="8" w:color="B68A3A" w:space="0"/>
+              <w:left w:val="single" w:sz="8" w:color="B68A3A" w:space="0"/>
+              <w:bottom w:val="single" w:sz="8" w:color="B68A3A" w:space="0"/>
+              <w:right w:val="single" w:sz="8" w:color="B68A3A" w:space="0"/>
+            </w:tcBorders>
+          </w:tcPr>
+          <w:p>
+            <w:pPr>
+              <w:spacing w:before="40" w:after="40" w:line="288" w:lineRule="auto"/>
+              <w:jc w:val="right"/>
+              <w:bidi w:val="1"/>
+              <w:textDirection w:val="rl"/>
+            </w:pPr>
+            <w:r/>
+            <w:r>
+              <w:rPr>
+                <w:rFonts w:ascii="Amiri" w:hAnsi="Amiri" w:cs="Amiri" w:eastAsia="Amiri"/>
+                <w:b w:val="0"/>
+                <w:color w:val="232323"/>
+                <w:sz w:val="20"/>
+                <w:rtl w:val="1"/>
+              </w:rPr>
+              <w:t>‏قرار توسع/تأجيل مبني على بيانات</w:t>
+            </w:r>
+          </w:p>
+        </w:tc>
+      </w:tr>
+    </w:tbl>
+    <w:p/>
+    <w:tbl>
+      <w:tblPr>
+        <w:tblW w:type="auto" w:w="0"/>
+        <w:tblLook w:firstColumn="1" w:firstRow="1" w:lastColumn="0" w:lastRow="0" w:noHBand="0" w:noVBand="1" w:val="04A0"/>
+        <w:bidiVisual w:val="1"/>
+      </w:tblPr>
+      <w:tblGrid>
+        <w:gridCol w:w="9866"/>
+      </w:tblGrid>
+      <w:tr>
+        <w:tc>
+          <w:tcPr>
+            <w:tcW w:type="dxa" w:w="9866"/>
+            <w:shd w:fill="F4F0EC" w:val="clear"/>
+            <w:tcBorders>
+              <w:top w:val="single" w:sz="12" w:color="B68A3A" w:space="0"/>
+              <w:left w:val="single" w:sz="12" w:color="B68A3A" w:space="0"/>
+              <w:bottom w:val="single" w:sz="12" w:color="B68A3A" w:space="0"/>
+              <w:right w:val="single" w:sz="12" w:color="B68A3A" w:space="0"/>
+            </w:tcBorders>
+          </w:tcPr>
+          <w:p>
+            <w:pPr>
+              <w:spacing w:before="80" w:after="80" w:line="300" w:lineRule="auto"/>
+              <w:jc w:val="right"/>
+              <w:bidi w:val="1"/>
+              <w:textDirection w:val="rl"/>
+            </w:pPr>
+            <w:r/>
+            <w:r>
+              <w:rPr>
+                <w:rFonts w:ascii="Amiri" w:hAnsi="Amiri" w:cs="Amiri" w:eastAsia="Amiri"/>
+                <w:b/>
+                <w:color w:val="8B1E2D"/>
+                <w:sz w:val="23"/>
+                <w:rtl w:val="1"/>
+              </w:rPr>
+              <w:t>‏بوابات قرار قبل فتح أي فرع</w:t>
+            </w:r>
+          </w:p>
+          <w:p>
+            <w:pPr>
+              <w:spacing w:before="20" w:after="40" w:line="300" w:lineRule="auto"/>
+              <w:jc w:val="right"/>
+              <w:bidi w:val="1"/>
+              <w:textDirection w:val="rl"/>
+            </w:pPr>
+            <w:r>
+              <w:rPr>
+                <w:rFonts w:ascii="Amiri" w:hAnsi="Amiri" w:cs="Amiri" w:eastAsia="Amiri"/>
+                <w:b w:val="0"/>
+                <w:color w:val="232323"/>
+                <w:sz w:val="21"/>
+                <w:rtl w:val="1"/>
+              </w:rPr>
+              <w:t>‏• جودة أكاديمية وتشغيلية مستقرة في الموقع الأم (لا تُدار الأزمات يومياً).</w:t>
+            </w:r>
+          </w:p>
+          <w:p>
+            <w:pPr>
+              <w:spacing w:before="20" w:after="40" w:line="300" w:lineRule="auto"/>
+              <w:jc w:val="right"/>
+              <w:bidi w:val="1"/>
+              <w:textDirection w:val="rl"/>
+            </w:pPr>
+            <w:r>
+              <w:rPr>
+                <w:rFonts w:ascii="Amiri" w:hAnsi="Amiri" w:cs="Amiri" w:eastAsia="Amiri"/>
+                <w:b w:val="0"/>
+                <w:color w:val="232323"/>
+                <w:sz w:val="21"/>
+                <w:rtl w:val="1"/>
+              </w:rPr>
+              <w:t>‏• هوية بصرية وتشغيلية واضحة للإنترناشونال قابلة للنقل دون خلط مع المسار الوطني.</w:t>
+            </w:r>
+          </w:p>
+          <w:p>
+            <w:pPr>
+              <w:spacing w:before="20" w:after="40" w:line="300" w:lineRule="auto"/>
+              <w:jc w:val="right"/>
+              <w:bidi w:val="1"/>
+              <w:textDirection w:val="rl"/>
+            </w:pPr>
+            <w:r>
+              <w:rPr>
+                <w:rFonts w:ascii="Amiri" w:hAnsi="Amiri" w:cs="Amiri" w:eastAsia="Amiri"/>
+                <w:b w:val="0"/>
+                <w:color w:val="232323"/>
+                <w:sz w:val="21"/>
+                <w:rtl w:val="1"/>
+              </w:rPr>
+              <w:t>‏• دراسة جدوى مالية بسيناريو تحفظي (إيراد/تكلفة/فترة استرداد معقولة).</w:t>
+            </w:r>
+          </w:p>
+          <w:p>
+            <w:pPr>
+              <w:spacing w:before="20" w:after="40" w:line="300" w:lineRule="auto"/>
+              <w:jc w:val="right"/>
+              <w:bidi w:val="1"/>
+              <w:textDirection w:val="rl"/>
+            </w:pPr>
+            <w:r>
+              <w:rPr>
+                <w:rFonts w:ascii="Amiri" w:hAnsi="Amiri" w:cs="Amiri" w:eastAsia="Amiri"/>
+                <w:b w:val="0"/>
+                <w:color w:val="232323"/>
+                <w:sz w:val="21"/>
+                <w:rtl w:val="1"/>
+              </w:rPr>
+              <w:t>‏• فريق قيادة وطبقة وسطى جاهزة للنسخ (لا يعتمد الفرع على شخص واحد فقط).</w:t>
+            </w:r>
+          </w:p>
+          <w:p>
+            <w:pPr>
+              <w:spacing w:before="20" w:after="40" w:line="300" w:lineRule="auto"/>
+              <w:jc w:val="right"/>
+              <w:bidi w:val="1"/>
+              <w:textDirection w:val="rl"/>
+            </w:pPr>
+            <w:r>
+              <w:rPr>
+                <w:rFonts w:ascii="Amiri" w:hAnsi="Amiri" w:cs="Amiri" w:eastAsia="Amiri"/>
+                <w:b w:val="0"/>
+                <w:color w:val="232323"/>
+                <w:sz w:val="21"/>
+                <w:rtl w:val="1"/>
+              </w:rPr>
+              <w:t>‏• موافقة المجلس على الموقع، الموازنة، والجدول، ومؤشرات السنة الأولى للفرع.</w:t>
+            </w:r>
+          </w:p>
+        </w:tc>
+      </w:tr>
+    </w:tbl>
+    <w:p/>
+    <w:p>
+      <w:pPr>
+        <w:spacing w:before="200" w:after="80" w:line="324" w:lineRule="auto"/>
+        <w:jc w:val="right"/>
+        <w:bidi w:val="1"/>
+        <w:textDirection w:val="rl"/>
+      </w:pPr>
+      <w:r>
+        <w:rPr>
+          <w:rFonts w:ascii="Amiri" w:hAnsi="Amiri" w:cs="Amiri" w:eastAsia="Amiri"/>
+          <w:b/>
+          <w:color w:val="B68A3A"/>
+          <w:sz w:val="25"/>
+          <w:rtl w:val="1"/>
+        </w:rPr>
+        <w:t>‏ما الذي يُنسخ إلى الفرع الجديد؟</w:t>
+      </w:r>
+    </w:p>
+    <w:p>
+      <w:pPr>
+        <w:spacing w:before="0" w:after="60" w:line="312" w:lineRule="auto"/>
+        <w:jc w:val="right"/>
+        <w:bidi w:val="1"/>
+        <w:textDirection w:val="rl"/>
+      </w:pPr>
+      <w:r>
+        <w:rPr>
+          <w:rFonts w:ascii="Amiri" w:hAnsi="Amiri" w:cs="Amiri" w:eastAsia="Amiri"/>
+          <w:b w:val="0"/>
+          <w:color w:val="232323"/>
+          <w:sz w:val="23"/>
+          <w:rtl w:val="1"/>
+        </w:rPr>
+        <w:t>‏• إطار الجودة والملاحظة الصفية وتطوير المعلمين.</w:t>
+      </w:r>
+    </w:p>
+    <w:p>
+      <w:pPr>
+        <w:spacing w:before="0" w:after="60" w:line="312" w:lineRule="auto"/>
+        <w:jc w:val="right"/>
+        <w:bidi w:val="1"/>
+        <w:textDirection w:val="rl"/>
+      </w:pPr>
+      <w:r>
+        <w:rPr>
+          <w:rFonts w:ascii="Amiri" w:hAnsi="Amiri" w:cs="Amiri" w:eastAsia="Amiri"/>
+          <w:b w:val="0"/>
+          <w:color w:val="232323"/>
+          <w:sz w:val="23"/>
+          <w:rtl w:val="1"/>
+        </w:rPr>
+        <w:t>‏• رحلة القبول والتواصل الأسري وقوالب الهوية الدولية.</w:t>
+      </w:r>
+    </w:p>
+    <w:p>
+      <w:pPr>
+        <w:spacing w:before="0" w:after="60" w:line="312" w:lineRule="auto"/>
+        <w:jc w:val="right"/>
+        <w:bidi w:val="1"/>
+        <w:textDirection w:val="rl"/>
+      </w:pPr>
+      <w:r>
+        <w:rPr>
+          <w:rFonts w:ascii="Amiri" w:hAnsi="Amiri" w:cs="Amiri" w:eastAsia="Amiri"/>
+          <w:b w:val="0"/>
+          <w:color w:val="232323"/>
+          <w:sz w:val="23"/>
+          <w:rtl w:val="1"/>
+        </w:rPr>
+        <w:t>‏• لوحة مؤشرات أساسية (تحويل، استبقاء، جودة، رضا تواصل).</w:t>
+      </w:r>
+    </w:p>
+    <w:p>
+      <w:pPr>
+        <w:spacing w:before="0" w:after="60" w:line="312" w:lineRule="auto"/>
+        <w:jc w:val="right"/>
+        <w:bidi w:val="1"/>
+        <w:textDirection w:val="rl"/>
+      </w:pPr>
+      <w:r>
+        <w:rPr>
+          <w:rFonts w:ascii="Amiri" w:hAnsi="Amiri" w:cs="Amiri" w:eastAsia="Amiri"/>
+          <w:b w:val="0"/>
+          <w:color w:val="232323"/>
+          <w:sz w:val="23"/>
+          <w:rtl w:val="1"/>
+        </w:rPr>
+        <w:t>‏• حوكمة التقارير الأسبوعية/الربعية وربط الفرع بمدير البرامج الدولية.</w:t>
+      </w:r>
+    </w:p>
+    <w:p>
+      <w:pPr>
+        <w:spacing w:before="0" w:after="60" w:line="312" w:lineRule="auto"/>
+        <w:jc w:val="right"/>
+        <w:bidi w:val="1"/>
+        <w:textDirection w:val="rl"/>
+      </w:pPr>
+      <w:r>
+        <w:rPr>
+          <w:rFonts w:ascii="Amiri" w:hAnsi="Amiri" w:cs="Amiri" w:eastAsia="Amiri"/>
+          <w:b w:val="0"/>
+          <w:color w:val="232323"/>
+          <w:sz w:val="23"/>
+          <w:rtl w:val="1"/>
+        </w:rPr>
+        <w:t>‏• حزم الدعم الأكاديمي والإرشاد والمسارات الرقمية الحدّ الأدنى.</w:t>
+      </w:r>
+    </w:p>
     <w:p>
       <w:pPr>
         <w:spacing w:before="280" w:after="80" w:line="324" w:lineRule="auto"/>
@@ -14072,6 +15130,101 @@
                 <w:rtl w:val="1"/>
               </w:rPr>
               <w:t>‏قدرة أفضل على تخطيط الإيراد</w:t>
+            </w:r>
+          </w:p>
+        </w:tc>
+      </w:tr>
+      <w:tr>
+        <w:tc>
+          <w:tcPr>
+            <w:tcW w:type="dxa" w:w="3289"/>
+            <w:shd w:fill="FFFFFF" w:val="clear"/>
+            <w:tcBorders>
+              <w:top w:val="single" w:sz="8" w:color="B68A3A" w:space="0"/>
+              <w:left w:val="single" w:sz="8" w:color="B68A3A" w:space="0"/>
+              <w:bottom w:val="single" w:sz="8" w:color="B68A3A" w:space="0"/>
+              <w:right w:val="single" w:sz="8" w:color="B68A3A" w:space="0"/>
+            </w:tcBorders>
+          </w:tcPr>
+          <w:p>
+            <w:pPr>
+              <w:spacing w:before="40" w:after="40" w:line="288" w:lineRule="auto"/>
+              <w:jc w:val="right"/>
+              <w:bidi w:val="1"/>
+              <w:textDirection w:val="rl"/>
+            </w:pPr>
+            <w:r/>
+            <w:r>
+              <w:rPr>
+                <w:rFonts w:ascii="Amiri" w:hAnsi="Amiri" w:cs="Amiri" w:eastAsia="Amiri"/>
+                <w:b w:val="0"/>
+                <w:color w:val="232323"/>
+                <w:sz w:val="20"/>
+                <w:rtl w:val="1"/>
+              </w:rPr>
+              <w:t>‏جاهزية التوسع بالفروع</w:t>
+            </w:r>
+          </w:p>
+        </w:tc>
+        <w:tc>
+          <w:tcPr>
+            <w:tcW w:type="dxa" w:w="3289"/>
+            <w:shd w:fill="FFFFFF" w:val="clear"/>
+            <w:tcBorders>
+              <w:top w:val="single" w:sz="8" w:color="B68A3A" w:space="0"/>
+              <w:left w:val="single" w:sz="8" w:color="B68A3A" w:space="0"/>
+              <w:bottom w:val="single" w:sz="8" w:color="B68A3A" w:space="0"/>
+              <w:right w:val="single" w:sz="8" w:color="B68A3A" w:space="0"/>
+            </w:tcBorders>
+          </w:tcPr>
+          <w:p>
+            <w:pPr>
+              <w:spacing w:before="40" w:after="40" w:line="288" w:lineRule="auto"/>
+              <w:jc w:val="right"/>
+              <w:bidi w:val="1"/>
+              <w:textDirection w:val="rl"/>
+            </w:pPr>
+            <w:r/>
+            <w:r>
+              <w:rPr>
+                <w:rFonts w:ascii="Amiri" w:hAnsi="Amiri" w:cs="Amiri" w:eastAsia="Amiri"/>
+                <w:b w:val="0"/>
+                <w:color w:val="232323"/>
+                <w:sz w:val="20"/>
+                <w:rtl w:val="1"/>
+              </w:rPr>
+              <w:t>‏توثيق نموذج تشغيل قابل للنسخ</w:t>
+            </w:r>
+          </w:p>
+        </w:tc>
+        <w:tc>
+          <w:tcPr>
+            <w:tcW w:type="dxa" w:w="3289"/>
+            <w:shd w:fill="FFFFFF" w:val="clear"/>
+            <w:tcBorders>
+              <w:top w:val="single" w:sz="8" w:color="B68A3A" w:space="0"/>
+              <w:left w:val="single" w:sz="8" w:color="B68A3A" w:space="0"/>
+              <w:bottom w:val="single" w:sz="8" w:color="B68A3A" w:space="0"/>
+              <w:right w:val="single" w:sz="8" w:color="B68A3A" w:space="0"/>
+            </w:tcBorders>
+          </w:tcPr>
+          <w:p>
+            <w:pPr>
+              <w:spacing w:before="40" w:after="40" w:line="288" w:lineRule="auto"/>
+              <w:jc w:val="right"/>
+              <w:bidi w:val="1"/>
+              <w:textDirection w:val="rl"/>
+            </w:pPr>
+            <w:r/>
+            <w:r>
+              <w:rPr>
+                <w:rFonts w:ascii="Amiri" w:hAnsi="Amiri" w:cs="Amiri" w:eastAsia="Amiri"/>
+                <w:b w:val="0"/>
+                <w:color w:val="232323"/>
+                <w:sz w:val="20"/>
+                <w:rtl w:val="1"/>
+              </w:rPr>
+              <w:t>‏قرار مدروس لفرع أول عند تحقق البوابات</w:t>
             </w:r>
           </w:p>
         </w:tc>
@@ -15126,6 +16279,132 @@
           </w:p>
         </w:tc>
       </w:tr>
+      <w:tr>
+        <w:tc>
+          <w:tcPr>
+            <w:tcW w:type="dxa" w:w="2466"/>
+            <w:shd w:fill="FFFFFF" w:val="clear"/>
+            <w:tcBorders>
+              <w:top w:val="single" w:sz="8" w:color="B68A3A" w:space="0"/>
+              <w:left w:val="single" w:sz="8" w:color="B68A3A" w:space="0"/>
+              <w:bottom w:val="single" w:sz="8" w:color="B68A3A" w:space="0"/>
+              <w:right w:val="single" w:sz="8" w:color="B68A3A" w:space="0"/>
+            </w:tcBorders>
+          </w:tcPr>
+          <w:p>
+            <w:pPr>
+              <w:spacing w:before="40" w:after="40" w:line="288" w:lineRule="auto"/>
+              <w:jc w:val="right"/>
+              <w:bidi w:val="1"/>
+              <w:textDirection w:val="rl"/>
+            </w:pPr>
+            <w:r/>
+            <w:r>
+              <w:rPr>
+                <w:rFonts w:ascii="Amiri" w:hAnsi="Amiri" w:cs="Amiri" w:eastAsia="Amiri"/>
+                <w:b w:val="0"/>
+                <w:color w:val="232323"/>
+                <w:sz w:val="20"/>
+                <w:rtl w:val="1"/>
+              </w:rPr>
+              <w:t>‏فتح فرع قبل جاهزية النموذج الأم</w:t>
+            </w:r>
+          </w:p>
+        </w:tc>
+        <w:tc>
+          <w:tcPr>
+            <w:tcW w:type="dxa" w:w="2466"/>
+            <w:shd w:fill="FFFFFF" w:val="clear"/>
+            <w:tcBorders>
+              <w:top w:val="single" w:sz="8" w:color="B68A3A" w:space="0"/>
+              <w:left w:val="single" w:sz="8" w:color="B68A3A" w:space="0"/>
+              <w:bottom w:val="single" w:sz="8" w:color="B68A3A" w:space="0"/>
+              <w:right w:val="single" w:sz="8" w:color="B68A3A" w:space="0"/>
+            </w:tcBorders>
+          </w:tcPr>
+          <w:p>
+            <w:pPr>
+              <w:spacing w:before="40" w:after="40" w:line="288" w:lineRule="auto"/>
+              <w:jc w:val="right"/>
+              <w:bidi w:val="1"/>
+              <w:textDirection w:val="rl"/>
+            </w:pPr>
+            <w:r/>
+            <w:r>
+              <w:rPr>
+                <w:rFonts w:ascii="Amiri" w:hAnsi="Amiri" w:cs="Amiri" w:eastAsia="Amiri"/>
+                <w:b w:val="0"/>
+                <w:color w:val="232323"/>
+                <w:sz w:val="20"/>
+                <w:rtl w:val="1"/>
+              </w:rPr>
+              <w:t>‏تكرار ضعف الجودة وتشتيت القيادة</w:t>
+            </w:r>
+          </w:p>
+        </w:tc>
+        <w:tc>
+          <w:tcPr>
+            <w:tcW w:type="dxa" w:w="2466"/>
+            <w:shd w:fill="FFFFFF" w:val="clear"/>
+            <w:tcBorders>
+              <w:top w:val="single" w:sz="8" w:color="B68A3A" w:space="0"/>
+              <w:left w:val="single" w:sz="8" w:color="B68A3A" w:space="0"/>
+              <w:bottom w:val="single" w:sz="8" w:color="B68A3A" w:space="0"/>
+              <w:right w:val="single" w:sz="8" w:color="B68A3A" w:space="0"/>
+            </w:tcBorders>
+          </w:tcPr>
+          <w:p>
+            <w:pPr>
+              <w:spacing w:before="40" w:after="40" w:line="288" w:lineRule="auto"/>
+              <w:jc w:val="right"/>
+              <w:bidi w:val="1"/>
+              <w:textDirection w:val="rl"/>
+            </w:pPr>
+            <w:r/>
+            <w:r>
+              <w:rPr>
+                <w:rFonts w:ascii="Amiri" w:hAnsi="Amiri" w:cs="Amiri" w:eastAsia="Amiri"/>
+                <w:b w:val="0"/>
+                <w:color w:val="232323"/>
+                <w:sz w:val="20"/>
+                <w:rtl w:val="1"/>
+              </w:rPr>
+              <w:t>‏متوسط</w:t>
+            </w:r>
+          </w:p>
+        </w:tc>
+        <w:tc>
+          <w:tcPr>
+            <w:tcW w:type="dxa" w:w="2466"/>
+            <w:shd w:fill="FFFFFF" w:val="clear"/>
+            <w:tcBorders>
+              <w:top w:val="single" w:sz="8" w:color="B68A3A" w:space="0"/>
+              <w:left w:val="single" w:sz="8" w:color="B68A3A" w:space="0"/>
+              <w:bottom w:val="single" w:sz="8" w:color="B68A3A" w:space="0"/>
+              <w:right w:val="single" w:sz="8" w:color="B68A3A" w:space="0"/>
+            </w:tcBorders>
+          </w:tcPr>
+          <w:p>
+            <w:pPr>
+              <w:spacing w:before="40" w:after="40" w:line="288" w:lineRule="auto"/>
+              <w:jc w:val="right"/>
+              <w:bidi w:val="1"/>
+              <w:textDirection w:val="rl"/>
+            </w:pPr>
+            <w:r/>
+            <w:r>
+              <w:rPr>
+                <w:rFonts w:ascii="Amiri" w:hAnsi="Amiri" w:cs="Amiri" w:eastAsia="Amiri"/>
+                <w:b w:val="0"/>
+                <w:color w:val="232323"/>
+                <w:sz w:val="20"/>
+                <w:rtl w:val="1"/>
+              </w:rPr>
+              <w:t>‏بوابات قرار إلزامية + موافقة مجلس قبل أي إطلاق</w:t>
+            </w:r>
+          </w:p>
+        </w:tc>
+      </w:tr>
     </w:tbl>
     <w:p/>
     <w:p>
@@ -15164,7 +16443,7 @@
         <w:drawing>
           <wp:inline xmlns:a="http://schemas.openxmlformats.org/drawingml/2006/main" xmlns:pic="http://schemas.openxmlformats.org/drawingml/2006/picture">
             <wp:extent cx="5806440" cy="2472049"/>
-            <wp:docPr id="8" name="Picture 8"/>
+            <wp:docPr id="9" name="Picture 9"/>
             <wp:cNvGraphicFramePr>
               <a:graphicFrameLocks noChangeAspect="1"/>
             </wp:cNvGraphicFramePr>
@@ -15176,7 +16455,7 @@
                     <pic:cNvPicPr/>
                   </pic:nvPicPr>
                   <pic:blipFill>
-                    <a:blip r:embed="rId18"/>
+                    <a:blip r:embed="rId19"/>
                     <a:stretch>
                       <a:fillRect/>
                     </a:stretch>
@@ -18188,7 +19467,7 @@
           <w:sz w:val="23"/>
           <w:rtl w:val="1"/>
         </w:rPr>
-        <w:t>‏• لأنه يُخضِع التوسع في السنوات 2–5 لنضج الجودة والاستدامة، لا لضغط النمو فقط.</w:t>
+        <w:t>‏• لأنه يُخضِع التوسع وفتح الفروع في السنوات 2–5 لنضج الجودة والاستدامة وبوابات قرار المجلس، لا لضغط النمو فقط.</w:t>
       </w:r>
     </w:p>
     <w:tbl>
@@ -18301,6 +19580,24 @@
                 <w:rtl w:val="1"/>
               </w:rPr>
               <w:t>‏• اعتماد مسار فصل الهوية البصرية للإنترناشونال عن المنهاج الوطني (مرحلي/تقريبي).</w:t>
+            </w:r>
+          </w:p>
+          <w:p>
+            <w:pPr>
+              <w:spacing w:before="20" w:after="40" w:line="300" w:lineRule="auto"/>
+              <w:jc w:val="right"/>
+              <w:bidi w:val="1"/>
+              <w:textDirection w:val="rl"/>
+            </w:pPr>
+            <w:r>
+              <w:rPr>
+                <w:rFonts w:ascii="Amiri" w:hAnsi="Amiri" w:cs="Amiri" w:eastAsia="Amiri"/>
+                <w:b w:val="0"/>
+                <w:color w:val="232323"/>
+                <w:sz w:val="21"/>
+                <w:rtl w:val="1"/>
+              </w:rPr>
+              <w:t>‏• اعتماد مبدأ التوسع المستقبلي بفروع جديدة بعد تحقق بوابات الجاهزية ودراسة الجدوى.</w:t>
             </w:r>
           </w:p>
           <w:p>

</xml_diff>